<commit_message>
Condensed proposal solution section
1. Focused on Key Screens
2. Removed redundant segments
3. Reread document as a whole
4. Awaiting team approval
</commit_message>
<xml_diff>
--- a/Documentation/Project proposal - Updated, check and review.docx
+++ b/Documentation/Project proposal - Updated, check and review.docx
@@ -1,6 +1,6 @@
 
 <file path=word/document.xml><?xml version="1.0" encoding="utf-8"?>
-<w:document xmlns:wpc="http://schemas.microsoft.com/office/word/2010/wordprocessingCanvas" xmlns:cx="http://schemas.microsoft.com/office/drawing/2014/chartex" xmlns:cx1="http://schemas.microsoft.com/office/drawing/2015/9/8/chartex" xmlns:cx2="http://schemas.microsoft.com/office/drawing/2015/10/21/chartex" xmlns:cx3="http://schemas.microsoft.com/office/drawing/2016/5/9/chartex" xmlns:cx4="http://schemas.microsoft.com/office/drawing/2016/5/10/chartex" xmlns:cx5="http://schemas.microsoft.com/office/drawing/2016/5/11/chartex" xmlns:cx6="http://schemas.microsoft.com/office/drawing/2016/5/12/chartex" xmlns:cx7="http://schemas.microsoft.com/office/drawing/2016/5/13/chartex" xmlns:cx8="http://schemas.microsoft.com/office/drawing/2016/5/14/chartex" xmlns:mc="http://schemas.openxmlformats.org/markup-compatibility/2006" xmlns:aink="http://schemas.microsoft.com/office/drawing/2016/ink" xmlns:am3d="http://schemas.microsoft.com/office/drawing/2017/model3d" xmlns:o="urn:schemas-microsoft-com:office:office" xmlns:oel="http://schemas.microsoft.com/office/2019/extlst" xmlns:r="http://schemas.openxmlformats.org/officeDocument/2006/relationships" xmlns:m="http://schemas.openxmlformats.org/officeDocument/2006/math" xmlns:v="urn:schemas-microsoft-com:vml" xmlns:wp14="http://schemas.microsoft.com/office/word/2010/wordprocessingDrawing" xmlns:wp="http://schemas.openxmlformats.org/drawingml/2006/wordprocessingDrawing" xmlns:w10="urn:schemas-microsoft-com:office:word" xmlns:w="http://schemas.openxmlformats.org/wordprocessingml/2006/main" xmlns:w14="http://schemas.microsoft.com/office/word/2010/wordml" xmlns:w15="http://schemas.microsoft.com/office/word/2012/wordml" xmlns:w16cex="http://schemas.microsoft.com/office/word/2018/wordml/cex" xmlns:w16cid="http://schemas.microsoft.com/office/word/2016/wordml/cid" xmlns:w16="http://schemas.microsoft.com/office/word/2018/wordml" xmlns:w16du="http://schemas.microsoft.com/office/word/2023/wordml/word16du" xmlns:w16sdtdh="http://schemas.microsoft.com/office/word/2020/wordml/sdtdatahash" xmlns:w16sdtfl="http://schemas.microsoft.com/office/word/2024/wordml/sdtformatlock" xmlns:w16se="http://schemas.microsoft.com/office/word/2015/wordml/symex" xmlns:wpg="http://schemas.microsoft.com/office/word/2010/wordprocessingGroup" xmlns:wpi="http://schemas.microsoft.com/office/word/2010/wordprocessingInk" xmlns:wne="http://schemas.microsoft.com/office/word/2006/wordml" xmlns:wps="http://schemas.microsoft.com/office/word/2010/wordprocessingShape" mc:Ignorable="w14 w15 w16se w16cid w16 w16cex w16sdtdh w16sdtfl w16du wp14">
+<w:document xmlns:wpc="http://schemas.microsoft.com/office/word/2010/wordprocessingCanvas" xmlns:cx="http://schemas.microsoft.com/office/drawing/2014/chartex" xmlns:cx1="http://schemas.microsoft.com/office/drawing/2015/9/8/chartex" xmlns:cx2="http://schemas.microsoft.com/office/drawing/2015/10/21/chartex" xmlns:cx3="http://schemas.microsoft.com/office/drawing/2016/5/9/chartex" xmlns:cx4="http://schemas.microsoft.com/office/drawing/2016/5/10/chartex" xmlns:cx5="http://schemas.microsoft.com/office/drawing/2016/5/11/chartex" xmlns:cx6="http://schemas.microsoft.com/office/drawing/2016/5/12/chartex" xmlns:cx7="http://schemas.microsoft.com/office/drawing/2016/5/13/chartex" xmlns:cx8="http://schemas.microsoft.com/office/drawing/2016/5/14/chartex" xmlns:mc="http://schemas.openxmlformats.org/markup-compatibility/2006" xmlns:aink="http://schemas.microsoft.com/office/drawing/2016/ink" xmlns:am3d="http://schemas.microsoft.com/office/drawing/2017/model3d" xmlns:o="urn:schemas-microsoft-com:office:office" xmlns:r="http://schemas.openxmlformats.org/officeDocument/2006/relationships" xmlns:m="http://schemas.openxmlformats.org/officeDocument/2006/math" xmlns:v="urn:schemas-microsoft-com:vml" xmlns:wp14="http://schemas.microsoft.com/office/word/2010/wordprocessingDrawing" xmlns:wp="http://schemas.openxmlformats.org/drawingml/2006/wordprocessingDrawing" xmlns:w10="urn:schemas-microsoft-com:office:word" xmlns:w="http://schemas.openxmlformats.org/wordprocessingml/2006/main" xmlns:w14="http://schemas.microsoft.com/office/word/2010/wordml" xmlns:w15="http://schemas.microsoft.com/office/word/2012/wordml" xmlns:w16cid="http://schemas.microsoft.com/office/word/2016/wordml/cid" xmlns:w16se="http://schemas.microsoft.com/office/word/2015/wordml/symex" xmlns:wpg="http://schemas.microsoft.com/office/word/2010/wordprocessingGroup" xmlns:wpi="http://schemas.microsoft.com/office/word/2010/wordprocessingInk" xmlns:wne="http://schemas.microsoft.com/office/word/2006/wordml" xmlns:wps="http://schemas.microsoft.com/office/word/2010/wordprocessingShape" mc:Ignorable="w14 w15 w16se w16cid wp14">
   <w:body>
     <w:p>
       <w:pPr>
@@ -49,15 +49,13 @@
         </w:rPr>
         <w:t>Don’t worry about how it looks now, I will change it when we’re set.</w:t>
       </w:r>
-    </w:p>
-    <w:p>
-      <w:pPr>
-        <w:jc w:val="center"/>
+      <w:r>
         <w:rPr>
           <w:sz w:val="44"/>
           <w:szCs w:val="44"/>
         </w:rPr>
-      </w:pPr>
+        <w:t xml:space="preserve"> </w:t>
+      </w:r>
     </w:p>
     <w:p>
       <w:pPr>
@@ -67,15 +65,13 @@
           <w:szCs w:val="44"/>
         </w:rPr>
       </w:pPr>
-    </w:p>
-    <w:p>
-      <w:pPr>
-        <w:jc w:val="center"/>
+      <w:r>
         <w:rPr>
           <w:sz w:val="44"/>
           <w:szCs w:val="44"/>
         </w:rPr>
-      </w:pPr>
+        <w:t>Updated Version</w:t>
+      </w:r>
     </w:p>
     <w:p>
       <w:pPr>
@@ -103,11 +99,38 @@
           <w:szCs w:val="44"/>
         </w:rPr>
       </w:pPr>
-      <w:r>
+    </w:p>
+    <w:p>
+      <w:pPr>
+        <w:jc w:val="center"/>
         <w:rPr>
           <w:sz w:val="44"/>
           <w:szCs w:val="44"/>
         </w:rPr>
+      </w:pPr>
+    </w:p>
+    <w:p>
+      <w:pPr>
+        <w:jc w:val="center"/>
+        <w:rPr>
+          <w:sz w:val="44"/>
+          <w:szCs w:val="44"/>
+        </w:rPr>
+      </w:pPr>
+    </w:p>
+    <w:p>
+      <w:pPr>
+        <w:jc w:val="center"/>
+        <w:rPr>
+          <w:sz w:val="44"/>
+          <w:szCs w:val="44"/>
+        </w:rPr>
+      </w:pPr>
+      <w:r>
+        <w:rPr>
+          <w:sz w:val="44"/>
+          <w:szCs w:val="44"/>
+        </w:rPr>
         <w:t>Project proposal</w:t>
       </w:r>
     </w:p>
@@ -198,27 +221,36 @@
           <w:szCs w:val="44"/>
         </w:rPr>
       </w:pPr>
+      <w:proofErr w:type="spellStart"/>
       <w:r>
         <w:rPr>
           <w:sz w:val="44"/>
           <w:szCs w:val="44"/>
         </w:rPr>
-        <w:t xml:space="preserve">Juanette </w:t>
-      </w:r>
-      <w:proofErr w:type="spellStart"/>
+        <w:t>Juanette</w:t>
+      </w:r>
+      <w:proofErr w:type="spellEnd"/>
       <w:r>
         <w:rPr>
           <w:sz w:val="44"/>
           <w:szCs w:val="44"/>
         </w:rPr>
-        <w:t>Rozaan</w:t>
-      </w:r>
-      <w:proofErr w:type="spellEnd"/>
+        <w:t xml:space="preserve"> </w:t>
+      </w:r>
+      <w:proofErr w:type="spellStart"/>
       <w:r>
         <w:rPr>
           <w:sz w:val="44"/>
           <w:szCs w:val="44"/>
         </w:rPr>
+        <w:t>Rozaan</w:t>
+      </w:r>
+      <w:proofErr w:type="spellEnd"/>
+      <w:r>
+        <w:rPr>
+          <w:sz w:val="44"/>
+          <w:szCs w:val="44"/>
+        </w:rPr>
         <w:t xml:space="preserve"> Viljoen </w:t>
       </w:r>
     </w:p>
@@ -251,17 +283,40 @@
           <w:sz w:val="44"/>
           <w:szCs w:val="44"/>
         </w:rPr>
-        <w:t xml:space="preserve">Tinotenda </w:t>
-      </w:r>
-      <w:proofErr w:type="spellStart"/>
-      <w:r>
+        <w:t>Tinotenda Mhedziso</w:t>
+      </w:r>
+    </w:p>
+    <w:p>
+      <w:pPr>
+        <w:jc w:val="center"/>
+        <w:rPr>
+          <w:sz w:val="32"/>
+          <w:szCs w:val="32"/>
+        </w:rPr>
+      </w:pPr>
+      <w:r>
+        <w:rPr>
+          <w:sz w:val="32"/>
+          <w:szCs w:val="32"/>
+        </w:rPr>
+        <w:t>227284240</w:t>
+      </w:r>
+    </w:p>
+    <w:p>
+      <w:pPr>
+        <w:jc w:val="center"/>
         <w:rPr>
           <w:sz w:val="44"/>
           <w:szCs w:val="44"/>
         </w:rPr>
-        <w:t>Mhedziso</w:t>
-      </w:r>
-      <w:proofErr w:type="spellEnd"/>
+      </w:pPr>
+      <w:r>
+        <w:rPr>
+          <w:sz w:val="44"/>
+          <w:szCs w:val="44"/>
+        </w:rPr>
+        <w:t xml:space="preserve">Line Redpath </w:t>
+      </w:r>
     </w:p>
     <w:p>
       <w:pPr>
@@ -276,772 +331,946 @@
           <w:sz w:val="32"/>
           <w:szCs w:val="32"/>
         </w:rPr>
-        <w:t>227284240</w:t>
-      </w:r>
-    </w:p>
-    <w:p>
-      <w:pPr>
-        <w:jc w:val="center"/>
-        <w:rPr>
-          <w:sz w:val="44"/>
-          <w:szCs w:val="44"/>
-        </w:rPr>
-      </w:pPr>
-      <w:r>
-        <w:rPr>
-          <w:sz w:val="44"/>
-          <w:szCs w:val="44"/>
-        </w:rPr>
-        <w:t xml:space="preserve">Line Redpath </w:t>
-      </w:r>
-    </w:p>
-    <w:p>
-      <w:pPr>
-        <w:jc w:val="center"/>
-        <w:rPr>
+        <w:t>224350536</w:t>
+      </w:r>
+    </w:p>
+    <w:p/>
+    <w:p/>
+    <w:p>
+      <w:pPr>
+        <w:pStyle w:val="Heading1"/>
+        <w:rPr>
+          <w:b/>
+          <w:color w:val="000000" w:themeColor="text1"/>
           <w:sz w:val="32"/>
           <w:szCs w:val="32"/>
         </w:rPr>
       </w:pPr>
-      <w:r>
-        <w:rPr>
+      <w:bookmarkStart w:id="0" w:name="_Toc1829509302"/>
+      <w:r>
+        <w:rPr>
+          <w:b/>
+          <w:color w:val="000000" w:themeColor="text1"/>
           <w:sz w:val="32"/>
           <w:szCs w:val="32"/>
         </w:rPr>
-        <w:t>224350536</w:t>
-      </w:r>
-    </w:p>
-    <w:p/>
-    <w:p/>
-    <w:p/>
-    <w:p>
-      <w:pPr>
-        <w:pStyle w:val="Heading1"/>
-        <w:rPr>
+        <w:t>Pro</w:t>
+      </w:r>
+      <w:r>
+        <w:rPr>
+          <w:b/>
+          <w:color w:val="000000" w:themeColor="text1"/>
           <w:sz w:val="32"/>
           <w:szCs w:val="32"/>
         </w:rPr>
-      </w:pPr>
-      <w:bookmarkStart w:id="0" w:name="_Toc1829509302"/>
-      <w:r>
-        <w:t>Pro</w:t>
-      </w:r>
-      <w:r>
         <w:t>blem domain</w:t>
       </w:r>
       <w:bookmarkEnd w:id="0"/>
     </w:p>
     <w:p>
       <w:pPr>
-        <w:rPr>
+        <w:spacing w:before="100" w:beforeAutospacing="1" w:after="100" w:afterAutospacing="1"/>
+        <w:rPr>
+          <w:rFonts w:eastAsia="Times New Roman" w:cstheme="minorHAnsi"/>
+          <w:lang w:eastAsia="en-ZA"/>
+        </w:rPr>
+      </w:pPr>
+      <w:r>
+        <w:rPr>
+          <w:rFonts w:eastAsia="Times New Roman" w:cstheme="minorHAnsi"/>
+          <w:lang w:eastAsia="en-ZA"/>
+        </w:rPr>
+        <w:t xml:space="preserve">South Africa faces an ongoing water scarcity crisis, with an average annual rainfall of only 464 mm, significantly below the global average of 860 mm. This challenge is particularly present in urban and suburban areas, where the municipal restrictions and higher water tariffs are common. There are an estimated 800,000 residential swimming pools in South Africa, each requiring between 30, 000 to 60, 000 litres of water to function. </w:t>
+      </w:r>
+      <w:r>
+        <w:rPr>
+          <w:rFonts w:cstheme="minorHAnsi"/>
+        </w:rPr>
+        <w:t>T</w:t>
+      </w:r>
+      <w:r>
+        <w:rPr>
+          <w:rFonts w:eastAsia="Times New Roman" w:cstheme="minorHAnsi"/>
+          <w:lang w:eastAsia="en-ZA"/>
+        </w:rPr>
+        <w:t>he problem focus is not the existence of pools, but the inefficient, uncoordinated, and technically inconsistent approach to their maintenance.</w:t>
+      </w:r>
+    </w:p>
+    <w:p>
+      <w:pPr>
+        <w:spacing w:before="100" w:beforeAutospacing="1" w:after="100" w:afterAutospacing="1"/>
+        <w:rPr>
+          <w:rFonts w:asciiTheme="majorHAnsi" w:eastAsia="Times New Roman" w:hAnsiTheme="majorHAnsi" w:cstheme="majorHAnsi"/>
+          <w:lang w:eastAsia="en-ZA"/>
+        </w:rPr>
+      </w:pPr>
+      <w:r>
+        <w:rPr>
+          <w:rFonts w:asciiTheme="majorHAnsi" w:eastAsia="Times New Roman" w:hAnsiTheme="majorHAnsi" w:cstheme="majorHAnsi"/>
+          <w:lang w:eastAsia="en-ZA"/>
+        </w:rPr>
+        <w:t>Maintenance complexity</w:t>
+      </w:r>
+    </w:p>
+    <w:p>
+      <w:pPr>
+        <w:spacing w:before="100" w:beforeAutospacing="1" w:after="100" w:afterAutospacing="1"/>
+        <w:rPr>
+          <w:rFonts w:eastAsia="Times New Roman" w:cstheme="minorHAnsi"/>
+          <w:lang w:eastAsia="en-ZA"/>
+        </w:rPr>
+      </w:pPr>
+      <w:r>
+        <w:rPr>
+          <w:rFonts w:eastAsia="Times New Roman" w:cstheme="minorHAnsi"/>
+          <w:lang w:eastAsia="en-ZA"/>
+        </w:rPr>
+        <w:t>Many new pool owners often find balancing the pH, chlorine and alkalinity challenging. While seasoned veterans are more knowledgeable, natural human errors such as forgetting to add chlorine or reset the water pump due to load shedding can lead to issues</w:t>
+      </w:r>
+      <w:r>
+        <w:rPr>
+          <w:rFonts w:eastAsia="Times New Roman" w:cstheme="minorHAnsi"/>
+          <w:lang w:eastAsia="en-ZA"/>
+        </w:rPr>
+        <w:t xml:space="preserve"> including </w:t>
+      </w:r>
+      <w:r>
+        <w:rPr>
+          <w:rFonts w:eastAsia="Times New Roman" w:cstheme="minorHAnsi"/>
+          <w:lang w:eastAsia="en-ZA"/>
+        </w:rPr>
+        <w:t>algae growth, damaged equipment, and the waste of a critical resource: water. In addition to these general issues, local challenges also exist. Municipal water regulations are in place in many areas of South Africa, and pool owners face limits on topping up water levels.</w:t>
+      </w:r>
+    </w:p>
+    <w:p>
+      <w:pPr>
+        <w:spacing w:before="100" w:beforeAutospacing="1" w:after="100" w:afterAutospacing="1"/>
+        <w:rPr>
+          <w:rFonts w:asciiTheme="majorHAnsi" w:eastAsia="Times New Roman" w:hAnsiTheme="majorHAnsi" w:cstheme="majorHAnsi"/>
+          <w:lang w:eastAsia="en-ZA"/>
+        </w:rPr>
+      </w:pPr>
+      <w:r>
+        <w:rPr>
+          <w:rFonts w:asciiTheme="majorHAnsi" w:eastAsia="Times New Roman" w:hAnsiTheme="majorHAnsi" w:cstheme="majorHAnsi"/>
+          <w:lang w:eastAsia="en-ZA"/>
+        </w:rPr>
+        <w:t>Time Constraints</w:t>
+      </w:r>
+    </w:p>
+    <w:p>
+      <w:pPr>
+        <w:spacing w:before="100" w:beforeAutospacing="1" w:after="100" w:afterAutospacing="1"/>
+        <w:rPr>
+          <w:rFonts w:eastAsia="Times New Roman" w:cstheme="minorHAnsi"/>
+          <w:lang w:eastAsia="en-ZA"/>
+        </w:rPr>
+      </w:pPr>
+      <w:r>
+        <w:rPr>
+          <w:rFonts w:eastAsia="Times New Roman" w:cstheme="minorHAnsi"/>
+          <w:lang w:eastAsia="en-ZA"/>
+        </w:rPr>
+        <w:t>Pool maintenance, if performed correctly, is not the most time-consuming household activity. However, when paired with a business work schedule, other household chores and unforeseen daily occurrences, many pools are neglected. Frequent travellers, holiday accommodation owners and busy residents may not have the time to carry out regular maintenance tasks themselves. As a result, they often rely on professional pool service providers.</w:t>
+      </w:r>
+    </w:p>
+    <w:p>
+      <w:pPr>
+        <w:spacing w:before="100" w:beforeAutospacing="1" w:after="100" w:afterAutospacing="1"/>
+        <w:rPr>
+          <w:rFonts w:asciiTheme="majorHAnsi" w:eastAsia="Times New Roman" w:hAnsiTheme="majorHAnsi" w:cstheme="majorHAnsi"/>
+          <w:lang w:eastAsia="en-ZA"/>
+        </w:rPr>
+      </w:pPr>
+      <w:r>
+        <w:rPr>
+          <w:rFonts w:asciiTheme="majorHAnsi" w:eastAsia="Times New Roman" w:hAnsiTheme="majorHAnsi" w:cstheme="majorHAnsi"/>
+          <w:lang w:eastAsia="en-ZA"/>
+        </w:rPr>
+        <w:t>Scattered Service Market</w:t>
+      </w:r>
+    </w:p>
+    <w:p>
+      <w:pPr>
+        <w:spacing w:before="100" w:beforeAutospacing="1" w:after="100" w:afterAutospacing="1"/>
+        <w:rPr>
+          <w:rFonts w:eastAsia="Times New Roman" w:cstheme="minorHAnsi"/>
+          <w:lang w:eastAsia="en-ZA"/>
+        </w:rPr>
+      </w:pPr>
+      <w:r>
+        <w:rPr>
+          <w:rFonts w:eastAsia="Times New Roman" w:cstheme="minorHAnsi"/>
+          <w:lang w:eastAsia="en-ZA"/>
+        </w:rPr>
+        <w:t>As referenced in the previous segment of this analysis, pool maintenance can be approached in two manners: self-service and professional-service outsourcing. Both models require pool service products and for homeowners, an optional need for professional services that are verified and reliable. For local businesses, while there are platforms such as company websites, Facebook Marketplace, and other similar applications, these are often decentralized from the client and the business at first unless a client or business starts the interaction. For the homeowner, finding a reliable and vetted local product or service can be difficult</w:t>
+      </w:r>
+      <w:r>
+        <w:rPr>
+          <w:rFonts w:eastAsia="Times New Roman" w:cstheme="minorHAnsi"/>
+          <w:lang w:eastAsia="en-ZA"/>
+        </w:rPr>
+        <w:t>.</w:t>
+      </w:r>
+    </w:p>
+    <w:p>
+      <w:pPr>
+        <w:spacing w:before="100" w:beforeAutospacing="1" w:after="100" w:afterAutospacing="1"/>
+        <w:rPr>
+          <w:rFonts w:eastAsia="Times New Roman" w:cstheme="minorHAnsi"/>
+          <w:lang w:eastAsia="en-ZA"/>
+        </w:rPr>
+      </w:pPr>
+      <w:r>
+        <w:rPr>
+          <w:rFonts w:eastAsia="Times New Roman" w:cstheme="minorHAnsi"/>
+          <w:lang w:eastAsia="en-ZA"/>
+        </w:rPr>
+        <w:t>The problem isn’t that there are no solutions but rather it’s that they’re scattered, and none are tailored to South Africa’s unique challenges.</w:t>
+      </w:r>
+      <w:r>
+        <w:rPr>
+          <w:rFonts w:cstheme="minorHAnsi"/>
+        </w:rPr>
+        <w:t xml:space="preserve"> </w:t>
+      </w:r>
+      <w:r>
+        <w:rPr>
+          <w:rFonts w:eastAsia="Times New Roman" w:cstheme="minorHAnsi"/>
+          <w:lang w:eastAsia="en-ZA"/>
+        </w:rPr>
+        <w:t>A solution that combines DIY water quality monitoring, digital maintenance guidance, and a transparent, centralised service marketplace could simultaneously reduce water waste, lower costs, and improve service reliability.</w:t>
+      </w:r>
+      <w:bookmarkStart w:id="1" w:name="_GoBack"/>
+      <w:bookmarkEnd w:id="1"/>
+    </w:p>
+    <w:p>
+      <w:pPr>
+        <w:pStyle w:val="Heading1"/>
+        <w:rPr>
+          <w:b/>
+          <w:color w:val="auto"/>
           <w:sz w:val="32"/>
           <w:szCs w:val="32"/>
         </w:rPr>
       </w:pPr>
-    </w:p>
-    <w:p>
-      <w:pPr>
-        <w:jc w:val="both"/>
-        <w:rPr>
-          <w:color w:val="4472C4" w:themeColor="accent1"/>
-          <w:sz w:val="22"/>
-          <w:szCs w:val="22"/>
-        </w:rPr>
-      </w:pPr>
-      <w:r>
-        <w:rPr>
-          <w:color w:val="4472C4" w:themeColor="accent1"/>
-          <w:sz w:val="22"/>
-          <w:szCs w:val="22"/>
-        </w:rPr>
-        <w:t>In this section, describe the real</w:t>
-      </w:r>
-      <w:r>
-        <w:rPr>
-          <w:color w:val="4472C4" w:themeColor="accent1"/>
-          <w:sz w:val="22"/>
-          <w:szCs w:val="22"/>
-        </w:rPr>
-        <w:t>-</w:t>
-      </w:r>
-      <w:r>
-        <w:rPr>
-          <w:color w:val="4472C4" w:themeColor="accent1"/>
-          <w:sz w:val="22"/>
-          <w:szCs w:val="22"/>
-        </w:rPr>
-        <w:t>world domain in which your proposed system will be implemented.</w:t>
-      </w:r>
-      <w:r>
-        <w:rPr>
-          <w:color w:val="4472C4" w:themeColor="accent1"/>
-          <w:sz w:val="22"/>
-          <w:szCs w:val="22"/>
-        </w:rPr>
-        <w:t xml:space="preserve"> </w:t>
-      </w:r>
-      <w:r>
-        <w:rPr>
-          <w:color w:val="4472C4" w:themeColor="accent1"/>
-          <w:sz w:val="22"/>
-          <w:szCs w:val="22"/>
-        </w:rPr>
-        <w:t>This could be a description of a specific type of company, business</w:t>
-      </w:r>
-      <w:r>
-        <w:rPr>
-          <w:color w:val="4472C4" w:themeColor="accent1"/>
-          <w:sz w:val="22"/>
-          <w:szCs w:val="22"/>
-        </w:rPr>
-        <w:t>, or</w:t>
-      </w:r>
-      <w:r>
-        <w:rPr>
-          <w:color w:val="4472C4" w:themeColor="accent1"/>
-          <w:sz w:val="22"/>
-          <w:szCs w:val="22"/>
-        </w:rPr>
-        <w:t xml:space="preserve"> real-world activity.</w:t>
-      </w:r>
-      <w:r>
-        <w:rPr>
-          <w:color w:val="4472C4" w:themeColor="accent1"/>
-          <w:sz w:val="22"/>
-          <w:szCs w:val="22"/>
-        </w:rPr>
-        <w:t xml:space="preserve"> </w:t>
-      </w:r>
-      <w:r>
-        <w:rPr>
-          <w:color w:val="4472C4" w:themeColor="accent1"/>
-          <w:sz w:val="22"/>
-          <w:szCs w:val="22"/>
-        </w:rPr>
-        <w:t>Your description should be so detailed that a reader who has never heard of the domain completely understands it</w:t>
-      </w:r>
-      <w:r>
-        <w:rPr>
-          <w:color w:val="4472C4" w:themeColor="accent1"/>
-          <w:sz w:val="22"/>
-          <w:szCs w:val="22"/>
-        </w:rPr>
-        <w:t>, what</w:t>
-      </w:r>
-      <w:r>
-        <w:rPr>
-          <w:color w:val="4472C4" w:themeColor="accent1"/>
-          <w:sz w:val="22"/>
-          <w:szCs w:val="22"/>
-        </w:rPr>
-        <w:t xml:space="preserve"> problem(s) plague it</w:t>
-      </w:r>
-      <w:r>
-        <w:rPr>
-          <w:color w:val="4472C4" w:themeColor="accent1"/>
-          <w:sz w:val="22"/>
-          <w:szCs w:val="22"/>
-        </w:rPr>
-        <w:t>,</w:t>
-      </w:r>
-      <w:r>
-        <w:rPr>
-          <w:color w:val="4472C4" w:themeColor="accent1"/>
-          <w:sz w:val="22"/>
-          <w:szCs w:val="22"/>
-        </w:rPr>
-        <w:t xml:space="preserve"> or what opportunities there are to support/improve it.</w:t>
-      </w:r>
-      <w:r>
-        <w:rPr>
-          <w:color w:val="4472C4" w:themeColor="accent1"/>
-          <w:sz w:val="22"/>
-          <w:szCs w:val="22"/>
-        </w:rPr>
-        <w:t xml:space="preserve"> </w:t>
-      </w:r>
-      <w:r>
-        <w:rPr>
-          <w:color w:val="4472C4" w:themeColor="accent1"/>
-          <w:sz w:val="22"/>
-          <w:szCs w:val="22"/>
-        </w:rPr>
-        <w:t>This should clearly highlight to the user why a system is necessary</w:t>
-      </w:r>
-      <w:r>
-        <w:rPr>
-          <w:color w:val="4472C4" w:themeColor="accent1"/>
-          <w:sz w:val="22"/>
-          <w:szCs w:val="22"/>
-        </w:rPr>
-        <w:t>.</w:t>
-      </w:r>
-      <w:r>
-        <w:rPr>
-          <w:color w:val="4472C4" w:themeColor="accent1"/>
-          <w:sz w:val="22"/>
-          <w:szCs w:val="22"/>
-        </w:rPr>
-        <w:t xml:space="preserve"> </w:t>
-      </w:r>
-      <w:r>
-        <w:rPr>
-          <w:color w:val="4472C4" w:themeColor="accent1"/>
-          <w:sz w:val="22"/>
-          <w:szCs w:val="22"/>
-        </w:rPr>
-        <w:t xml:space="preserve">If </w:t>
-      </w:r>
-      <w:r>
-        <w:rPr>
-          <w:color w:val="4472C4" w:themeColor="accent1"/>
-          <w:sz w:val="22"/>
-          <w:szCs w:val="22"/>
-        </w:rPr>
-        <w:t>this section is s</w:t>
-      </w:r>
-      <w:r>
-        <w:rPr>
-          <w:color w:val="4472C4" w:themeColor="accent1"/>
-          <w:sz w:val="22"/>
-          <w:szCs w:val="22"/>
-        </w:rPr>
-        <w:t>horter than half a page, it’s probably too short.</w:t>
-      </w:r>
-    </w:p>
-    <w:p>
-      <w:pPr>
-        <w:jc w:val="both"/>
+      <w:bookmarkStart w:id="2" w:name="_Toc1126977357"/>
+      <w:r>
         <w:rPr>
           <w:b/>
-          <w:bCs/>
-          <w:color w:val="000000" w:themeColor="text1"/>
-          <w:sz w:val="22"/>
-          <w:szCs w:val="22"/>
-        </w:rPr>
-      </w:pPr>
-    </w:p>
-    <w:p>
-      <w:pPr>
-        <w:ind w:left="720"/>
-        <w:jc w:val="both"/>
-        <w:rPr>
-          <w:color w:val="000000" w:themeColor="text1"/>
-          <w:sz w:val="22"/>
-          <w:szCs w:val="22"/>
-        </w:rPr>
-      </w:pPr>
-      <w:r>
-        <w:rPr>
-          <w:color w:val="000000" w:themeColor="text1"/>
-          <w:sz w:val="22"/>
-          <w:szCs w:val="22"/>
-        </w:rPr>
-        <w:t>Lack of Knowledge</w:t>
-      </w:r>
-    </w:p>
-    <w:p>
-      <w:pPr>
-        <w:numPr>
-          <w:ilvl w:val="1"/>
-          <w:numId w:val="16"/>
-        </w:numPr>
-        <w:jc w:val="both"/>
-        <w:rPr>
-          <w:color w:val="000000" w:themeColor="text1"/>
-          <w:sz w:val="22"/>
-          <w:szCs w:val="22"/>
-        </w:rPr>
-      </w:pPr>
-      <w:r>
-        <w:rPr>
-          <w:color w:val="000000" w:themeColor="text1"/>
-          <w:sz w:val="22"/>
-          <w:szCs w:val="22"/>
-        </w:rPr>
-        <w:t>New pool owners often don’t know the correct procedures for water testing, chemical balancing, or seasonal maintenance.</w:t>
-      </w:r>
-    </w:p>
-    <w:p>
-      <w:pPr>
-        <w:numPr>
-          <w:ilvl w:val="1"/>
-          <w:numId w:val="16"/>
-        </w:numPr>
-        <w:jc w:val="both"/>
-        <w:rPr>
-          <w:color w:val="000000" w:themeColor="text1"/>
-          <w:sz w:val="22"/>
-          <w:szCs w:val="22"/>
-        </w:rPr>
-      </w:pPr>
-      <w:r>
-        <w:rPr>
-          <w:color w:val="000000" w:themeColor="text1"/>
-          <w:sz w:val="22"/>
-          <w:szCs w:val="22"/>
-        </w:rPr>
-        <w:t>Incorrect maintenance can lead to algae growth, cloudy water, or equipment damage.</w:t>
-      </w:r>
-    </w:p>
-    <w:p>
-      <w:pPr>
-        <w:ind w:left="720"/>
-        <w:jc w:val="both"/>
-        <w:rPr>
-          <w:color w:val="000000" w:themeColor="text1"/>
-          <w:sz w:val="22"/>
-          <w:szCs w:val="22"/>
-        </w:rPr>
-      </w:pPr>
-      <w:r>
-        <w:rPr>
-          <w:color w:val="000000" w:themeColor="text1"/>
-          <w:sz w:val="22"/>
-          <w:szCs w:val="22"/>
-        </w:rPr>
-        <w:t>Time Constraints</w:t>
-      </w:r>
-    </w:p>
-    <w:p>
-      <w:pPr>
-        <w:numPr>
-          <w:ilvl w:val="1"/>
-          <w:numId w:val="16"/>
-        </w:numPr>
-        <w:jc w:val="both"/>
-        <w:rPr>
-          <w:color w:val="000000" w:themeColor="text1"/>
-          <w:sz w:val="22"/>
-          <w:szCs w:val="22"/>
-        </w:rPr>
-      </w:pPr>
-      <w:r>
-        <w:rPr>
-          <w:color w:val="000000" w:themeColor="text1"/>
-          <w:sz w:val="22"/>
-          <w:szCs w:val="22"/>
-        </w:rPr>
-        <w:t>Pool upkeep is time-consuming, and many owners don’t have the spare time to do it consistently.</w:t>
-      </w:r>
-    </w:p>
-    <w:p>
-      <w:pPr>
-        <w:numPr>
-          <w:ilvl w:val="1"/>
-          <w:numId w:val="16"/>
-        </w:numPr>
-        <w:jc w:val="both"/>
-        <w:rPr>
-          <w:color w:val="000000" w:themeColor="text1"/>
-          <w:sz w:val="22"/>
-          <w:szCs w:val="22"/>
-        </w:rPr>
-      </w:pPr>
-      <w:r>
-        <w:rPr>
-          <w:color w:val="000000" w:themeColor="text1"/>
-          <w:sz w:val="22"/>
-          <w:szCs w:val="22"/>
-        </w:rPr>
-        <w:t>This is especially problematic when homeowners travel or have busy schedules.</w:t>
-      </w:r>
-    </w:p>
-    <w:p>
-      <w:pPr>
-        <w:ind w:left="720"/>
-        <w:jc w:val="both"/>
-        <w:rPr>
-          <w:color w:val="000000" w:themeColor="text1"/>
-          <w:sz w:val="22"/>
-          <w:szCs w:val="22"/>
-        </w:rPr>
-      </w:pPr>
-      <w:r>
-        <w:rPr>
-          <w:color w:val="000000" w:themeColor="text1"/>
-          <w:sz w:val="22"/>
-          <w:szCs w:val="22"/>
-        </w:rPr>
-        <w:t>Difficulty Finding Reliable Help</w:t>
-      </w:r>
-    </w:p>
-    <w:p>
-      <w:pPr>
-        <w:numPr>
-          <w:ilvl w:val="1"/>
-          <w:numId w:val="16"/>
-        </w:numPr>
-        <w:jc w:val="both"/>
-        <w:rPr>
-          <w:color w:val="000000" w:themeColor="text1"/>
-          <w:sz w:val="22"/>
-          <w:szCs w:val="22"/>
-        </w:rPr>
-      </w:pPr>
-      <w:r>
-        <w:rPr>
-          <w:color w:val="000000" w:themeColor="text1"/>
-          <w:sz w:val="22"/>
-          <w:szCs w:val="22"/>
-        </w:rPr>
-        <w:t>When something breaks (pump, filter, chlorinator), owners often don’t know which service provider to contact.</w:t>
-      </w:r>
-    </w:p>
-    <w:p>
-      <w:pPr>
-        <w:numPr>
-          <w:ilvl w:val="1"/>
-          <w:numId w:val="16"/>
-        </w:numPr>
-        <w:jc w:val="both"/>
-        <w:rPr>
-          <w:color w:val="000000" w:themeColor="text1"/>
-          <w:sz w:val="22"/>
-          <w:szCs w:val="22"/>
-        </w:rPr>
-      </w:pPr>
-      <w:r>
-        <w:rPr>
-          <w:color w:val="000000" w:themeColor="text1"/>
-          <w:sz w:val="22"/>
-          <w:szCs w:val="22"/>
-        </w:rPr>
-        <w:t>Quality and pricing of services vary, and finding trustworthy professionals quickly can be challenging.</w:t>
-      </w:r>
-    </w:p>
-    <w:p>
-      <w:pPr>
-        <w:jc w:val="both"/>
-        <w:rPr>
-          <w:color w:val="000000" w:themeColor="text1"/>
-          <w:sz w:val="22"/>
-          <w:szCs w:val="22"/>
-        </w:rPr>
-      </w:pPr>
-    </w:p>
-    <w:p>
-      <w:pPr>
-        <w:jc w:val="both"/>
-        <w:rPr>
-          <w:color w:val="000000" w:themeColor="text1"/>
-          <w:sz w:val="22"/>
-          <w:szCs w:val="22"/>
-        </w:rPr>
-      </w:pPr>
-      <w:r>
-        <w:rPr>
-          <w:color w:val="000000" w:themeColor="text1"/>
-          <w:sz w:val="22"/>
-          <w:szCs w:val="22"/>
-        </w:rPr>
-        <w:t>There is no single platform that combines clear, step-by-step maintenance guidance with the ability to quickly find, book, and review professional pool services.</w:t>
-      </w:r>
-    </w:p>
-    <w:p>
-      <w:pPr>
-        <w:jc w:val="both"/>
-        <w:rPr>
-          <w:color w:val="000000" w:themeColor="text1"/>
-          <w:sz w:val="22"/>
-          <w:szCs w:val="22"/>
-        </w:rPr>
-      </w:pPr>
-    </w:p>
-    <w:p>
-      <w:pPr>
-        <w:jc w:val="both"/>
-        <w:rPr>
-          <w:color w:val="000000" w:themeColor="text1"/>
-          <w:sz w:val="22"/>
-          <w:szCs w:val="22"/>
-        </w:rPr>
-      </w:pPr>
-      <w:r>
-        <w:rPr>
-          <w:color w:val="000000" w:themeColor="text1"/>
-          <w:sz w:val="22"/>
-          <w:szCs w:val="22"/>
-        </w:rPr>
-        <w:t>Swimming pools are a popular feature in many residential homes, hotels, guesthouses, and recreational facilities. They provide leisure, exercise, and social benefits but also require ongoing care to remain clean, safe, and fully operational. Pool maintenance involves a variety of tasks, such as checking and adjusting water chemistry, cleaning debris from the surface and floor, backwashing filters, inspecting pumps, and repairing or replacing faulty equipment. This is not a once-off activity but an ongoing responsibility that, if neglected, can lead to unsafe swimming conditions, costly damage, and reduced lifespan of pool infrastructure.</w:t>
-      </w:r>
-    </w:p>
-    <w:p>
-      <w:pPr>
-        <w:jc w:val="both"/>
-        <w:rPr>
-          <w:color w:val="000000" w:themeColor="text1"/>
-          <w:sz w:val="22"/>
-          <w:szCs w:val="22"/>
-        </w:rPr>
-      </w:pPr>
-    </w:p>
-    <w:p>
-      <w:pPr>
-        <w:jc w:val="both"/>
-        <w:rPr>
-          <w:color w:val="000000" w:themeColor="text1"/>
-          <w:sz w:val="22"/>
-          <w:szCs w:val="22"/>
-        </w:rPr>
-      </w:pPr>
-      <w:r>
-        <w:rPr>
-          <w:color w:val="000000" w:themeColor="text1"/>
-          <w:sz w:val="22"/>
-          <w:szCs w:val="22"/>
-        </w:rPr>
-        <w:t>For many pool owners, maintaining a pool presents a significant challenge. A large percentage of owners lack the technical knowledge required to manage water chemistry correctly, identify early signs of equipment failure, or understand proper seasonal maintenance procedures. Incorrect or irregular upkeep can lead to issues such as algae growth, cloudy water, scaling, corrosion, and even health hazards for swimmers</w:t>
-      </w:r>
-      <w:r>
-        <w:rPr>
-          <w:color w:val="000000" w:themeColor="text1"/>
-          <w:sz w:val="22"/>
-          <w:szCs w:val="22"/>
-        </w:rPr>
-        <w:t xml:space="preserve"> for example putting too </w:t>
-      </w:r>
-      <w:proofErr w:type="gramStart"/>
-      <w:r>
-        <w:rPr>
-          <w:color w:val="000000" w:themeColor="text1"/>
-          <w:sz w:val="22"/>
-          <w:szCs w:val="22"/>
-        </w:rPr>
-        <w:t>much</w:t>
-      </w:r>
-      <w:proofErr w:type="gramEnd"/>
-      <w:r>
-        <w:rPr>
-          <w:color w:val="000000" w:themeColor="text1"/>
-          <w:sz w:val="22"/>
-          <w:szCs w:val="22"/>
-        </w:rPr>
-        <w:t xml:space="preserve"> chemicals in can cause chemical burns to the skin</w:t>
-      </w:r>
-      <w:r>
-        <w:rPr>
-          <w:color w:val="000000" w:themeColor="text1"/>
-          <w:sz w:val="22"/>
-          <w:szCs w:val="22"/>
-        </w:rPr>
-        <w:t>.</w:t>
-      </w:r>
-      <w:r>
-        <w:rPr>
-          <w:color w:val="000000" w:themeColor="text1"/>
-          <w:sz w:val="22"/>
-          <w:szCs w:val="22"/>
-        </w:rPr>
-        <w:t xml:space="preserve"> </w:t>
-      </w:r>
-      <w:r>
-        <w:rPr>
-          <w:color w:val="000000" w:themeColor="text1"/>
-          <w:sz w:val="22"/>
-          <w:szCs w:val="22"/>
-        </w:rPr>
-        <w:t>The cost of fixing these problems often far exceeds the cost of regular preventive maintenance.</w:t>
-      </w:r>
-    </w:p>
-    <w:p>
-      <w:pPr>
-        <w:jc w:val="both"/>
-        <w:rPr>
-          <w:color w:val="000000" w:themeColor="text1"/>
-          <w:sz w:val="22"/>
-          <w:szCs w:val="22"/>
-        </w:rPr>
-      </w:pPr>
-    </w:p>
-    <w:p>
-      <w:pPr>
-        <w:jc w:val="both"/>
-        <w:rPr>
-          <w:color w:val="000000" w:themeColor="text1"/>
-          <w:sz w:val="22"/>
-          <w:szCs w:val="22"/>
-        </w:rPr>
-      </w:pPr>
-      <w:r>
-        <w:rPr>
-          <w:color w:val="000000" w:themeColor="text1"/>
-          <w:sz w:val="22"/>
-          <w:szCs w:val="22"/>
-        </w:rPr>
-        <w:t xml:space="preserve">Time constraints also play a major role in poor pool care. Busy homeowners, frequent </w:t>
-      </w:r>
-      <w:proofErr w:type="spellStart"/>
-      <w:r>
-        <w:rPr>
-          <w:color w:val="000000" w:themeColor="text1"/>
-          <w:sz w:val="22"/>
-          <w:szCs w:val="22"/>
-        </w:rPr>
-        <w:t>travelers</w:t>
-      </w:r>
-      <w:proofErr w:type="spellEnd"/>
-      <w:r>
-        <w:rPr>
-          <w:color w:val="000000" w:themeColor="text1"/>
-          <w:sz w:val="22"/>
-          <w:szCs w:val="22"/>
-        </w:rPr>
-        <w:t xml:space="preserve">, and holiday accommodation owners may not have the time to carry out regular maintenance tasks themselves. As a result, they often rely on professional pool service providers. However, finding a reliable and affordable professional can be difficult. The pool service industry is highly fragmented, with services scattered across small local businesses and independent contractors. There is no </w:t>
-      </w:r>
-      <w:r>
-        <w:rPr>
-          <w:color w:val="000000" w:themeColor="text1"/>
-          <w:sz w:val="22"/>
-          <w:szCs w:val="22"/>
-        </w:rPr>
-        <w:lastRenderedPageBreak/>
-        <w:t>universal standard for service quality, and customers often depend on word-of-mouth recommendations, online searches, or trial and error to find trustworthy help.</w:t>
-      </w:r>
-      <w:r>
-        <w:rPr>
-          <w:color w:val="000000" w:themeColor="text1"/>
-          <w:sz w:val="22"/>
-          <w:szCs w:val="22"/>
-        </w:rPr>
-        <w:t xml:space="preserve"> T</w:t>
-      </w:r>
-      <w:r>
-        <w:rPr>
-          <w:color w:val="000000" w:themeColor="text1"/>
-          <w:sz w:val="22"/>
-          <w:szCs w:val="22"/>
-        </w:rPr>
-        <w:t>he process of arranging pool services can be inconvenient. Currently, owners may need to search multiple websites, make several phone calls, or wait days for responses to booking requests. Information about services, pricing, and availability is often unclear or outdated. For equipment replacement or repairs, customers may also face uncertainty about which supplier to use, whether the parts are compatible, and if the pricing is fair.</w:t>
-      </w:r>
-    </w:p>
-    <w:p>
-      <w:pPr>
-        <w:jc w:val="both"/>
-        <w:rPr>
-          <w:color w:val="000000" w:themeColor="text1"/>
-          <w:sz w:val="22"/>
-          <w:szCs w:val="22"/>
-        </w:rPr>
-      </w:pPr>
-    </w:p>
-    <w:p>
-      <w:pPr>
-        <w:jc w:val="both"/>
-        <w:rPr>
-          <w:color w:val="000000" w:themeColor="text1"/>
-          <w:sz w:val="22"/>
-          <w:szCs w:val="22"/>
-        </w:rPr>
-      </w:pPr>
-      <w:r>
-        <w:rPr>
-          <w:color w:val="000000" w:themeColor="text1"/>
-          <w:sz w:val="22"/>
-          <w:szCs w:val="22"/>
-        </w:rPr>
-        <w:t>Th</w:t>
-      </w:r>
-      <w:r>
-        <w:rPr>
-          <w:color w:val="000000" w:themeColor="text1"/>
-          <w:sz w:val="22"/>
-          <w:szCs w:val="22"/>
-        </w:rPr>
-        <w:t>is</w:t>
-      </w:r>
-      <w:r>
-        <w:rPr>
-          <w:color w:val="000000" w:themeColor="text1"/>
-          <w:sz w:val="22"/>
-          <w:szCs w:val="22"/>
-        </w:rPr>
-        <w:t xml:space="preserve"> is also an opportunity to improve how pool owners access information and guidance. While there are online videos, articles, and forums dedicated to pool care, the information is often scattered, inconsistent, or too technical for the average homeowner. This leaves many owners unsure of what steps to take and when to take them, especially in emergency situations such as pump failure, rapid algae growth, or sudden chemical imbalance.</w:t>
-      </w:r>
-    </w:p>
-    <w:p>
-      <w:pPr>
-        <w:jc w:val="both"/>
-        <w:rPr>
-          <w:color w:val="000000" w:themeColor="text1"/>
-          <w:sz w:val="22"/>
-          <w:szCs w:val="22"/>
-        </w:rPr>
-      </w:pPr>
-    </w:p>
-    <w:p>
-      <w:pPr>
-        <w:jc w:val="both"/>
-        <w:rPr>
-          <w:color w:val="000000" w:themeColor="text1"/>
-          <w:sz w:val="22"/>
-          <w:szCs w:val="22"/>
-        </w:rPr>
-      </w:pPr>
-      <w:proofErr w:type="gramStart"/>
-      <w:r>
-        <w:rPr>
-          <w:color w:val="000000" w:themeColor="text1"/>
-          <w:sz w:val="22"/>
-          <w:szCs w:val="22"/>
-        </w:rPr>
-        <w:t>Thus</w:t>
-      </w:r>
-      <w:proofErr w:type="gramEnd"/>
-      <w:r>
-        <w:rPr>
-          <w:color w:val="000000" w:themeColor="text1"/>
-          <w:sz w:val="22"/>
-          <w:szCs w:val="22"/>
-        </w:rPr>
-        <w:t xml:space="preserve"> the</w:t>
-      </w:r>
-      <w:r>
-        <w:rPr>
-          <w:color w:val="000000" w:themeColor="text1"/>
-          <w:sz w:val="22"/>
-          <w:szCs w:val="22"/>
-        </w:rPr>
-        <w:t xml:space="preserve"> current state of pool ownership is marked by several challenges: lack of centralized, reliable information; difficulty finding trustworthy and available professionals; time constraints that prevent regular maintenance; and high costs associated with preventable damage. There is a clear opportunity to develop a system that consolidates pool care guidance with an easy-to-use, trustworthy platform for connecting homeowners with qualified service providers. Such a system could significantly reduce maintenance problems, save costs, and enhance the overall experience of owning a pool.</w:t>
-      </w:r>
-    </w:p>
-    <w:p>
-      <w:pPr>
-        <w:jc w:val="both"/>
-        <w:rPr>
-          <w:color w:val="000000" w:themeColor="text1"/>
-          <w:sz w:val="22"/>
-          <w:szCs w:val="22"/>
-        </w:rPr>
-      </w:pPr>
-    </w:p>
-    <w:p>
-      <w:pPr>
-        <w:rPr>
-          <w:sz w:val="22"/>
-          <w:szCs w:val="22"/>
-        </w:rPr>
-      </w:pPr>
-    </w:p>
-    <w:p>
-      <w:r>
-        <w:br w:type="page"/>
-      </w:r>
-    </w:p>
-    <w:p>
-      <w:pPr>
-        <w:pStyle w:val="Heading1"/>
-        <w:rPr>
+          <w:color w:val="auto"/>
           <w:sz w:val="32"/>
           <w:szCs w:val="32"/>
         </w:rPr>
-      </w:pPr>
-      <w:bookmarkStart w:id="1" w:name="_Toc1126977357"/>
-      <w:r>
         <w:lastRenderedPageBreak/>
         <w:t>Proposed solution</w:t>
       </w:r>
-      <w:bookmarkEnd w:id="1"/>
+      <w:bookmarkEnd w:id="2"/>
+    </w:p>
+    <w:p>
+      <w:pPr>
+        <w:pStyle w:val="NormalWeb"/>
+        <w:rPr>
+          <w:rFonts w:asciiTheme="minorHAnsi" w:hAnsiTheme="minorHAnsi" w:cstheme="minorHAnsi"/>
+        </w:rPr>
+      </w:pPr>
+      <w:r>
+        <w:rPr>
+          <w:rFonts w:asciiTheme="minorHAnsi" w:hAnsiTheme="minorHAnsi" w:cstheme="minorHAnsi"/>
+        </w:rPr>
+        <w:t xml:space="preserve">Our proposed system, </w:t>
+      </w:r>
+      <w:r>
+        <w:rPr>
+          <w:rFonts w:asciiTheme="minorHAnsi" w:hAnsiTheme="minorHAnsi" w:cstheme="minorHAnsi"/>
+          <w:i/>
+        </w:rPr>
+        <w:t>SplashScreen</w:t>
+      </w:r>
+      <w:r>
+        <w:rPr>
+          <w:rFonts w:asciiTheme="minorHAnsi" w:hAnsiTheme="minorHAnsi" w:cstheme="minorHAnsi"/>
+        </w:rPr>
+        <w:t xml:space="preserve">, is a mobile application developed in Java using Android Studio, with Firebase </w:t>
+      </w:r>
+      <w:proofErr w:type="spellStart"/>
+      <w:r>
+        <w:rPr>
+          <w:rFonts w:asciiTheme="minorHAnsi" w:hAnsiTheme="minorHAnsi" w:cstheme="minorHAnsi"/>
+        </w:rPr>
+        <w:t>Firestore</w:t>
+      </w:r>
+      <w:proofErr w:type="spellEnd"/>
+      <w:r>
+        <w:rPr>
+          <w:rFonts w:asciiTheme="minorHAnsi" w:hAnsiTheme="minorHAnsi" w:cstheme="minorHAnsi"/>
+        </w:rPr>
+        <w:t xml:space="preserve"> as the backend database. It is designed to tackle the core challenges faced by swimming pool owners</w:t>
+      </w:r>
+      <w:r>
+        <w:rPr>
+          <w:rFonts w:asciiTheme="minorHAnsi" w:hAnsiTheme="minorHAnsi" w:cstheme="minorHAnsi"/>
+        </w:rPr>
+        <w:t xml:space="preserve">: </w:t>
+      </w:r>
+      <w:r>
+        <w:rPr>
+          <w:rFonts w:asciiTheme="minorHAnsi" w:hAnsiTheme="minorHAnsi" w:cstheme="minorHAnsi"/>
+        </w:rPr>
+        <w:t xml:space="preserve">maintenance complexity, time constraints, and a scattered service marketplace. By providing a single, data-driven platform, </w:t>
+      </w:r>
+      <w:r>
+        <w:rPr>
+          <w:rFonts w:asciiTheme="minorHAnsi" w:hAnsiTheme="minorHAnsi" w:cstheme="minorHAnsi"/>
+          <w:i/>
+        </w:rPr>
+        <w:t xml:space="preserve">SplashScreen </w:t>
+      </w:r>
+      <w:r>
+        <w:rPr>
+          <w:rFonts w:asciiTheme="minorHAnsi" w:hAnsiTheme="minorHAnsi" w:cstheme="minorHAnsi"/>
+        </w:rPr>
+        <w:t>will help users perform accurate and efficient maintenance while connecting them with trusted local service providers. This unified approach will replace fragmented tools and word-of-mouth searches, ultimately reducing water waste, lowering maintenance costs, and improving service quality</w:t>
+      </w:r>
+      <w:r>
+        <w:rPr>
+          <w:rFonts w:asciiTheme="minorHAnsi" w:hAnsiTheme="minorHAnsi" w:cstheme="minorHAnsi"/>
+        </w:rPr>
+        <w:t>.</w:t>
+      </w:r>
+    </w:p>
+    <w:p>
+      <w:pPr>
+        <w:pStyle w:val="NormalWeb"/>
+        <w:rPr>
+          <w:rFonts w:asciiTheme="minorHAnsi" w:hAnsiTheme="minorHAnsi" w:cstheme="minorHAnsi"/>
+        </w:rPr>
+      </w:pPr>
+      <w:r>
+        <w:rPr>
+          <w:rFonts w:asciiTheme="minorHAnsi" w:hAnsiTheme="minorHAnsi" w:cstheme="minorHAnsi"/>
+        </w:rPr>
+        <w:t xml:space="preserve">For </w:t>
+      </w:r>
+      <w:r>
+        <w:rPr>
+          <w:rStyle w:val="Strong"/>
+          <w:rFonts w:asciiTheme="minorHAnsi" w:hAnsiTheme="minorHAnsi" w:cstheme="minorHAnsi"/>
+        </w:rPr>
+        <w:t>pool owners</w:t>
+      </w:r>
+      <w:r>
+        <w:rPr>
+          <w:rFonts w:asciiTheme="minorHAnsi" w:hAnsiTheme="minorHAnsi" w:cstheme="minorHAnsi"/>
+        </w:rPr>
+        <w:t>, the app will offer:</w:t>
+      </w:r>
+    </w:p>
+    <w:p>
+      <w:pPr>
+        <w:pStyle w:val="NormalWeb"/>
+        <w:numPr>
+          <w:ilvl w:val="0"/>
+          <w:numId w:val="20"/>
+        </w:numPr>
+        <w:rPr>
+          <w:rFonts w:asciiTheme="minorHAnsi" w:hAnsiTheme="minorHAnsi" w:cstheme="minorHAnsi"/>
+        </w:rPr>
+      </w:pPr>
+      <w:r>
+        <w:rPr>
+          <w:rFonts w:asciiTheme="minorHAnsi" w:hAnsiTheme="minorHAnsi" w:cstheme="minorHAnsi"/>
+        </w:rPr>
+        <w:t>Registration and tracking of one or more pools.</w:t>
+      </w:r>
+    </w:p>
+    <w:p>
+      <w:pPr>
+        <w:pStyle w:val="NormalWeb"/>
+        <w:numPr>
+          <w:ilvl w:val="0"/>
+          <w:numId w:val="20"/>
+        </w:numPr>
+        <w:rPr>
+          <w:rFonts w:asciiTheme="minorHAnsi" w:hAnsiTheme="minorHAnsi" w:cstheme="minorHAnsi"/>
+        </w:rPr>
+      </w:pPr>
+      <w:r>
+        <w:rPr>
+          <w:rFonts w:asciiTheme="minorHAnsi" w:hAnsiTheme="minorHAnsi" w:cstheme="minorHAnsi"/>
+        </w:rPr>
+        <w:t>Personalised maintenance guides with weekly and monthly checklists.</w:t>
+      </w:r>
+    </w:p>
+    <w:p>
+      <w:pPr>
+        <w:pStyle w:val="NormalWeb"/>
+        <w:numPr>
+          <w:ilvl w:val="0"/>
+          <w:numId w:val="20"/>
+        </w:numPr>
+        <w:rPr>
+          <w:rFonts w:asciiTheme="minorHAnsi" w:hAnsiTheme="minorHAnsi" w:cstheme="minorHAnsi"/>
+        </w:rPr>
+      </w:pPr>
+      <w:r>
+        <w:rPr>
+          <w:rFonts w:asciiTheme="minorHAnsi" w:hAnsiTheme="minorHAnsi" w:cstheme="minorHAnsi"/>
+        </w:rPr>
+        <w:t>A water chemistry calculator that gives precise dosing instructions based on pool size and</w:t>
+      </w:r>
+      <w:r>
+        <w:rPr>
+          <w:rFonts w:asciiTheme="minorHAnsi" w:hAnsiTheme="minorHAnsi" w:cstheme="minorHAnsi"/>
+        </w:rPr>
+        <w:t xml:space="preserve"> manually added </w:t>
+      </w:r>
+      <w:r>
+        <w:rPr>
+          <w:rFonts w:asciiTheme="minorHAnsi" w:hAnsiTheme="minorHAnsi" w:cstheme="minorHAnsi"/>
+        </w:rPr>
+        <w:t>readings</w:t>
+      </w:r>
+      <w:r>
+        <w:rPr>
+          <w:rFonts w:asciiTheme="minorHAnsi" w:hAnsiTheme="minorHAnsi" w:cstheme="minorHAnsi"/>
+        </w:rPr>
+        <w:t>.</w:t>
+      </w:r>
+    </w:p>
+    <w:p>
+      <w:pPr>
+        <w:pStyle w:val="NormalWeb"/>
+        <w:numPr>
+          <w:ilvl w:val="0"/>
+          <w:numId w:val="20"/>
+        </w:numPr>
+        <w:rPr>
+          <w:rFonts w:asciiTheme="minorHAnsi" w:hAnsiTheme="minorHAnsi" w:cstheme="minorHAnsi"/>
+        </w:rPr>
+      </w:pPr>
+      <w:r>
+        <w:rPr>
+          <w:rFonts w:asciiTheme="minorHAnsi" w:hAnsiTheme="minorHAnsi" w:cstheme="minorHAnsi"/>
+        </w:rPr>
+        <w:t>Direct booking of vetted service providers and in-app ordering of pool chemicals and equipment.</w:t>
+      </w:r>
+    </w:p>
+    <w:p>
+      <w:pPr>
+        <w:pStyle w:val="NormalWeb"/>
+        <w:rPr>
+          <w:rFonts w:asciiTheme="minorHAnsi" w:hAnsiTheme="minorHAnsi" w:cstheme="minorHAnsi"/>
+        </w:rPr>
+      </w:pPr>
+      <w:r>
+        <w:rPr>
+          <w:rFonts w:asciiTheme="minorHAnsi" w:hAnsiTheme="minorHAnsi" w:cstheme="minorHAnsi"/>
+        </w:rPr>
+        <w:t xml:space="preserve">For </w:t>
+      </w:r>
+      <w:r>
+        <w:rPr>
+          <w:rStyle w:val="Strong"/>
+          <w:rFonts w:asciiTheme="minorHAnsi" w:hAnsiTheme="minorHAnsi" w:cstheme="minorHAnsi"/>
+        </w:rPr>
+        <w:t>service providers</w:t>
+      </w:r>
+      <w:r>
+        <w:rPr>
+          <w:rFonts w:asciiTheme="minorHAnsi" w:hAnsiTheme="minorHAnsi" w:cstheme="minorHAnsi"/>
+        </w:rPr>
+        <w:t>, it will include:</w:t>
+      </w:r>
+    </w:p>
+    <w:p>
+      <w:pPr>
+        <w:pStyle w:val="NormalWeb"/>
+        <w:numPr>
+          <w:ilvl w:val="0"/>
+          <w:numId w:val="21"/>
+        </w:numPr>
+        <w:rPr>
+          <w:rFonts w:asciiTheme="minorHAnsi" w:hAnsiTheme="minorHAnsi" w:cstheme="minorHAnsi"/>
+        </w:rPr>
+      </w:pPr>
+      <w:r>
+        <w:rPr>
+          <w:rFonts w:asciiTheme="minorHAnsi" w:hAnsiTheme="minorHAnsi" w:cstheme="minorHAnsi"/>
+        </w:rPr>
+        <w:t>Business profiles with services, pricing, and availability.</w:t>
+      </w:r>
+    </w:p>
+    <w:p>
+      <w:pPr>
+        <w:pStyle w:val="NormalWeb"/>
+        <w:numPr>
+          <w:ilvl w:val="0"/>
+          <w:numId w:val="21"/>
+        </w:numPr>
+        <w:rPr>
+          <w:rFonts w:asciiTheme="minorHAnsi" w:hAnsiTheme="minorHAnsi" w:cstheme="minorHAnsi"/>
+        </w:rPr>
+      </w:pPr>
+      <w:r>
+        <w:rPr>
+          <w:rFonts w:asciiTheme="minorHAnsi" w:hAnsiTheme="minorHAnsi" w:cstheme="minorHAnsi"/>
+        </w:rPr>
+        <w:t>A searchable marketplace for customers to book and review services.</w:t>
+      </w:r>
+    </w:p>
+    <w:p>
+      <w:pPr>
+        <w:pStyle w:val="NormalWeb"/>
+        <w:numPr>
+          <w:ilvl w:val="0"/>
+          <w:numId w:val="21"/>
+        </w:numPr>
+        <w:rPr>
+          <w:rFonts w:asciiTheme="minorHAnsi" w:hAnsiTheme="minorHAnsi" w:cstheme="minorHAnsi"/>
+        </w:rPr>
+      </w:pPr>
+      <w:r>
+        <w:rPr>
+          <w:rFonts w:asciiTheme="minorHAnsi" w:hAnsiTheme="minorHAnsi" w:cstheme="minorHAnsi"/>
+        </w:rPr>
+        <w:t>Job management tools, real-time chat with clients, and order tracking.</w:t>
+      </w:r>
+    </w:p>
+    <w:p>
+      <w:pPr>
+        <w:pStyle w:val="NormalWeb"/>
+        <w:rPr>
+          <w:rFonts w:asciiTheme="minorHAnsi" w:hAnsiTheme="minorHAnsi" w:cstheme="minorHAnsi"/>
+        </w:rPr>
+      </w:pPr>
+      <w:r>
+        <w:rPr>
+          <w:rFonts w:asciiTheme="minorHAnsi" w:hAnsiTheme="minorHAnsi" w:cstheme="minorHAnsi"/>
+        </w:rPr>
+        <w:t xml:space="preserve">The system will be </w:t>
+      </w:r>
+      <w:r>
+        <w:rPr>
+          <w:rFonts w:asciiTheme="minorHAnsi" w:hAnsiTheme="minorHAnsi" w:cstheme="minorHAnsi"/>
+        </w:rPr>
+        <w:t>constructed</w:t>
+      </w:r>
+      <w:r>
+        <w:rPr>
+          <w:rFonts w:asciiTheme="minorHAnsi" w:hAnsiTheme="minorHAnsi" w:cstheme="minorHAnsi"/>
+        </w:rPr>
+        <w:t xml:space="preserve"> based on a</w:t>
+      </w:r>
+      <w:r>
+        <w:rPr>
+          <w:rFonts w:asciiTheme="minorHAnsi" w:hAnsiTheme="minorHAnsi" w:cstheme="minorHAnsi"/>
+        </w:rPr>
+        <w:t xml:space="preserve"> </w:t>
+      </w:r>
+      <w:r>
+        <w:rPr>
+          <w:rStyle w:val="Strong"/>
+          <w:rFonts w:asciiTheme="minorHAnsi" w:hAnsiTheme="minorHAnsi" w:cstheme="minorHAnsi"/>
+        </w:rPr>
+        <w:t xml:space="preserve">14-table </w:t>
+      </w:r>
+      <w:proofErr w:type="spellStart"/>
+      <w:r>
+        <w:rPr>
+          <w:rStyle w:val="Strong"/>
+          <w:rFonts w:asciiTheme="minorHAnsi" w:hAnsiTheme="minorHAnsi" w:cstheme="minorHAnsi"/>
+        </w:rPr>
+        <w:t>Firestore</w:t>
+      </w:r>
+      <w:proofErr w:type="spellEnd"/>
+      <w:r>
+        <w:rPr>
+          <w:rStyle w:val="Strong"/>
+          <w:rFonts w:asciiTheme="minorHAnsi" w:hAnsiTheme="minorHAnsi" w:cstheme="minorHAnsi"/>
+        </w:rPr>
+        <w:t xml:space="preserve"> database</w:t>
+      </w:r>
+      <w:r>
+        <w:rPr>
+          <w:rFonts w:asciiTheme="minorHAnsi" w:hAnsiTheme="minorHAnsi" w:cstheme="minorHAnsi"/>
+        </w:rPr>
+        <w:t xml:space="preserve">, including collections for users, roles, pools, maintenance logs, water readings, providers, bookings, products, weather data, restrictions, and notifications. A secure </w:t>
+      </w:r>
+      <w:r>
+        <w:rPr>
+          <w:rStyle w:val="Strong"/>
+          <w:rFonts w:asciiTheme="minorHAnsi" w:hAnsiTheme="minorHAnsi" w:cstheme="minorHAnsi"/>
+          <w:b w:val="0"/>
+        </w:rPr>
+        <w:t>role-based login</w:t>
+      </w:r>
+      <w:r>
+        <w:rPr>
+          <w:rFonts w:asciiTheme="minorHAnsi" w:hAnsiTheme="minorHAnsi" w:cstheme="minorHAnsi"/>
+        </w:rPr>
+        <w:t xml:space="preserve"> will ensure users only see functions relevant to them. The app will integrate </w:t>
+      </w:r>
+      <w:r>
+        <w:rPr>
+          <w:rStyle w:val="Strong"/>
+          <w:rFonts w:asciiTheme="minorHAnsi" w:hAnsiTheme="minorHAnsi" w:cstheme="minorHAnsi"/>
+          <w:b w:val="0"/>
+        </w:rPr>
+        <w:t>external APIs</w:t>
+      </w:r>
+      <w:r>
+        <w:rPr>
+          <w:rFonts w:asciiTheme="minorHAnsi" w:hAnsiTheme="minorHAnsi" w:cstheme="minorHAnsi"/>
+        </w:rPr>
+        <w:t xml:space="preserve"> for live weather and load shedding data, generating automated, context-aware recommendations.</w:t>
+      </w:r>
+    </w:p>
+    <w:p>
+      <w:pPr>
+        <w:pStyle w:val="NormalWeb"/>
+        <w:rPr>
+          <w:rStyle w:val="Strong"/>
+          <w:rFonts w:asciiTheme="minorHAnsi" w:hAnsiTheme="minorHAnsi" w:cstheme="minorHAnsi"/>
+        </w:rPr>
+      </w:pPr>
+      <w:r>
+        <w:rPr>
+          <w:rStyle w:val="Strong"/>
+          <w:rFonts w:asciiTheme="minorHAnsi" w:hAnsiTheme="minorHAnsi" w:cstheme="minorHAnsi"/>
+        </w:rPr>
+        <w:t xml:space="preserve">Key Screens </w:t>
+      </w:r>
+      <w:r>
+        <w:rPr>
+          <w:rStyle w:val="Strong"/>
+          <w:rFonts w:asciiTheme="minorHAnsi" w:hAnsiTheme="minorHAnsi" w:cstheme="minorHAnsi"/>
+        </w:rPr>
+        <w:t>(Functionality to be extended)</w:t>
+      </w:r>
+    </w:p>
+    <w:p>
+      <w:pPr>
+        <w:pStyle w:val="NormalWeb"/>
+        <w:numPr>
+          <w:ilvl w:val="0"/>
+          <w:numId w:val="21"/>
+        </w:numPr>
+        <w:rPr>
+          <w:rFonts w:asciiTheme="minorHAnsi" w:hAnsiTheme="minorHAnsi" w:cstheme="minorHAnsi"/>
+        </w:rPr>
+      </w:pPr>
+      <w:r>
+        <w:rPr>
+          <w:rFonts w:asciiTheme="minorHAnsi" w:hAnsiTheme="minorHAnsi" w:cstheme="minorHAnsi"/>
+          <w:b/>
+        </w:rPr>
+        <w:t>Login</w:t>
+      </w:r>
+      <w:r>
+        <w:rPr>
+          <w:rStyle w:val="Strong"/>
+          <w:rFonts w:asciiTheme="minorHAnsi" w:hAnsiTheme="minorHAnsi" w:cstheme="minorHAnsi"/>
+        </w:rPr>
+        <w:t xml:space="preserve"> &amp; Registration Screen</w:t>
+      </w:r>
+      <w:r>
+        <w:rPr>
+          <w:rFonts w:asciiTheme="minorHAnsi" w:hAnsiTheme="minorHAnsi" w:cstheme="minorHAnsi"/>
+        </w:rPr>
+        <w:t xml:space="preserve"> for secure authentication.</w:t>
+      </w:r>
+    </w:p>
+    <w:p>
+      <w:pPr>
+        <w:pStyle w:val="NormalWeb"/>
+        <w:numPr>
+          <w:ilvl w:val="0"/>
+          <w:numId w:val="21"/>
+        </w:numPr>
+        <w:rPr>
+          <w:rFonts w:asciiTheme="minorHAnsi" w:hAnsiTheme="minorHAnsi" w:cstheme="minorHAnsi"/>
+        </w:rPr>
+      </w:pPr>
+      <w:r>
+        <w:rPr>
+          <w:rFonts w:asciiTheme="minorHAnsi" w:hAnsiTheme="minorHAnsi" w:cstheme="minorHAnsi"/>
+          <w:b/>
+        </w:rPr>
+        <w:t>Dashboard</w:t>
+      </w:r>
+      <w:r>
+        <w:rPr>
+          <w:rFonts w:asciiTheme="minorHAnsi" w:hAnsiTheme="minorHAnsi" w:cstheme="minorHAnsi"/>
+        </w:rPr>
+        <w:t xml:space="preserve"> tailored to the user’s role, summarizing key data and actions.</w:t>
+      </w:r>
+    </w:p>
+    <w:p>
+      <w:pPr>
+        <w:pStyle w:val="NormalWeb"/>
+        <w:numPr>
+          <w:ilvl w:val="0"/>
+          <w:numId w:val="21"/>
+        </w:numPr>
+        <w:rPr>
+          <w:rFonts w:asciiTheme="minorHAnsi" w:hAnsiTheme="minorHAnsi" w:cstheme="minorHAnsi"/>
+        </w:rPr>
+      </w:pPr>
+      <w:r>
+        <w:rPr>
+          <w:rFonts w:asciiTheme="minorHAnsi" w:hAnsiTheme="minorHAnsi" w:cstheme="minorHAnsi"/>
+          <w:b/>
+        </w:rPr>
+        <w:t>Service</w:t>
+      </w:r>
+      <w:r>
+        <w:rPr>
+          <w:rStyle w:val="Strong"/>
+          <w:rFonts w:asciiTheme="minorHAnsi" w:hAnsiTheme="minorHAnsi" w:cstheme="minorHAnsi"/>
+        </w:rPr>
+        <w:t xml:space="preserve"> Booking Screen</w:t>
+      </w:r>
+      <w:r>
+        <w:rPr>
+          <w:rFonts w:asciiTheme="minorHAnsi" w:hAnsiTheme="minorHAnsi" w:cstheme="minorHAnsi"/>
+        </w:rPr>
+        <w:t xml:space="preserve"> to request, view, and manage appointments.</w:t>
+      </w:r>
+    </w:p>
+    <w:p>
+      <w:pPr>
+        <w:pStyle w:val="NormalWeb"/>
+        <w:numPr>
+          <w:ilvl w:val="0"/>
+          <w:numId w:val="21"/>
+        </w:numPr>
+        <w:rPr>
+          <w:rFonts w:asciiTheme="minorHAnsi" w:hAnsiTheme="minorHAnsi" w:cstheme="minorHAnsi"/>
+        </w:rPr>
+      </w:pPr>
+      <w:r>
+        <w:rPr>
+          <w:rFonts w:asciiTheme="minorHAnsi" w:hAnsiTheme="minorHAnsi" w:cstheme="minorHAnsi"/>
+          <w:b/>
+        </w:rPr>
+        <w:t>Maintenance</w:t>
+      </w:r>
+      <w:r>
+        <w:rPr>
+          <w:rStyle w:val="Strong"/>
+          <w:rFonts w:asciiTheme="minorHAnsi" w:hAnsiTheme="minorHAnsi" w:cstheme="minorHAnsi"/>
+        </w:rPr>
+        <w:t xml:space="preserve"> Log Screen</w:t>
+      </w:r>
+      <w:r>
+        <w:rPr>
+          <w:rFonts w:asciiTheme="minorHAnsi" w:hAnsiTheme="minorHAnsi" w:cstheme="minorHAnsi"/>
+        </w:rPr>
+        <w:t xml:space="preserve"> for recording and viewing pool water quality data.</w:t>
+      </w:r>
+    </w:p>
+    <w:p>
+      <w:pPr>
+        <w:pStyle w:val="NormalWeb"/>
+        <w:numPr>
+          <w:ilvl w:val="0"/>
+          <w:numId w:val="21"/>
+        </w:numPr>
+        <w:rPr>
+          <w:rFonts w:asciiTheme="minorHAnsi" w:hAnsiTheme="minorHAnsi" w:cstheme="minorHAnsi"/>
+        </w:rPr>
+      </w:pPr>
+      <w:r>
+        <w:rPr>
+          <w:rFonts w:asciiTheme="minorHAnsi" w:hAnsiTheme="minorHAnsi" w:cstheme="minorHAnsi"/>
+          <w:b/>
+        </w:rPr>
+        <w:t>Inventory</w:t>
+      </w:r>
+      <w:r>
+        <w:rPr>
+          <w:rStyle w:val="Strong"/>
+          <w:rFonts w:asciiTheme="minorHAnsi" w:hAnsiTheme="minorHAnsi" w:cstheme="minorHAnsi"/>
+        </w:rPr>
+        <w:t xml:space="preserve"> Management Screen</w:t>
+      </w:r>
+      <w:r>
+        <w:rPr>
+          <w:rFonts w:asciiTheme="minorHAnsi" w:hAnsiTheme="minorHAnsi" w:cstheme="minorHAnsi"/>
+        </w:rPr>
+        <w:t xml:space="preserve"> for tracking products and equipment.</w:t>
+      </w:r>
+    </w:p>
+    <w:p>
+      <w:pPr>
+        <w:pStyle w:val="NormalWeb"/>
+        <w:numPr>
+          <w:ilvl w:val="0"/>
+          <w:numId w:val="21"/>
+        </w:numPr>
+        <w:rPr>
+          <w:rFonts w:asciiTheme="minorHAnsi" w:hAnsiTheme="minorHAnsi" w:cstheme="minorHAnsi"/>
+        </w:rPr>
+      </w:pPr>
+      <w:r>
+        <w:rPr>
+          <w:rFonts w:asciiTheme="minorHAnsi" w:hAnsiTheme="minorHAnsi" w:cstheme="minorHAnsi"/>
+          <w:b/>
+        </w:rPr>
+        <w:t>Reports</w:t>
+      </w:r>
+      <w:r>
+        <w:rPr>
+          <w:rStyle w:val="Strong"/>
+          <w:rFonts w:asciiTheme="minorHAnsi" w:hAnsiTheme="minorHAnsi" w:cstheme="minorHAnsi"/>
+        </w:rPr>
+        <w:t xml:space="preserve"> Screen</w:t>
+      </w:r>
+      <w:r>
+        <w:rPr>
+          <w:rFonts w:asciiTheme="minorHAnsi" w:hAnsiTheme="minorHAnsi" w:cstheme="minorHAnsi"/>
+        </w:rPr>
+        <w:t xml:space="preserve"> to view or export service and maintenance summaries.</w:t>
+      </w:r>
+    </w:p>
+    <w:p>
+      <w:pPr>
+        <w:pStyle w:val="NormalWeb"/>
+        <w:numPr>
+          <w:ilvl w:val="0"/>
+          <w:numId w:val="21"/>
+        </w:numPr>
+        <w:rPr>
+          <w:rFonts w:asciiTheme="minorHAnsi" w:hAnsiTheme="minorHAnsi" w:cstheme="minorHAnsi"/>
+        </w:rPr>
+      </w:pPr>
+      <w:r>
+        <w:rPr>
+          <w:rFonts w:asciiTheme="minorHAnsi" w:hAnsiTheme="minorHAnsi" w:cstheme="minorHAnsi"/>
+          <w:b/>
+        </w:rPr>
+        <w:t>Help</w:t>
+      </w:r>
+      <w:r>
+        <w:rPr>
+          <w:rStyle w:val="Strong"/>
+          <w:rFonts w:asciiTheme="minorHAnsi" w:hAnsiTheme="minorHAnsi" w:cstheme="minorHAnsi"/>
+        </w:rPr>
+        <w:t xml:space="preserve"> &amp; Support </w:t>
+      </w:r>
+      <w:r>
+        <w:rPr>
+          <w:rStyle w:val="Strong"/>
+          <w:rFonts w:asciiTheme="minorHAnsi" w:hAnsiTheme="minorHAnsi" w:cstheme="minorHAnsi"/>
+        </w:rPr>
+        <w:t>Tips</w:t>
+      </w:r>
+      <w:r>
+        <w:rPr>
+          <w:rFonts w:asciiTheme="minorHAnsi" w:hAnsiTheme="minorHAnsi" w:cstheme="minorHAnsi"/>
+        </w:rPr>
+        <w:t xml:space="preserve"> offering guidance, FAQs, and contact details.</w:t>
+      </w:r>
+    </w:p>
+    <w:p>
+      <w:pPr>
+        <w:jc w:val="both"/>
+      </w:pPr>
+      <w:r>
+        <w:rPr>
+          <w:rStyle w:val="Strong"/>
+          <w:b w:val="0"/>
+        </w:rPr>
+        <w:t>As</w:t>
+      </w:r>
+      <w:r>
+        <w:rPr>
+          <w:rStyle w:val="Strong"/>
+        </w:rPr>
+        <w:t xml:space="preserve"> </w:t>
+      </w:r>
+      <w:proofErr w:type="gramStart"/>
+      <w:r>
+        <w:rPr>
+          <w:rStyle w:val="Strong"/>
+        </w:rPr>
+        <w:t>The</w:t>
+      </w:r>
+      <w:proofErr w:type="gramEnd"/>
+      <w:r>
+        <w:rPr>
+          <w:rStyle w:val="Strong"/>
+        </w:rPr>
+        <w:t xml:space="preserve"> Ripple Effect</w:t>
+      </w:r>
+      <w:r>
+        <w:t xml:space="preserve">, </w:t>
+      </w:r>
+      <w:r>
+        <w:rPr>
+          <w:i/>
+        </w:rPr>
+        <w:t>SplashScreen</w:t>
+      </w:r>
+      <w:r>
+        <w:t xml:space="preserve"> brings together easy-to-use self-maintenance tools and a trusted services marketplace, designed specifically for the needs of South African pool owners. By tackling challenges like water scarcity, busy schedules, and unreliable service access, it offers a secure</w:t>
+      </w:r>
+      <w:r>
+        <w:t xml:space="preserve"> </w:t>
+      </w:r>
+      <w:r>
+        <w:t>platform backed by GitHub version control and organised through ClickUp project management.</w:t>
+      </w:r>
+    </w:p>
+    <w:p>
+      <w:pPr>
+        <w:jc w:val="both"/>
+      </w:pPr>
+      <w:r>
+        <w:lastRenderedPageBreak/>
+        <w:t>Problem Domain Requirements</w:t>
+      </w:r>
+    </w:p>
+    <w:p>
+      <w:pPr>
+        <w:jc w:val="both"/>
+        <w:rPr>
+          <w:color w:val="4472C4" w:themeColor="accent1"/>
+          <w:sz w:val="22"/>
+          <w:szCs w:val="22"/>
+        </w:rPr>
+      </w:pPr>
+      <w:r>
+        <w:rPr>
+          <w:color w:val="4472C4" w:themeColor="accent1"/>
+          <w:sz w:val="22"/>
+          <w:szCs w:val="22"/>
+        </w:rPr>
+        <w:t>In this section, describe the real-world domain in which your proposed system will be implemented. This could be a description of a specific type of company, business, or real-world activity. Your description should be so detailed that a reader who has never heard of the domain completely understands it, what problem(s) plague it, or what opportunities there are to support/improve it. This should clearly highlight to the user why a system is necessary</w:t>
+      </w:r>
+      <w:r>
+        <w:rPr>
+          <w:color w:val="4472C4" w:themeColor="accent1"/>
+          <w:sz w:val="22"/>
+          <w:szCs w:val="22"/>
+          <w:highlight w:val="yellow"/>
+        </w:rPr>
+        <w:t>. If this section is shorter than half a page, it’s probably too short.</w:t>
+      </w:r>
+    </w:p>
+    <w:p>
+      <w:pPr>
+        <w:jc w:val="both"/>
+      </w:pPr>
+    </w:p>
+    <w:p>
+      <w:pPr>
+        <w:jc w:val="both"/>
+      </w:pPr>
+      <w:r>
+        <w:t>Proposed Solution Requirements</w:t>
+      </w:r>
     </w:p>
     <w:p>
       <w:pPr>
@@ -1196,1584 +1425,9 @@
     </w:p>
     <w:p>
       <w:pPr>
-        <w:rPr>
-          <w:i/>
-          <w:iCs/>
-        </w:rPr>
-      </w:pPr>
-      <w:r>
-        <w:rPr>
-          <w:rFonts w:ascii="Calibri" w:eastAsia="Calibri" w:hAnsi="Calibri" w:cs="Calibri"/>
-          <w:sz w:val="22"/>
-          <w:szCs w:val="22"/>
-        </w:rPr>
-        <w:t>The propo</w:t>
-      </w:r>
-      <w:r>
-        <w:rPr>
-          <w:rFonts w:ascii="Calibri" w:eastAsia="Calibri" w:hAnsi="Calibri" w:cs="Calibri"/>
-          <w:sz w:val="22"/>
-          <w:szCs w:val="22"/>
-        </w:rPr>
-        <w:t>sed</w:t>
-      </w:r>
-      <w:r>
-        <w:rPr>
-          <w:rFonts w:ascii="Calibri" w:eastAsia="Calibri" w:hAnsi="Calibri" w:cs="Calibri"/>
-          <w:sz w:val="22"/>
-          <w:szCs w:val="22"/>
-        </w:rPr>
-        <w:t xml:space="preserve"> solution is a mobile application designed to simplify and improve swimming pool maintenance for both pool owners and service </w:t>
-      </w:r>
-      <w:proofErr w:type="gramStart"/>
-      <w:r>
-        <w:rPr>
-          <w:rFonts w:ascii="Calibri" w:eastAsia="Calibri" w:hAnsi="Calibri" w:cs="Calibri"/>
-          <w:sz w:val="22"/>
-          <w:szCs w:val="22"/>
-        </w:rPr>
-        <w:t>providers.</w:t>
-      </w:r>
-      <w:r>
-        <w:rPr>
-          <w:rFonts w:ascii="Calibri" w:eastAsia="Calibri" w:hAnsi="Calibri" w:cs="Calibri"/>
-          <w:sz w:val="22"/>
-          <w:szCs w:val="22"/>
-        </w:rPr>
-        <w:t>/</w:t>
-      </w:r>
-      <w:proofErr w:type="gramEnd"/>
-      <w:r>
-        <w:t xml:space="preserve"> </w:t>
-      </w:r>
-      <w:r>
-        <w:rPr>
-          <w:i/>
-          <w:iCs/>
-        </w:rPr>
-        <w:t>designed to guide swimming pool owners in maintaining their pools while providing access to a network of professional pool service providers.</w:t>
-      </w:r>
-    </w:p>
-    <w:p>
-      <w:pPr>
-        <w:spacing w:before="240" w:after="240"/>
         <w:jc w:val="both"/>
-      </w:pPr>
-      <w:r>
-        <w:rPr>
-          <w:rFonts w:ascii="Calibri" w:eastAsia="Calibri" w:hAnsi="Calibri" w:cs="Calibri"/>
-          <w:sz w:val="22"/>
-          <w:szCs w:val="22"/>
-        </w:rPr>
-        <w:t xml:space="preserve"> The system will act as a centralized</w:t>
-      </w:r>
-      <w:r>
-        <w:rPr>
-          <w:rFonts w:ascii="Calibri" w:eastAsia="Calibri" w:hAnsi="Calibri" w:cs="Calibri"/>
-          <w:b/>
-          <w:bCs/>
-          <w:sz w:val="22"/>
-          <w:szCs w:val="22"/>
-        </w:rPr>
-        <w:t xml:space="preserve"> </w:t>
-      </w:r>
-      <w:r>
-        <w:rPr>
-          <w:rFonts w:ascii="Calibri" w:eastAsia="Calibri" w:hAnsi="Calibri" w:cs="Calibri"/>
-          <w:sz w:val="22"/>
-          <w:szCs w:val="22"/>
-        </w:rPr>
-        <w:t>platform that combines step-by-step maintenance guidance, water chemistry management tools, seasonal care tips, and a marketplace for professional pool services.</w:t>
-      </w:r>
-    </w:p>
-    <w:p>
-      <w:pPr>
-        <w:spacing w:before="240" w:after="240"/>
-        <w:jc w:val="both"/>
-      </w:pPr>
-      <w:r>
-        <w:rPr>
-          <w:rFonts w:ascii="Calibri" w:eastAsia="Calibri" w:hAnsi="Calibri" w:cs="Calibri"/>
-          <w:b/>
-          <w:bCs/>
-          <w:sz w:val="22"/>
-          <w:szCs w:val="22"/>
-        </w:rPr>
-        <w:t>For Pool Owners</w:t>
-      </w:r>
-      <w:r>
-        <w:rPr>
-          <w:rFonts w:ascii="Calibri" w:eastAsia="Calibri" w:hAnsi="Calibri" w:cs="Calibri"/>
-          <w:sz w:val="22"/>
-          <w:szCs w:val="22"/>
-        </w:rPr>
-        <w:t>, the application will:</w:t>
-      </w:r>
-    </w:p>
-    <w:p>
-      <w:pPr>
-        <w:pStyle w:val="ListParagraph"/>
-        <w:numPr>
-          <w:ilvl w:val="0"/>
-          <w:numId w:val="5"/>
-        </w:numPr>
-        <w:spacing w:before="240" w:after="240"/>
-        <w:jc w:val="both"/>
-        <w:rPr>
-          <w:rFonts w:ascii="Calibri" w:eastAsia="Calibri" w:hAnsi="Calibri" w:cs="Calibri"/>
-          <w:sz w:val="22"/>
-          <w:szCs w:val="22"/>
-        </w:rPr>
-      </w:pPr>
-      <w:r>
-        <w:rPr>
-          <w:rFonts w:ascii="Calibri" w:eastAsia="Calibri" w:hAnsi="Calibri" w:cs="Calibri"/>
-          <w:sz w:val="22"/>
-          <w:szCs w:val="22"/>
-        </w:rPr>
-        <w:t>Allow users to r</w:t>
-      </w:r>
-      <w:r>
-        <w:rPr>
-          <w:rFonts w:ascii="Calibri" w:eastAsia="Calibri" w:hAnsi="Calibri" w:cs="Calibri"/>
-          <w:sz w:val="22"/>
-          <w:szCs w:val="22"/>
-        </w:rPr>
-        <w:t>egister and manage multiple pools.</w:t>
-      </w:r>
-    </w:p>
-    <w:p>
-      <w:pPr>
-        <w:pStyle w:val="ListParagraph"/>
-        <w:numPr>
-          <w:ilvl w:val="0"/>
-          <w:numId w:val="5"/>
-        </w:numPr>
-        <w:spacing w:before="240" w:after="240"/>
-        <w:jc w:val="both"/>
-        <w:rPr>
-          <w:rFonts w:ascii="Calibri" w:eastAsia="Calibri" w:hAnsi="Calibri" w:cs="Calibri"/>
-          <w:sz w:val="22"/>
-          <w:szCs w:val="22"/>
-        </w:rPr>
-      </w:pPr>
-      <w:r>
-        <w:rPr>
-          <w:rFonts w:ascii="Calibri" w:eastAsia="Calibri" w:hAnsi="Calibri" w:cs="Calibri"/>
-          <w:sz w:val="22"/>
-          <w:szCs w:val="22"/>
-        </w:rPr>
-        <w:t xml:space="preserve">Provide a </w:t>
-      </w:r>
-      <w:r>
-        <w:rPr>
-          <w:rFonts w:ascii="Calibri" w:eastAsia="Calibri" w:hAnsi="Calibri" w:cs="Calibri"/>
-          <w:sz w:val="22"/>
-          <w:szCs w:val="22"/>
-        </w:rPr>
-        <w:t>pool maintenance guide</w:t>
-      </w:r>
-      <w:r>
-        <w:rPr>
-          <w:rFonts w:ascii="Calibri" w:eastAsia="Calibri" w:hAnsi="Calibri" w:cs="Calibri"/>
-          <w:sz w:val="22"/>
-          <w:szCs w:val="22"/>
-        </w:rPr>
-        <w:t xml:space="preserve"> </w:t>
-      </w:r>
-      <w:r>
-        <w:rPr>
-          <w:rFonts w:ascii="Calibri" w:eastAsia="Calibri" w:hAnsi="Calibri" w:cs="Calibri"/>
-          <w:sz w:val="22"/>
-          <w:szCs w:val="22"/>
-        </w:rPr>
-        <w:t>with tutorials and checklists for weekly and monthly tasks such as pH testing, filter cleaning, and backwashing.</w:t>
-      </w:r>
-    </w:p>
-    <w:p>
-      <w:pPr>
-        <w:pStyle w:val="ListParagraph"/>
-        <w:numPr>
-          <w:ilvl w:val="0"/>
-          <w:numId w:val="5"/>
-        </w:numPr>
-        <w:spacing w:before="240" w:after="240"/>
-        <w:jc w:val="both"/>
-        <w:rPr>
-          <w:rFonts w:ascii="Calibri" w:eastAsia="Calibri" w:hAnsi="Calibri" w:cs="Calibri"/>
-          <w:sz w:val="22"/>
-          <w:szCs w:val="22"/>
-        </w:rPr>
-      </w:pPr>
-      <w:r>
-        <w:rPr>
-          <w:rFonts w:ascii="Calibri" w:eastAsia="Calibri" w:hAnsi="Calibri" w:cs="Calibri"/>
-          <w:sz w:val="22"/>
-          <w:szCs w:val="22"/>
-        </w:rPr>
-        <w:t xml:space="preserve">Include </w:t>
-      </w:r>
-      <w:r>
-        <w:rPr>
-          <w:rFonts w:ascii="Calibri" w:eastAsia="Calibri" w:hAnsi="Calibri" w:cs="Calibri"/>
-          <w:sz w:val="22"/>
-          <w:szCs w:val="22"/>
-        </w:rPr>
-        <w:t>water chemistry calculators</w:t>
-      </w:r>
-      <w:r>
-        <w:rPr>
-          <w:rFonts w:ascii="Calibri" w:eastAsia="Calibri" w:hAnsi="Calibri" w:cs="Calibri"/>
-          <w:sz w:val="22"/>
-          <w:szCs w:val="22"/>
-        </w:rPr>
-        <w:t xml:space="preserve"> </w:t>
-      </w:r>
-      <w:r>
-        <w:rPr>
-          <w:rFonts w:ascii="Calibri" w:eastAsia="Calibri" w:hAnsi="Calibri" w:cs="Calibri"/>
-          <w:sz w:val="22"/>
-          <w:szCs w:val="22"/>
-        </w:rPr>
-        <w:t>that allow users to enter pool size and current chemical levels, generating precise dosing recommendations.</w:t>
-      </w:r>
-    </w:p>
-    <w:p>
-      <w:pPr>
-        <w:pStyle w:val="ListParagraph"/>
-        <w:numPr>
-          <w:ilvl w:val="0"/>
-          <w:numId w:val="5"/>
-        </w:numPr>
-        <w:spacing w:before="240" w:after="240"/>
-        <w:jc w:val="both"/>
-        <w:rPr>
-          <w:rFonts w:ascii="Calibri" w:eastAsia="Calibri" w:hAnsi="Calibri" w:cs="Calibri"/>
-          <w:sz w:val="22"/>
-          <w:szCs w:val="22"/>
-        </w:rPr>
-      </w:pPr>
-      <w:r>
-        <w:rPr>
-          <w:rFonts w:ascii="Calibri" w:eastAsia="Calibri" w:hAnsi="Calibri" w:cs="Calibri"/>
-          <w:sz w:val="22"/>
-          <w:szCs w:val="22"/>
-        </w:rPr>
-        <w:t xml:space="preserve">Offer </w:t>
-      </w:r>
-      <w:r>
-        <w:rPr>
-          <w:rFonts w:ascii="Calibri" w:eastAsia="Calibri" w:hAnsi="Calibri" w:cs="Calibri"/>
-          <w:sz w:val="22"/>
-          <w:szCs w:val="22"/>
-        </w:rPr>
-        <w:t>s</w:t>
-      </w:r>
-      <w:r>
-        <w:rPr>
-          <w:rFonts w:ascii="Calibri" w:eastAsia="Calibri" w:hAnsi="Calibri" w:cs="Calibri"/>
-          <w:sz w:val="22"/>
-          <w:szCs w:val="22"/>
-        </w:rPr>
-        <w:t xml:space="preserve">easonal </w:t>
-      </w:r>
-      <w:r>
-        <w:rPr>
-          <w:rFonts w:ascii="Calibri" w:eastAsia="Calibri" w:hAnsi="Calibri" w:cs="Calibri"/>
-          <w:sz w:val="22"/>
-          <w:szCs w:val="22"/>
-        </w:rPr>
-        <w:t>t</w:t>
-      </w:r>
-      <w:r>
-        <w:rPr>
-          <w:rFonts w:ascii="Calibri" w:eastAsia="Calibri" w:hAnsi="Calibri" w:cs="Calibri"/>
-          <w:sz w:val="22"/>
-          <w:szCs w:val="22"/>
-        </w:rPr>
-        <w:t>ips</w:t>
-      </w:r>
-      <w:r>
-        <w:rPr>
-          <w:rFonts w:ascii="Calibri" w:eastAsia="Calibri" w:hAnsi="Calibri" w:cs="Calibri"/>
-          <w:sz w:val="22"/>
-          <w:szCs w:val="22"/>
-        </w:rPr>
-        <w:t xml:space="preserve"> for summer and winter preparation, algae prevention, and maintenance adjustments based on real-time weather data.</w:t>
-      </w:r>
-    </w:p>
-    <w:p>
-      <w:pPr>
-        <w:pStyle w:val="ListParagraph"/>
-        <w:numPr>
-          <w:ilvl w:val="0"/>
-          <w:numId w:val="5"/>
-        </w:numPr>
-        <w:spacing w:before="240" w:after="240"/>
-        <w:jc w:val="both"/>
-        <w:rPr>
-          <w:rFonts w:ascii="Calibri" w:eastAsia="Calibri" w:hAnsi="Calibri" w:cs="Calibri"/>
-          <w:sz w:val="22"/>
-          <w:szCs w:val="22"/>
-        </w:rPr>
-      </w:pPr>
-      <w:r>
-        <w:rPr>
-          <w:rFonts w:ascii="Calibri" w:eastAsia="Calibri" w:hAnsi="Calibri" w:cs="Calibri"/>
-          <w:sz w:val="22"/>
-          <w:szCs w:val="22"/>
-        </w:rPr>
-        <w:t xml:space="preserve">Send </w:t>
-      </w:r>
-      <w:r>
-        <w:rPr>
-          <w:rFonts w:ascii="Calibri" w:eastAsia="Calibri" w:hAnsi="Calibri" w:cs="Calibri"/>
-          <w:sz w:val="22"/>
-          <w:szCs w:val="22"/>
-        </w:rPr>
-        <w:t>p</w:t>
-      </w:r>
-      <w:r>
-        <w:rPr>
-          <w:rFonts w:ascii="Calibri" w:eastAsia="Calibri" w:hAnsi="Calibri" w:cs="Calibri"/>
-          <w:sz w:val="22"/>
-          <w:szCs w:val="22"/>
-        </w:rPr>
-        <w:t xml:space="preserve">ush </w:t>
-      </w:r>
-      <w:r>
-        <w:rPr>
-          <w:rFonts w:ascii="Calibri" w:eastAsia="Calibri" w:hAnsi="Calibri" w:cs="Calibri"/>
-          <w:sz w:val="22"/>
-          <w:szCs w:val="22"/>
-        </w:rPr>
-        <w:t>n</w:t>
-      </w:r>
-      <w:r>
-        <w:rPr>
-          <w:rFonts w:ascii="Calibri" w:eastAsia="Calibri" w:hAnsi="Calibri" w:cs="Calibri"/>
-          <w:sz w:val="22"/>
-          <w:szCs w:val="22"/>
-        </w:rPr>
-        <w:t>otifications</w:t>
-      </w:r>
-      <w:r>
-        <w:rPr>
-          <w:rFonts w:ascii="Calibri" w:eastAsia="Calibri" w:hAnsi="Calibri" w:cs="Calibri"/>
-          <w:sz w:val="22"/>
-          <w:szCs w:val="22"/>
-        </w:rPr>
-        <w:t xml:space="preserve"> to remind users of scheduled maintenance tasks</w:t>
-      </w:r>
-      <w:r>
-        <w:rPr>
-          <w:rFonts w:ascii="Calibri" w:eastAsia="Calibri" w:hAnsi="Calibri" w:cs="Calibri"/>
-          <w:sz w:val="22"/>
-          <w:szCs w:val="22"/>
-        </w:rPr>
-        <w:t>,</w:t>
-      </w:r>
-      <w:r>
-        <w:rPr>
-          <w:rFonts w:ascii="Segoe UI" w:hAnsi="Segoe UI" w:cs="Segoe UI"/>
-          <w:color w:val="1F2328"/>
-          <w:shd w:val="clear" w:color="auto" w:fill="FFFFFF"/>
-        </w:rPr>
-        <w:t xml:space="preserve"> </w:t>
-      </w:r>
-      <w:r>
-        <w:rPr>
-          <w:rFonts w:ascii="Calibri" w:eastAsia="Calibri" w:hAnsi="Calibri" w:cs="Calibri"/>
-          <w:sz w:val="22"/>
-          <w:szCs w:val="22"/>
-        </w:rPr>
-        <w:t>chemical maintenance, load shedding, and municipal restrictions</w:t>
-      </w:r>
-      <w:r>
-        <w:rPr>
-          <w:rFonts w:ascii="Calibri" w:eastAsia="Calibri" w:hAnsi="Calibri" w:cs="Calibri"/>
-          <w:sz w:val="22"/>
-          <w:szCs w:val="22"/>
-        </w:rPr>
-        <w:t>.</w:t>
-      </w:r>
-    </w:p>
-    <w:p>
-      <w:pPr>
-        <w:pStyle w:val="ListParagraph"/>
-        <w:numPr>
-          <w:ilvl w:val="0"/>
-          <w:numId w:val="5"/>
-        </w:numPr>
-        <w:rPr>
-          <w:rFonts w:ascii="Calibri" w:eastAsia="Calibri" w:hAnsi="Calibri" w:cs="Calibri"/>
-          <w:sz w:val="22"/>
-          <w:szCs w:val="22"/>
-        </w:rPr>
-      </w:pPr>
-      <w:r>
-        <w:rPr>
-          <w:rFonts w:ascii="Calibri" w:eastAsia="Calibri" w:hAnsi="Calibri" w:cs="Calibri"/>
-          <w:sz w:val="22"/>
-          <w:szCs w:val="22"/>
-        </w:rPr>
-        <w:t>Schedule professional service bookings.</w:t>
-      </w:r>
-    </w:p>
-    <w:p>
-      <w:pPr>
-        <w:pStyle w:val="ListParagraph"/>
-        <w:numPr>
-          <w:ilvl w:val="0"/>
-          <w:numId w:val="5"/>
-        </w:numPr>
-        <w:spacing w:before="240" w:after="240"/>
-        <w:jc w:val="both"/>
-        <w:rPr>
-          <w:rFonts w:ascii="Calibri" w:eastAsia="Calibri" w:hAnsi="Calibri" w:cs="Calibri"/>
-          <w:sz w:val="22"/>
-          <w:szCs w:val="22"/>
-        </w:rPr>
-      </w:pPr>
-      <w:r>
-        <w:rPr>
-          <w:rFonts w:ascii="Calibri" w:eastAsia="Calibri" w:hAnsi="Calibri" w:cs="Calibri"/>
-          <w:sz w:val="22"/>
-          <w:szCs w:val="22"/>
-        </w:rPr>
-        <w:t>Make it possible for users to p</w:t>
-      </w:r>
-      <w:r>
-        <w:rPr>
-          <w:rFonts w:ascii="Calibri" w:eastAsia="Calibri" w:hAnsi="Calibri" w:cs="Calibri"/>
-          <w:sz w:val="22"/>
-          <w:szCs w:val="22"/>
-        </w:rPr>
-        <w:t>urchase chemicals and equipment directly from providers.</w:t>
-      </w:r>
-    </w:p>
-    <w:p>
-      <w:pPr>
-        <w:spacing w:before="240" w:after="240"/>
-        <w:jc w:val="both"/>
-      </w:pPr>
-      <w:r>
-        <w:rPr>
-          <w:rFonts w:ascii="Calibri" w:eastAsia="Calibri" w:hAnsi="Calibri" w:cs="Calibri"/>
-          <w:b/>
-          <w:bCs/>
-          <w:sz w:val="22"/>
-          <w:szCs w:val="22"/>
-        </w:rPr>
-        <w:t>For Service Providers</w:t>
-      </w:r>
-      <w:r>
-        <w:rPr>
-          <w:rFonts w:ascii="Calibri" w:eastAsia="Calibri" w:hAnsi="Calibri" w:cs="Calibri"/>
-          <w:sz w:val="22"/>
-          <w:szCs w:val="22"/>
-        </w:rPr>
-        <w:t>, the application will:</w:t>
-      </w:r>
-    </w:p>
-    <w:p>
-      <w:pPr>
-        <w:pStyle w:val="ListParagraph"/>
-        <w:numPr>
-          <w:ilvl w:val="0"/>
-          <w:numId w:val="4"/>
-        </w:numPr>
-        <w:spacing w:before="240" w:after="240"/>
-        <w:jc w:val="both"/>
-        <w:rPr>
-          <w:rFonts w:ascii="Calibri" w:eastAsia="Calibri" w:hAnsi="Calibri" w:cs="Calibri"/>
-          <w:sz w:val="22"/>
-          <w:szCs w:val="22"/>
-        </w:rPr>
-      </w:pPr>
-      <w:r>
-        <w:rPr>
-          <w:rFonts w:ascii="Calibri" w:eastAsia="Calibri" w:hAnsi="Calibri" w:cs="Calibri"/>
-          <w:sz w:val="22"/>
-          <w:szCs w:val="22"/>
-        </w:rPr>
-        <w:t>Allow service providers to create profiles and list services offered.</w:t>
-      </w:r>
-    </w:p>
-    <w:p>
-      <w:pPr>
-        <w:pStyle w:val="ListParagraph"/>
-        <w:numPr>
-          <w:ilvl w:val="0"/>
-          <w:numId w:val="4"/>
-        </w:numPr>
-        <w:spacing w:before="240" w:after="240"/>
-        <w:jc w:val="both"/>
-        <w:rPr>
-          <w:rFonts w:ascii="Calibri" w:eastAsia="Calibri" w:hAnsi="Calibri" w:cs="Calibri"/>
-          <w:sz w:val="22"/>
-          <w:szCs w:val="22"/>
-        </w:rPr>
-      </w:pPr>
-      <w:r>
-        <w:rPr>
-          <w:rFonts w:ascii="Calibri" w:eastAsia="Calibri" w:hAnsi="Calibri" w:cs="Calibri"/>
-          <w:sz w:val="22"/>
-          <w:szCs w:val="22"/>
-        </w:rPr>
-        <w:t>Offer</w:t>
-      </w:r>
-      <w:r>
-        <w:rPr>
-          <w:rFonts w:ascii="Calibri" w:eastAsia="Calibri" w:hAnsi="Calibri" w:cs="Calibri"/>
-          <w:sz w:val="22"/>
-          <w:szCs w:val="22"/>
-        </w:rPr>
-        <w:t xml:space="preserve"> and manage</w:t>
-      </w:r>
-      <w:r>
-        <w:rPr>
-          <w:rFonts w:ascii="Calibri" w:eastAsia="Calibri" w:hAnsi="Calibri" w:cs="Calibri"/>
-          <w:sz w:val="22"/>
-          <w:szCs w:val="22"/>
-        </w:rPr>
-        <w:t xml:space="preserve"> a </w:t>
-      </w:r>
-      <w:r>
-        <w:rPr>
-          <w:rFonts w:ascii="Calibri" w:eastAsia="Calibri" w:hAnsi="Calibri" w:cs="Calibri"/>
-          <w:sz w:val="22"/>
-          <w:szCs w:val="22"/>
-        </w:rPr>
-        <w:t>pool service marketplace</w:t>
-      </w:r>
-      <w:r>
-        <w:rPr>
-          <w:rFonts w:ascii="Calibri" w:eastAsia="Calibri" w:hAnsi="Calibri" w:cs="Calibri"/>
-          <w:sz w:val="22"/>
-          <w:szCs w:val="22"/>
-        </w:rPr>
-        <w:t xml:space="preserve"> </w:t>
-      </w:r>
-      <w:r>
-        <w:rPr>
-          <w:rFonts w:ascii="Calibri" w:eastAsia="Calibri" w:hAnsi="Calibri" w:cs="Calibri"/>
-          <w:sz w:val="22"/>
-          <w:szCs w:val="22"/>
-        </w:rPr>
-        <w:t>where customers can search for and book services in their area.</w:t>
-      </w:r>
-    </w:p>
-    <w:p>
-      <w:pPr>
-        <w:pStyle w:val="ListParagraph"/>
-        <w:numPr>
-          <w:ilvl w:val="0"/>
-          <w:numId w:val="4"/>
-        </w:numPr>
-        <w:spacing w:before="240" w:after="240"/>
-        <w:jc w:val="both"/>
-        <w:rPr>
-          <w:rFonts w:ascii="Calibri" w:eastAsia="Calibri" w:hAnsi="Calibri" w:cs="Calibri"/>
-          <w:sz w:val="22"/>
-          <w:szCs w:val="22"/>
-        </w:rPr>
-      </w:pPr>
-      <w:r>
-        <w:rPr>
-          <w:rFonts w:ascii="Calibri" w:eastAsia="Calibri" w:hAnsi="Calibri" w:cs="Calibri"/>
-          <w:sz w:val="22"/>
-          <w:szCs w:val="22"/>
-        </w:rPr>
-        <w:t>Categorize services such as cleaning, equipment replacement (pump, filter, chlorinator), leak detection, repairs, and chemical delivery.</w:t>
-      </w:r>
-    </w:p>
-    <w:p>
-      <w:pPr>
-        <w:pStyle w:val="ListParagraph"/>
-        <w:numPr>
-          <w:ilvl w:val="0"/>
-          <w:numId w:val="4"/>
-        </w:numPr>
-        <w:spacing w:before="240" w:after="240"/>
-        <w:jc w:val="both"/>
-        <w:rPr>
-          <w:rFonts w:ascii="Calibri" w:eastAsia="Calibri" w:hAnsi="Calibri" w:cs="Calibri"/>
-          <w:i/>
-          <w:iCs/>
-          <w:sz w:val="22"/>
-          <w:szCs w:val="22"/>
-          <w:highlight w:val="yellow"/>
-        </w:rPr>
-      </w:pPr>
-      <w:r>
-        <w:rPr>
-          <w:rFonts w:ascii="Calibri" w:eastAsia="Calibri" w:hAnsi="Calibri" w:cs="Calibri"/>
-          <w:i/>
-          <w:iCs/>
-          <w:sz w:val="22"/>
-          <w:szCs w:val="22"/>
-          <w:highlight w:val="yellow"/>
-        </w:rPr>
-        <w:t>Allow User Reviews &amp; Ratings to maintain service quality and trust.</w:t>
-      </w:r>
-    </w:p>
-    <w:p>
-      <w:pPr>
-        <w:pStyle w:val="ListParagraph"/>
-        <w:numPr>
-          <w:ilvl w:val="0"/>
-          <w:numId w:val="4"/>
-        </w:numPr>
-        <w:spacing w:before="240" w:after="240"/>
-        <w:jc w:val="both"/>
-        <w:rPr>
-          <w:rFonts w:ascii="Calibri" w:eastAsia="Calibri" w:hAnsi="Calibri" w:cs="Calibri"/>
-          <w:i/>
-          <w:iCs/>
-          <w:sz w:val="22"/>
-          <w:szCs w:val="22"/>
-          <w:highlight w:val="yellow"/>
-        </w:rPr>
-      </w:pPr>
-      <w:r>
-        <w:rPr>
-          <w:rFonts w:ascii="Calibri" w:eastAsia="Calibri" w:hAnsi="Calibri" w:cs="Calibri"/>
-          <w:i/>
-          <w:iCs/>
-          <w:sz w:val="22"/>
-          <w:szCs w:val="22"/>
-          <w:highlight w:val="yellow"/>
-        </w:rPr>
-        <w:t>Enable Real-Time Chat for direct communication between clients and providers.</w:t>
-      </w:r>
-    </w:p>
-    <w:p>
-      <w:pPr>
-        <w:spacing w:before="240" w:after="240"/>
-        <w:jc w:val="both"/>
-      </w:pPr>
-      <w:r>
-        <w:rPr>
-          <w:rFonts w:ascii="Calibri" w:eastAsia="Calibri" w:hAnsi="Calibri" w:cs="Calibri"/>
-          <w:b/>
-          <w:bCs/>
-          <w:sz w:val="22"/>
-          <w:szCs w:val="22"/>
-        </w:rPr>
-        <w:t>Business Integration</w:t>
-      </w:r>
-      <w:r>
-        <w:rPr>
-          <w:rFonts w:ascii="Calibri" w:eastAsia="Calibri" w:hAnsi="Calibri" w:cs="Calibri"/>
-          <w:sz w:val="22"/>
-          <w:szCs w:val="22"/>
-        </w:rPr>
-        <w:t xml:space="preserve"> will include:</w:t>
-      </w:r>
-    </w:p>
-    <w:p>
-      <w:pPr>
-        <w:pStyle w:val="ListParagraph"/>
-        <w:numPr>
-          <w:ilvl w:val="0"/>
-          <w:numId w:val="3"/>
-        </w:numPr>
-        <w:spacing w:before="240" w:after="240"/>
-        <w:jc w:val="both"/>
-        <w:rPr>
-          <w:rFonts w:ascii="Calibri" w:eastAsia="Calibri" w:hAnsi="Calibri" w:cs="Calibri"/>
-          <w:sz w:val="22"/>
-          <w:szCs w:val="22"/>
-        </w:rPr>
-      </w:pPr>
-      <w:r>
-        <w:rPr>
-          <w:rFonts w:ascii="Calibri" w:eastAsia="Calibri" w:hAnsi="Calibri" w:cs="Calibri"/>
-          <w:sz w:val="22"/>
-          <w:szCs w:val="22"/>
-        </w:rPr>
-        <w:t>Partnerships with local pool companies, allowing them to list their services, products, and prices in the app.</w:t>
-      </w:r>
-    </w:p>
-    <w:p>
-      <w:pPr>
-        <w:pStyle w:val="ListParagraph"/>
-        <w:numPr>
-          <w:ilvl w:val="0"/>
-          <w:numId w:val="3"/>
-        </w:numPr>
-        <w:spacing w:before="240" w:after="240"/>
-        <w:jc w:val="both"/>
-        <w:rPr>
-          <w:rFonts w:ascii="Calibri" w:eastAsia="Calibri" w:hAnsi="Calibri" w:cs="Calibri"/>
-          <w:sz w:val="22"/>
-          <w:szCs w:val="22"/>
-        </w:rPr>
-      </w:pPr>
-      <w:r>
-        <w:rPr>
-          <w:rFonts w:ascii="Calibri" w:eastAsia="Calibri" w:hAnsi="Calibri" w:cs="Calibri"/>
-          <w:sz w:val="22"/>
-          <w:szCs w:val="22"/>
-        </w:rPr>
-        <w:t>A commission-based revenue model for bookings made through the platform.</w:t>
-      </w:r>
-    </w:p>
-    <w:p>
-      <w:pPr>
-        <w:pStyle w:val="ListParagraph"/>
-        <w:numPr>
-          <w:ilvl w:val="0"/>
-          <w:numId w:val="3"/>
-        </w:numPr>
-        <w:spacing w:before="240" w:after="240"/>
-        <w:jc w:val="both"/>
-        <w:rPr>
-          <w:rFonts w:ascii="Calibri" w:eastAsia="Calibri" w:hAnsi="Calibri" w:cs="Calibri"/>
-          <w:sz w:val="22"/>
-          <w:szCs w:val="22"/>
-        </w:rPr>
-      </w:pPr>
-      <w:r>
-        <w:rPr>
-          <w:rFonts w:ascii="Calibri" w:eastAsia="Calibri" w:hAnsi="Calibri" w:cs="Calibri"/>
-          <w:sz w:val="22"/>
-          <w:szCs w:val="22"/>
-        </w:rPr>
-        <w:lastRenderedPageBreak/>
-        <w:t>Affiliate links for purchasing pool equipment and chemicals, generating additional revenue from sales.</w:t>
-      </w:r>
-    </w:p>
-    <w:p>
-      <w:pPr>
-        <w:spacing w:before="240" w:after="240"/>
-        <w:jc w:val="both"/>
-      </w:pPr>
-      <w:r>
-        <w:rPr>
-          <w:rFonts w:ascii="Calibri" w:eastAsia="Calibri" w:hAnsi="Calibri" w:cs="Calibri"/>
-          <w:sz w:val="22"/>
-          <w:szCs w:val="22"/>
-        </w:rPr>
-        <w:t>The application will be developed exclusively for mobile devices to provide maximum accessibility, enabling pool owners and service providers to connect and manage tasks with just a few taps.</w:t>
-      </w:r>
-    </w:p>
-    <w:p>
-      <w:pPr>
-        <w:spacing w:before="240" w:after="240"/>
-        <w:jc w:val="both"/>
-      </w:pPr>
-      <w:r>
-        <w:rPr>
-          <w:rFonts w:ascii="Calibri" w:eastAsia="Calibri" w:hAnsi="Calibri" w:cs="Calibri"/>
-          <w:b/>
-          <w:bCs/>
-          <w:sz w:val="22"/>
-          <w:szCs w:val="22"/>
-        </w:rPr>
-        <w:t>Technologies and Development Tools:</w:t>
-      </w:r>
-    </w:p>
-    <w:p>
-      <w:pPr>
-        <w:pStyle w:val="ListParagraph"/>
-        <w:numPr>
-          <w:ilvl w:val="0"/>
-          <w:numId w:val="2"/>
-        </w:numPr>
-        <w:spacing w:before="240" w:after="240"/>
-        <w:jc w:val="both"/>
-        <w:rPr>
-          <w:rFonts w:ascii="Calibri" w:eastAsia="Calibri" w:hAnsi="Calibri" w:cs="Calibri"/>
-          <w:sz w:val="22"/>
-          <w:szCs w:val="22"/>
-        </w:rPr>
-      </w:pPr>
-      <w:r>
-        <w:rPr>
-          <w:rFonts w:ascii="Calibri" w:eastAsia="Calibri" w:hAnsi="Calibri" w:cs="Calibri"/>
-          <w:sz w:val="22"/>
-          <w:szCs w:val="22"/>
-        </w:rPr>
-        <w:t xml:space="preserve">Project Management: </w:t>
-      </w:r>
-      <w:proofErr w:type="spellStart"/>
-      <w:r>
-        <w:rPr>
-          <w:rFonts w:ascii="Calibri" w:eastAsia="Calibri" w:hAnsi="Calibri" w:cs="Calibri"/>
-          <w:sz w:val="22"/>
-          <w:szCs w:val="22"/>
-        </w:rPr>
-        <w:t>ClickUp</w:t>
-      </w:r>
-      <w:proofErr w:type="spellEnd"/>
-      <w:r>
-        <w:rPr>
-          <w:rFonts w:ascii="Calibri" w:eastAsia="Calibri" w:hAnsi="Calibri" w:cs="Calibri"/>
-          <w:sz w:val="22"/>
-          <w:szCs w:val="22"/>
-        </w:rPr>
-        <w:t xml:space="preserve"> and GitHub for task tracking, collaboration, and version control.</w:t>
-      </w:r>
-    </w:p>
-    <w:p>
-      <w:pPr>
-        <w:pStyle w:val="ListParagraph"/>
-        <w:numPr>
-          <w:ilvl w:val="0"/>
-          <w:numId w:val="2"/>
-        </w:numPr>
-        <w:spacing w:before="240" w:after="240"/>
-        <w:jc w:val="both"/>
-        <w:rPr>
-          <w:rFonts w:ascii="Calibri" w:eastAsia="Calibri" w:hAnsi="Calibri" w:cs="Calibri"/>
-          <w:sz w:val="22"/>
-          <w:szCs w:val="22"/>
-        </w:rPr>
-      </w:pPr>
-      <w:r>
-        <w:rPr>
-          <w:rFonts w:ascii="Calibri" w:eastAsia="Calibri" w:hAnsi="Calibri" w:cs="Calibri"/>
-          <w:sz w:val="22"/>
-          <w:szCs w:val="22"/>
-        </w:rPr>
-        <w:t>Frontend: Java using Android Studio for building the mobile user interface.</w:t>
-      </w:r>
-    </w:p>
-    <w:p>
-      <w:pPr>
-        <w:pStyle w:val="ListParagraph"/>
-        <w:numPr>
-          <w:ilvl w:val="0"/>
-          <w:numId w:val="2"/>
-        </w:numPr>
-        <w:spacing w:before="240" w:after="240"/>
-        <w:jc w:val="both"/>
-        <w:rPr>
-          <w:rFonts w:ascii="Calibri" w:eastAsia="Calibri" w:hAnsi="Calibri" w:cs="Calibri"/>
-          <w:sz w:val="22"/>
-          <w:szCs w:val="22"/>
-        </w:rPr>
-      </w:pPr>
-      <w:r>
-        <w:rPr>
-          <w:rFonts w:ascii="Calibri" w:eastAsia="Calibri" w:hAnsi="Calibri" w:cs="Calibri"/>
-          <w:sz w:val="22"/>
-          <w:szCs w:val="22"/>
-        </w:rPr>
-        <w:t>Backend &amp; Cloud Services: Firebase for authentication, database management (</w:t>
-      </w:r>
-      <w:proofErr w:type="spellStart"/>
-      <w:r>
-        <w:rPr>
-          <w:rFonts w:ascii="Calibri" w:eastAsia="Calibri" w:hAnsi="Calibri" w:cs="Calibri"/>
-          <w:sz w:val="22"/>
-          <w:szCs w:val="22"/>
-        </w:rPr>
-        <w:t>Firestore</w:t>
-      </w:r>
-      <w:proofErr w:type="spellEnd"/>
-      <w:r>
-        <w:rPr>
-          <w:rFonts w:ascii="Calibri" w:eastAsia="Calibri" w:hAnsi="Calibri" w:cs="Calibri"/>
-          <w:sz w:val="22"/>
-          <w:szCs w:val="22"/>
-        </w:rPr>
-        <w:t>), serverless functions (Cloud Functions), and push notifications (Cloud Messaging).</w:t>
-      </w:r>
-    </w:p>
-    <w:p>
-      <w:pPr>
-        <w:pStyle w:val="ListParagraph"/>
-        <w:numPr>
-          <w:ilvl w:val="0"/>
-          <w:numId w:val="2"/>
-        </w:numPr>
-        <w:spacing w:before="240" w:after="240"/>
-        <w:jc w:val="both"/>
-        <w:rPr>
-          <w:rFonts w:ascii="Calibri" w:eastAsia="Calibri" w:hAnsi="Calibri" w:cs="Calibri"/>
-          <w:sz w:val="22"/>
-          <w:szCs w:val="22"/>
-        </w:rPr>
-      </w:pPr>
-      <w:r>
-        <w:rPr>
-          <w:rFonts w:ascii="Calibri" w:eastAsia="Calibri" w:hAnsi="Calibri" w:cs="Calibri"/>
-          <w:sz w:val="22"/>
-          <w:szCs w:val="22"/>
-        </w:rPr>
-        <w:t xml:space="preserve">Database: </w:t>
-      </w:r>
-      <w:proofErr w:type="spellStart"/>
-      <w:r>
-        <w:rPr>
-          <w:rFonts w:ascii="Calibri" w:eastAsia="Calibri" w:hAnsi="Calibri" w:cs="Calibri"/>
-          <w:sz w:val="22"/>
-          <w:szCs w:val="22"/>
-        </w:rPr>
-        <w:t>Firestore</w:t>
-      </w:r>
-      <w:proofErr w:type="spellEnd"/>
-      <w:r>
-        <w:rPr>
-          <w:rFonts w:ascii="Calibri" w:eastAsia="Calibri" w:hAnsi="Calibri" w:cs="Calibri"/>
-          <w:sz w:val="22"/>
-          <w:szCs w:val="22"/>
-        </w:rPr>
-        <w:t xml:space="preserve"> to store user profiles, pool details, service listings, product information, water quality logs, municipal water restrictions, and maintenance history.</w:t>
-      </w:r>
-    </w:p>
-    <w:p>
-      <w:pPr>
-        <w:spacing w:before="240" w:after="240"/>
-        <w:jc w:val="both"/>
-      </w:pPr>
-      <w:r>
-        <w:rPr>
-          <w:rFonts w:ascii="Calibri" w:eastAsia="Calibri" w:hAnsi="Calibri" w:cs="Calibri"/>
-          <w:b/>
-          <w:bCs/>
-          <w:sz w:val="22"/>
-          <w:szCs w:val="22"/>
-        </w:rPr>
-        <w:t>Key Screens and Functions:</w:t>
-      </w:r>
-    </w:p>
-    <w:p>
-      <w:pPr>
-        <w:pStyle w:val="ListParagraph"/>
-        <w:numPr>
-          <w:ilvl w:val="0"/>
-          <w:numId w:val="1"/>
-        </w:numPr>
-        <w:spacing w:before="240" w:after="240"/>
-        <w:jc w:val="both"/>
-        <w:rPr>
-          <w:rFonts w:ascii="Calibri" w:eastAsia="Calibri" w:hAnsi="Calibri" w:cs="Calibri"/>
-          <w:sz w:val="22"/>
-          <w:szCs w:val="22"/>
-        </w:rPr>
-      </w:pPr>
-      <w:r>
-        <w:rPr>
-          <w:rFonts w:ascii="Calibri" w:eastAsia="Calibri" w:hAnsi="Calibri" w:cs="Calibri"/>
-          <w:b/>
-          <w:bCs/>
-          <w:sz w:val="22"/>
-          <w:szCs w:val="22"/>
-        </w:rPr>
-        <w:t>User Onboarding &amp; Authentication</w:t>
-      </w:r>
-      <w:r>
-        <w:rPr>
-          <w:rFonts w:ascii="Calibri" w:eastAsia="Calibri" w:hAnsi="Calibri" w:cs="Calibri"/>
-          <w:sz w:val="22"/>
-          <w:szCs w:val="22"/>
-        </w:rPr>
-        <w:t>:</w:t>
-      </w:r>
-      <w:r>
-        <w:rPr>
-          <w:rFonts w:ascii="Calibri" w:eastAsia="Calibri" w:hAnsi="Calibri" w:cs="Calibri"/>
-          <w:sz w:val="22"/>
-          <w:szCs w:val="22"/>
-        </w:rPr>
-        <w:t xml:space="preserve"> Secure login, registration, and profile setup.</w:t>
-      </w:r>
-    </w:p>
-    <w:p>
-      <w:pPr>
-        <w:pStyle w:val="ListParagraph"/>
-        <w:numPr>
-          <w:ilvl w:val="0"/>
-          <w:numId w:val="1"/>
-        </w:numPr>
-        <w:spacing w:before="240" w:after="240"/>
-        <w:jc w:val="both"/>
-        <w:rPr>
-          <w:rFonts w:ascii="Calibri" w:eastAsia="Calibri" w:hAnsi="Calibri" w:cs="Calibri"/>
-          <w:sz w:val="22"/>
-          <w:szCs w:val="22"/>
-        </w:rPr>
-      </w:pPr>
-      <w:r>
-        <w:rPr>
-          <w:rFonts w:ascii="Calibri" w:eastAsia="Calibri" w:hAnsi="Calibri" w:cs="Calibri"/>
-          <w:b/>
-          <w:bCs/>
-          <w:sz w:val="22"/>
-          <w:szCs w:val="22"/>
-        </w:rPr>
-        <w:t>Maintenance Guide</w:t>
-      </w:r>
-      <w:r>
-        <w:rPr>
-          <w:rFonts w:ascii="Calibri" w:eastAsia="Calibri" w:hAnsi="Calibri" w:cs="Calibri"/>
-          <w:sz w:val="22"/>
-          <w:szCs w:val="22"/>
-        </w:rPr>
-        <w:t>:</w:t>
-      </w:r>
-      <w:r>
-        <w:rPr>
-          <w:rFonts w:ascii="Calibri" w:eastAsia="Calibri" w:hAnsi="Calibri" w:cs="Calibri"/>
-          <w:sz w:val="22"/>
-          <w:szCs w:val="22"/>
-        </w:rPr>
-        <w:t xml:space="preserve"> Step-by-step instructions with visual aids.</w:t>
-      </w:r>
-    </w:p>
-    <w:p>
-      <w:pPr>
-        <w:pStyle w:val="ListParagraph"/>
-        <w:numPr>
-          <w:ilvl w:val="0"/>
-          <w:numId w:val="1"/>
-        </w:numPr>
-        <w:spacing w:before="240" w:after="240"/>
-        <w:jc w:val="both"/>
-        <w:rPr>
-          <w:rFonts w:ascii="Calibri" w:eastAsia="Calibri" w:hAnsi="Calibri" w:cs="Calibri"/>
-          <w:sz w:val="22"/>
-          <w:szCs w:val="22"/>
-        </w:rPr>
-      </w:pPr>
-      <w:r>
-        <w:rPr>
-          <w:rFonts w:ascii="Calibri" w:eastAsia="Calibri" w:hAnsi="Calibri" w:cs="Calibri"/>
-          <w:b/>
-          <w:bCs/>
-          <w:sz w:val="22"/>
-          <w:szCs w:val="22"/>
-        </w:rPr>
-        <w:t>Water Chemistry Calculator</w:t>
-      </w:r>
-      <w:r>
-        <w:rPr>
-          <w:rFonts w:ascii="Calibri" w:eastAsia="Calibri" w:hAnsi="Calibri" w:cs="Calibri"/>
-          <w:sz w:val="22"/>
-          <w:szCs w:val="22"/>
-        </w:rPr>
-        <w:t>:</w:t>
-      </w:r>
-      <w:r>
-        <w:rPr>
-          <w:rFonts w:ascii="Calibri" w:eastAsia="Calibri" w:hAnsi="Calibri" w:cs="Calibri"/>
-          <w:sz w:val="22"/>
-          <w:szCs w:val="22"/>
-        </w:rPr>
-        <w:t xml:space="preserve"> Automated dosage recommendations.</w:t>
-      </w:r>
-    </w:p>
-    <w:p>
-      <w:pPr>
-        <w:pStyle w:val="ListParagraph"/>
-        <w:numPr>
-          <w:ilvl w:val="0"/>
-          <w:numId w:val="1"/>
-        </w:numPr>
-        <w:spacing w:before="240" w:after="240"/>
-        <w:jc w:val="both"/>
-        <w:rPr>
-          <w:rFonts w:ascii="Calibri" w:eastAsia="Calibri" w:hAnsi="Calibri" w:cs="Calibri"/>
-          <w:sz w:val="22"/>
-          <w:szCs w:val="22"/>
-        </w:rPr>
-      </w:pPr>
-      <w:r>
-        <w:rPr>
-          <w:rFonts w:ascii="Calibri" w:eastAsia="Calibri" w:hAnsi="Calibri" w:cs="Calibri"/>
-          <w:b/>
-          <w:bCs/>
-          <w:sz w:val="22"/>
-          <w:szCs w:val="22"/>
-        </w:rPr>
-        <w:t>Seasonal Tips &amp; Alerts</w:t>
-      </w:r>
-      <w:r>
-        <w:rPr>
-          <w:rFonts w:ascii="Calibri" w:eastAsia="Calibri" w:hAnsi="Calibri" w:cs="Calibri"/>
-          <w:sz w:val="22"/>
-          <w:szCs w:val="22"/>
-        </w:rPr>
-        <w:t>:</w:t>
-      </w:r>
-      <w:r>
-        <w:rPr>
-          <w:rFonts w:ascii="Calibri" w:eastAsia="Calibri" w:hAnsi="Calibri" w:cs="Calibri"/>
-          <w:sz w:val="22"/>
-          <w:szCs w:val="22"/>
-        </w:rPr>
-        <w:t xml:space="preserve"> </w:t>
-      </w:r>
-      <w:r>
-        <w:rPr>
-          <w:rFonts w:ascii="Calibri" w:eastAsia="Calibri" w:hAnsi="Calibri" w:cs="Calibri"/>
-          <w:sz w:val="22"/>
-          <w:szCs w:val="22"/>
-        </w:rPr>
-        <w:t>Maintenance suggestions based on weather conditions</w:t>
-      </w:r>
-      <w:r>
-        <w:rPr>
-          <w:rFonts w:ascii="Calibri" w:eastAsia="Calibri" w:hAnsi="Calibri" w:cs="Calibri"/>
-          <w:sz w:val="22"/>
-          <w:szCs w:val="22"/>
-        </w:rPr>
-        <w:t xml:space="preserve"> and power outages</w:t>
-      </w:r>
-      <w:r>
-        <w:rPr>
-          <w:rFonts w:ascii="Calibri" w:eastAsia="Calibri" w:hAnsi="Calibri" w:cs="Calibri"/>
-          <w:sz w:val="22"/>
-          <w:szCs w:val="22"/>
-        </w:rPr>
-        <w:t>.</w:t>
-      </w:r>
-    </w:p>
-    <w:p>
-      <w:pPr>
-        <w:pStyle w:val="ListParagraph"/>
-        <w:numPr>
-          <w:ilvl w:val="0"/>
-          <w:numId w:val="1"/>
-        </w:numPr>
-        <w:spacing w:before="240" w:after="240"/>
-        <w:jc w:val="both"/>
-        <w:rPr>
-          <w:rFonts w:ascii="Calibri" w:eastAsia="Calibri" w:hAnsi="Calibri" w:cs="Calibri"/>
-          <w:sz w:val="22"/>
-          <w:szCs w:val="22"/>
-        </w:rPr>
-      </w:pPr>
-      <w:r>
-        <w:rPr>
-          <w:rFonts w:ascii="Calibri" w:eastAsia="Calibri" w:hAnsi="Calibri" w:cs="Calibri"/>
-          <w:b/>
-          <w:bCs/>
-          <w:sz w:val="22"/>
-          <w:szCs w:val="22"/>
-        </w:rPr>
-        <w:t>Service Marketplace</w:t>
-      </w:r>
-      <w:r>
-        <w:rPr>
-          <w:rFonts w:ascii="Calibri" w:eastAsia="Calibri" w:hAnsi="Calibri" w:cs="Calibri"/>
-          <w:sz w:val="22"/>
-          <w:szCs w:val="22"/>
-        </w:rPr>
-        <w:t>:</w:t>
-      </w:r>
-      <w:r>
-        <w:rPr>
-          <w:rFonts w:ascii="Calibri" w:eastAsia="Calibri" w:hAnsi="Calibri" w:cs="Calibri"/>
-          <w:sz w:val="22"/>
-          <w:szCs w:val="22"/>
-        </w:rPr>
-        <w:t xml:space="preserve"> Search, filter, and book professional services.</w:t>
-      </w:r>
-    </w:p>
-    <w:p>
-      <w:pPr>
-        <w:pStyle w:val="ListParagraph"/>
-        <w:numPr>
-          <w:ilvl w:val="0"/>
-          <w:numId w:val="1"/>
-        </w:numPr>
-        <w:spacing w:before="240" w:after="240"/>
-        <w:jc w:val="both"/>
-        <w:rPr>
-          <w:rFonts w:ascii="Calibri" w:eastAsia="Calibri" w:hAnsi="Calibri" w:cs="Calibri"/>
-          <w:sz w:val="22"/>
-          <w:szCs w:val="22"/>
-        </w:rPr>
-      </w:pPr>
-      <w:r>
-        <w:rPr>
-          <w:rFonts w:ascii="Calibri" w:eastAsia="Calibri" w:hAnsi="Calibri" w:cs="Calibri"/>
-          <w:b/>
-          <w:bCs/>
-          <w:sz w:val="22"/>
-          <w:szCs w:val="22"/>
-        </w:rPr>
-        <w:t>Provider Dashboard</w:t>
-      </w:r>
-      <w:r>
-        <w:rPr>
-          <w:rFonts w:ascii="Calibri" w:eastAsia="Calibri" w:hAnsi="Calibri" w:cs="Calibri"/>
-          <w:sz w:val="22"/>
-          <w:szCs w:val="22"/>
-        </w:rPr>
-        <w:t>:</w:t>
-      </w:r>
-      <w:r>
-        <w:rPr>
-          <w:rFonts w:ascii="Calibri" w:eastAsia="Calibri" w:hAnsi="Calibri" w:cs="Calibri"/>
-          <w:sz w:val="22"/>
-          <w:szCs w:val="22"/>
-        </w:rPr>
-        <w:t xml:space="preserve"> Service management tools for pool companies.</w:t>
-      </w:r>
-    </w:p>
-    <w:p>
-      <w:pPr>
-        <w:pStyle w:val="ListParagraph"/>
-        <w:numPr>
-          <w:ilvl w:val="0"/>
-          <w:numId w:val="1"/>
-        </w:numPr>
-        <w:rPr>
-          <w:rFonts w:ascii="Calibri" w:eastAsia="Calibri" w:hAnsi="Calibri" w:cs="Calibri"/>
-          <w:sz w:val="22"/>
-          <w:szCs w:val="22"/>
-        </w:rPr>
-      </w:pPr>
-      <w:r>
-        <w:rPr>
-          <w:rFonts w:ascii="Calibri" w:eastAsia="Calibri" w:hAnsi="Calibri" w:cs="Calibri"/>
-          <w:b/>
-          <w:bCs/>
-          <w:sz w:val="22"/>
-          <w:szCs w:val="22"/>
-        </w:rPr>
-        <w:t>Pool</w:t>
-      </w:r>
-      <w:r>
-        <w:rPr>
-          <w:rFonts w:ascii="Calibri" w:eastAsia="Calibri" w:hAnsi="Calibri" w:cs="Calibri"/>
-          <w:b/>
-          <w:bCs/>
-          <w:sz w:val="22"/>
-          <w:szCs w:val="22"/>
-        </w:rPr>
-        <w:t xml:space="preserve"> </w:t>
-      </w:r>
-      <w:r>
-        <w:rPr>
-          <w:rFonts w:ascii="Calibri" w:eastAsia="Calibri" w:hAnsi="Calibri" w:cs="Calibri"/>
-          <w:b/>
-          <w:bCs/>
-          <w:sz w:val="22"/>
-          <w:szCs w:val="22"/>
-        </w:rPr>
-        <w:t>Maintenance</w:t>
-      </w:r>
-      <w:r>
-        <w:rPr>
-          <w:rFonts w:ascii="Calibri" w:eastAsia="Calibri" w:hAnsi="Calibri" w:cs="Calibri"/>
-          <w:b/>
-          <w:bCs/>
-          <w:sz w:val="22"/>
-          <w:szCs w:val="22"/>
-        </w:rPr>
-        <w:t xml:space="preserve"> </w:t>
-      </w:r>
-      <w:r>
-        <w:rPr>
-          <w:rFonts w:ascii="Calibri" w:eastAsia="Calibri" w:hAnsi="Calibri" w:cs="Calibri"/>
-          <w:b/>
-          <w:bCs/>
-          <w:sz w:val="22"/>
-          <w:szCs w:val="22"/>
-        </w:rPr>
-        <w:t>Logs</w:t>
-      </w:r>
-      <w:r>
-        <w:rPr>
-          <w:rFonts w:ascii="Calibri" w:eastAsia="Calibri" w:hAnsi="Calibri" w:cs="Calibri"/>
-          <w:sz w:val="22"/>
-          <w:szCs w:val="22"/>
-        </w:rPr>
-        <w:t>: Records maintenance tasks.</w:t>
-      </w:r>
-    </w:p>
-    <w:p>
-      <w:pPr>
-        <w:pStyle w:val="ListParagraph"/>
-        <w:numPr>
-          <w:ilvl w:val="0"/>
-          <w:numId w:val="1"/>
-        </w:numPr>
-        <w:spacing w:before="240" w:after="240"/>
-        <w:jc w:val="both"/>
-        <w:rPr>
-          <w:rFonts w:ascii="Calibri" w:eastAsia="Calibri" w:hAnsi="Calibri" w:cs="Calibri"/>
-          <w:i/>
-          <w:iCs/>
-          <w:sz w:val="22"/>
-          <w:szCs w:val="22"/>
-          <w:highlight w:val="yellow"/>
-        </w:rPr>
-      </w:pPr>
-      <w:r>
-        <w:rPr>
-          <w:rFonts w:ascii="Calibri" w:eastAsia="Calibri" w:hAnsi="Calibri" w:cs="Calibri"/>
-          <w:b/>
-          <w:bCs/>
-          <w:i/>
-          <w:iCs/>
-          <w:sz w:val="22"/>
-          <w:szCs w:val="22"/>
-          <w:highlight w:val="yellow"/>
-        </w:rPr>
-        <w:t>Reviews &amp; Ratings</w:t>
-      </w:r>
-      <w:r>
-        <w:rPr>
-          <w:rFonts w:ascii="Calibri" w:eastAsia="Calibri" w:hAnsi="Calibri" w:cs="Calibri"/>
-          <w:i/>
-          <w:iCs/>
-          <w:sz w:val="22"/>
-          <w:szCs w:val="22"/>
-          <w:highlight w:val="yellow"/>
-        </w:rPr>
-        <w:t xml:space="preserve"> </w:t>
-      </w:r>
-      <w:r>
-        <w:rPr>
-          <w:rFonts w:ascii="Calibri" w:eastAsia="Calibri" w:hAnsi="Calibri" w:cs="Calibri"/>
-          <w:i/>
-          <w:iCs/>
-          <w:sz w:val="22"/>
-          <w:szCs w:val="22"/>
-          <w:highlight w:val="yellow"/>
-        </w:rPr>
-        <w:t>-</w:t>
-      </w:r>
-      <w:r>
-        <w:rPr>
-          <w:rFonts w:ascii="Calibri" w:eastAsia="Calibri" w:hAnsi="Calibri" w:cs="Calibri"/>
-          <w:i/>
-          <w:iCs/>
-          <w:sz w:val="22"/>
-          <w:szCs w:val="22"/>
-          <w:highlight w:val="yellow"/>
-        </w:rPr>
-        <w:t xml:space="preserve"> Feedback system for quality control.</w:t>
-      </w:r>
-    </w:p>
-    <w:p>
-      <w:pPr>
-        <w:pStyle w:val="ListParagraph"/>
-        <w:numPr>
-          <w:ilvl w:val="0"/>
-          <w:numId w:val="1"/>
-        </w:numPr>
-        <w:spacing w:before="240" w:after="240"/>
-        <w:jc w:val="both"/>
-        <w:rPr>
-          <w:rFonts w:ascii="Calibri" w:eastAsia="Calibri" w:hAnsi="Calibri" w:cs="Calibri"/>
-          <w:i/>
-          <w:iCs/>
-          <w:sz w:val="22"/>
-          <w:szCs w:val="22"/>
-          <w:highlight w:val="yellow"/>
-        </w:rPr>
-      </w:pPr>
-      <w:r>
-        <w:rPr>
-          <w:rFonts w:ascii="Calibri" w:eastAsia="Calibri" w:hAnsi="Calibri" w:cs="Calibri"/>
-          <w:b/>
-          <w:bCs/>
-          <w:i/>
-          <w:iCs/>
-          <w:sz w:val="22"/>
-          <w:szCs w:val="22"/>
-          <w:highlight w:val="yellow"/>
-        </w:rPr>
-        <w:t>Messaging System</w:t>
-      </w:r>
-      <w:r>
-        <w:rPr>
-          <w:rFonts w:ascii="Calibri" w:eastAsia="Calibri" w:hAnsi="Calibri" w:cs="Calibri"/>
-          <w:i/>
-          <w:iCs/>
-          <w:sz w:val="22"/>
-          <w:szCs w:val="22"/>
-          <w:highlight w:val="yellow"/>
-        </w:rPr>
-        <w:t xml:space="preserve"> </w:t>
-      </w:r>
-      <w:r>
-        <w:rPr>
-          <w:rFonts w:ascii="Calibri" w:eastAsia="Calibri" w:hAnsi="Calibri" w:cs="Calibri"/>
-          <w:i/>
-          <w:iCs/>
-          <w:sz w:val="22"/>
-          <w:szCs w:val="22"/>
-          <w:highlight w:val="yellow"/>
-        </w:rPr>
-        <w:t>-</w:t>
-      </w:r>
-      <w:r>
-        <w:rPr>
-          <w:rFonts w:ascii="Calibri" w:eastAsia="Calibri" w:hAnsi="Calibri" w:cs="Calibri"/>
-          <w:i/>
-          <w:iCs/>
-          <w:sz w:val="22"/>
-          <w:szCs w:val="22"/>
-          <w:highlight w:val="yellow"/>
-        </w:rPr>
-        <w:t xml:space="preserve"> Real-time chat between clients and providers.</w:t>
-      </w:r>
-    </w:p>
-    <w:p>
-      <w:pPr>
-        <w:pStyle w:val="ListParagraph"/>
-        <w:numPr>
-          <w:ilvl w:val="0"/>
-          <w:numId w:val="1"/>
-        </w:numPr>
-        <w:spacing w:before="240" w:after="240"/>
-        <w:jc w:val="both"/>
-        <w:rPr>
-          <w:rFonts w:ascii="Calibri" w:eastAsia="Calibri" w:hAnsi="Calibri" w:cs="Calibri"/>
-          <w:sz w:val="22"/>
-          <w:szCs w:val="22"/>
-        </w:rPr>
-      </w:pPr>
-      <w:r>
-        <w:rPr>
-          <w:rFonts w:ascii="Calibri" w:eastAsia="Calibri" w:hAnsi="Calibri" w:cs="Calibri"/>
-          <w:b/>
-          <w:bCs/>
-          <w:sz w:val="22"/>
-          <w:szCs w:val="22"/>
-        </w:rPr>
-        <w:t>Push Notifications</w:t>
-      </w:r>
-      <w:r>
-        <w:rPr>
-          <w:rFonts w:ascii="Calibri" w:eastAsia="Calibri" w:hAnsi="Calibri" w:cs="Calibri"/>
-          <w:sz w:val="22"/>
-          <w:szCs w:val="22"/>
-        </w:rPr>
-        <w:t>:</w:t>
-      </w:r>
-      <w:r>
-        <w:rPr>
-          <w:rFonts w:ascii="Calibri" w:eastAsia="Calibri" w:hAnsi="Calibri" w:cs="Calibri"/>
-          <w:sz w:val="22"/>
-          <w:szCs w:val="22"/>
-        </w:rPr>
-        <w:t xml:space="preserve"> Automated reminders for maintenance and bookings.</w:t>
-      </w:r>
-    </w:p>
-    <w:p>
-      <w:pPr>
-        <w:spacing w:before="240" w:after="240"/>
-        <w:jc w:val="both"/>
-        <w:rPr>
-          <w:rFonts w:ascii="Calibri" w:eastAsia="Calibri" w:hAnsi="Calibri" w:cs="Calibri"/>
-          <w:sz w:val="22"/>
-          <w:szCs w:val="22"/>
-        </w:rPr>
-      </w:pPr>
-    </w:p>
-    <w:p>
-      <w:r>
-        <w:t xml:space="preserve">Our </w:t>
-      </w:r>
-      <w:r>
-        <w:t xml:space="preserve">database will be designed with </w:t>
-      </w:r>
-      <w:proofErr w:type="gramStart"/>
-      <w:r>
-        <w:t>a 14 interrelated tables</w:t>
-      </w:r>
-      <w:proofErr w:type="gramEnd"/>
-      <w:r>
-        <w:t xml:space="preserve">, accommodating data for </w:t>
-      </w:r>
-      <w:r>
-        <w:t>pools</w:t>
-      </w:r>
-      <w:r>
-        <w:t>,</w:t>
-      </w:r>
-    </w:p>
-    <w:p>
-      <w:r>
-        <w:t xml:space="preserve">pool maintenance logs, water quality reading, weather data, loadshedding schedule, </w:t>
-      </w:r>
-      <w:r>
-        <w:t>municipal</w:t>
-      </w:r>
-      <w:r>
-        <w:t xml:space="preserve"> </w:t>
-      </w:r>
-      <w:r>
-        <w:t>water</w:t>
-      </w:r>
-      <w:r>
-        <w:t xml:space="preserve"> </w:t>
-      </w:r>
-      <w:r>
-        <w:t>restrictions</w:t>
-      </w:r>
-      <w:r>
-        <w:t xml:space="preserve">, data about the users, their roles, bookings, orders, products, </w:t>
-      </w:r>
-      <w:r>
-        <w:t xml:space="preserve">service providers, </w:t>
-      </w:r>
-      <w:r>
-        <w:t>services offered</w:t>
-      </w:r>
-      <w:r>
-        <w:t xml:space="preserve">, and notification logs. </w:t>
-      </w:r>
-    </w:p>
-    <w:p/>
-    <w:p>
-      <w:r>
-        <w:t xml:space="preserve">A secure login system will be implemented for both customers and service providers. Role-based access control will ensure that each user type only has access to the features relevant to them. This will safeguard sensitive data such as </w:t>
-      </w:r>
-      <w:r>
-        <w:t xml:space="preserve">user information, </w:t>
-      </w:r>
-      <w:r>
-        <w:t>customer addresses, and service histories.</w:t>
-      </w:r>
-    </w:p>
-    <w:p/>
-    <w:p>
-      <w:r>
-        <w:t>The application will feature multiple data capture screens, with each one corresponding to key tables in the database. Examples include booking forms for hiring a service provider, chemical test input forms for tracking water quality, and inventory management forms for pool businesses listing equipment for sale.</w:t>
-      </w:r>
-    </w:p>
-    <w:p/>
-    <w:p>
-      <w:r>
-        <w:t>In addition to basic CRUD (Create, Read, Update, Delete) operations, the application will feature advanced functionalities. These will include integration with external APIs to retrieve real-time weather forecasts and loadshedding schedules. This will enhance usability and make the system more valuable to end-users.</w:t>
-      </w:r>
-    </w:p>
-    <w:p/>
-    <w:p>
-      <w:r>
-        <w:t>A dedicated help and guidance section will be included, offering step-by-step instructions for common pool care tasks, troubleshooting tips, and emergency procedures. This will ensure that users have on-demand access to relevant information, whether they are experienced pool owners or first-time users.</w:t>
-      </w:r>
-    </w:p>
-    <w:p>
-      <w:pPr>
-        <w:spacing w:before="240" w:after="240"/>
-        <w:jc w:val="both"/>
-      </w:pPr>
-      <w:r>
-        <w:rPr>
-          <w:rFonts w:ascii="Calibri" w:eastAsia="Calibri" w:hAnsi="Calibri" w:cs="Calibri"/>
-          <w:sz w:val="22"/>
-          <w:szCs w:val="22"/>
-        </w:rPr>
-        <w:t>This solution will bridge the gap between pool owners and service providers, offering practical tools for self-maintenance while also providing seamless access to professional assistance. By combining user-friendly design, robust functionality, and strategic business partnerships, the application will deliver long-term value to both customer segments.</w:t>
-      </w:r>
-    </w:p>
-    <w:p>
-      <w:pPr>
-        <w:jc w:val="both"/>
-        <w:rPr>
+        <w:rPr>
+          <w:color w:val="4472C4" w:themeColor="accent1"/>
           <w:sz w:val="22"/>
           <w:szCs w:val="22"/>
         </w:rPr>
@@ -3249,25 +1903,7 @@
           <w:sz w:val="22"/>
           <w:szCs w:val="22"/>
         </w:rPr>
-        <w:t xml:space="preserve">The goal of this section (and document as a whole) is for you (and the reader) to think about what tasks/steps your system development will entail and </w:t>
-      </w:r>
-      <w:proofErr w:type="gramStart"/>
-      <w:r>
-        <w:rPr>
-          <w:color w:val="4472C4" w:themeColor="accent1"/>
-          <w:sz w:val="22"/>
-          <w:szCs w:val="22"/>
-        </w:rPr>
-        <w:t>whether or not</w:t>
-      </w:r>
-      <w:proofErr w:type="gramEnd"/>
-      <w:r>
-        <w:rPr>
-          <w:color w:val="4472C4" w:themeColor="accent1"/>
-          <w:sz w:val="22"/>
-          <w:szCs w:val="22"/>
-        </w:rPr>
-        <w:t xml:space="preserve"> the system will have utility.</w:t>
+        <w:t>The goal of this section (and document as a whole) is for you (and the reader) to think about what tasks/steps your system development will entail and whether or not the system will have utility.</w:t>
       </w:r>
       <w:r>
         <w:rPr>
@@ -3282,6 +1918,7 @@
           <w:color w:val="4472C4" w:themeColor="accent1"/>
           <w:sz w:val="22"/>
           <w:szCs w:val="22"/>
+          <w:highlight w:val="yellow"/>
         </w:rPr>
         <w:t>This section should be between half a page and a full page in length.</w:t>
       </w:r>
@@ -3320,7 +1957,7 @@
 </file>
 
 <file path=word/numbering.xml><?xml version="1.0" encoding="utf-8"?>
-<w:numbering xmlns:wpc="http://schemas.microsoft.com/office/word/2010/wordprocessingCanvas" xmlns:cx="http://schemas.microsoft.com/office/drawing/2014/chartex" xmlns:cx1="http://schemas.microsoft.com/office/drawing/2015/9/8/chartex" xmlns:cx2="http://schemas.microsoft.com/office/drawing/2015/10/21/chartex" xmlns:cx3="http://schemas.microsoft.com/office/drawing/2016/5/9/chartex" xmlns:cx4="http://schemas.microsoft.com/office/drawing/2016/5/10/chartex" xmlns:cx5="http://schemas.microsoft.com/office/drawing/2016/5/11/chartex" xmlns:cx6="http://schemas.microsoft.com/office/drawing/2016/5/12/chartex" xmlns:cx7="http://schemas.microsoft.com/office/drawing/2016/5/13/chartex" xmlns:cx8="http://schemas.microsoft.com/office/drawing/2016/5/14/chartex" xmlns:mc="http://schemas.openxmlformats.org/markup-compatibility/2006" xmlns:aink="http://schemas.microsoft.com/office/drawing/2016/ink" xmlns:am3d="http://schemas.microsoft.com/office/drawing/2017/model3d" xmlns:o="urn:schemas-microsoft-com:office:office" xmlns:oel="http://schemas.microsoft.com/office/2019/extlst" xmlns:r="http://schemas.openxmlformats.org/officeDocument/2006/relationships" xmlns:m="http://schemas.openxmlformats.org/officeDocument/2006/math" xmlns:v="urn:schemas-microsoft-com:vml" xmlns:wp14="http://schemas.microsoft.com/office/word/2010/wordprocessingDrawing" xmlns:wp="http://schemas.openxmlformats.org/drawingml/2006/wordprocessingDrawing" xmlns:w10="urn:schemas-microsoft-com:office:word" xmlns:w="http://schemas.openxmlformats.org/wordprocessingml/2006/main" xmlns:w14="http://schemas.microsoft.com/office/word/2010/wordml" xmlns:w15="http://schemas.microsoft.com/office/word/2012/wordml" xmlns:w16cex="http://schemas.microsoft.com/office/word/2018/wordml/cex" xmlns:w16cid="http://schemas.microsoft.com/office/word/2016/wordml/cid" xmlns:w16="http://schemas.microsoft.com/office/word/2018/wordml" xmlns:w16du="http://schemas.microsoft.com/office/word/2023/wordml/word16du" xmlns:w16sdtdh="http://schemas.microsoft.com/office/word/2020/wordml/sdtdatahash" xmlns:w16sdtfl="http://schemas.microsoft.com/office/word/2024/wordml/sdtformatlock" xmlns:w16se="http://schemas.microsoft.com/office/word/2015/wordml/symex" xmlns:wpg="http://schemas.microsoft.com/office/word/2010/wordprocessingGroup" xmlns:wpi="http://schemas.microsoft.com/office/word/2010/wordprocessingInk" xmlns:wne="http://schemas.microsoft.com/office/word/2006/wordml" xmlns:wps="http://schemas.microsoft.com/office/word/2010/wordprocessingShape" mc:Ignorable="w14 w15 w16se w16cid w16 w16cex w16sdtdh w16sdtfl w16du wp14">
+<w:numbering xmlns:wpc="http://schemas.microsoft.com/office/word/2010/wordprocessingCanvas" xmlns:cx="http://schemas.microsoft.com/office/drawing/2014/chartex" xmlns:cx1="http://schemas.microsoft.com/office/drawing/2015/9/8/chartex" xmlns:cx2="http://schemas.microsoft.com/office/drawing/2015/10/21/chartex" xmlns:cx3="http://schemas.microsoft.com/office/drawing/2016/5/9/chartex" xmlns:cx4="http://schemas.microsoft.com/office/drawing/2016/5/10/chartex" xmlns:cx5="http://schemas.microsoft.com/office/drawing/2016/5/11/chartex" xmlns:cx6="http://schemas.microsoft.com/office/drawing/2016/5/12/chartex" xmlns:cx7="http://schemas.microsoft.com/office/drawing/2016/5/13/chartex" xmlns:cx8="http://schemas.microsoft.com/office/drawing/2016/5/14/chartex" xmlns:mc="http://schemas.openxmlformats.org/markup-compatibility/2006" xmlns:aink="http://schemas.microsoft.com/office/drawing/2016/ink" xmlns:am3d="http://schemas.microsoft.com/office/drawing/2017/model3d" xmlns:o="urn:schemas-microsoft-com:office:office" xmlns:r="http://schemas.openxmlformats.org/officeDocument/2006/relationships" xmlns:m="http://schemas.openxmlformats.org/officeDocument/2006/math" xmlns:v="urn:schemas-microsoft-com:vml" xmlns:wp14="http://schemas.microsoft.com/office/word/2010/wordprocessingDrawing" xmlns:wp="http://schemas.openxmlformats.org/drawingml/2006/wordprocessingDrawing" xmlns:w10="urn:schemas-microsoft-com:office:word" xmlns:w="http://schemas.openxmlformats.org/wordprocessingml/2006/main" xmlns:w14="http://schemas.microsoft.com/office/word/2010/wordml" xmlns:w15="http://schemas.microsoft.com/office/word/2012/wordml" xmlns:w16cid="http://schemas.microsoft.com/office/word/2016/wordml/cid" xmlns:w16se="http://schemas.microsoft.com/office/word/2015/wordml/symex" xmlns:wpg="http://schemas.microsoft.com/office/word/2010/wordprocessingGroup" xmlns:wpi="http://schemas.microsoft.com/office/word/2010/wordprocessingInk" xmlns:wne="http://schemas.microsoft.com/office/word/2006/wordml" xmlns:wps="http://schemas.microsoft.com/office/word/2010/wordprocessingShape" mc:Ignorable="w14 w15 w16se w16cid wp14">
   <w:abstractNum w:abstractNumId="0" w15:restartNumberingAfterBreak="0">
     <w:nsid w:val="03785156"/>
     <w:multiLevelType w:val="multilevel"/>
@@ -3724,6 +2361,155 @@
     </w:lvl>
   </w:abstractNum>
   <w:abstractNum w:abstractNumId="3" w15:restartNumberingAfterBreak="0">
+    <w:nsid w:val="13CC3E57"/>
+    <w:multiLevelType w:val="multilevel"/>
+    <w:tmpl w:val="C256DF20"/>
+    <w:lvl w:ilvl="0">
+      <w:start w:val="1"/>
+      <w:numFmt w:val="bullet"/>
+      <w:lvlText w:val=""/>
+      <w:lvlJc w:val="left"/>
+      <w:pPr>
+        <w:tabs>
+          <w:tab w:val="num" w:pos="720"/>
+        </w:tabs>
+        <w:ind w:left="720" w:hanging="360"/>
+      </w:pPr>
+      <w:rPr>
+        <w:rFonts w:ascii="Symbol" w:hAnsi="Symbol" w:hint="default"/>
+        <w:sz w:val="20"/>
+      </w:rPr>
+    </w:lvl>
+    <w:lvl w:ilvl="1" w:tentative="1">
+      <w:start w:val="1"/>
+      <w:numFmt w:val="bullet"/>
+      <w:lvlText w:val="o"/>
+      <w:lvlJc w:val="left"/>
+      <w:pPr>
+        <w:tabs>
+          <w:tab w:val="num" w:pos="1440"/>
+        </w:tabs>
+        <w:ind w:left="1440" w:hanging="360"/>
+      </w:pPr>
+      <w:rPr>
+        <w:rFonts w:ascii="Courier New" w:hAnsi="Courier New" w:hint="default"/>
+        <w:sz w:val="20"/>
+      </w:rPr>
+    </w:lvl>
+    <w:lvl w:ilvl="2" w:tentative="1">
+      <w:start w:val="1"/>
+      <w:numFmt w:val="bullet"/>
+      <w:lvlText w:val=""/>
+      <w:lvlJc w:val="left"/>
+      <w:pPr>
+        <w:tabs>
+          <w:tab w:val="num" w:pos="2160"/>
+        </w:tabs>
+        <w:ind w:left="2160" w:hanging="360"/>
+      </w:pPr>
+      <w:rPr>
+        <w:rFonts w:ascii="Wingdings" w:hAnsi="Wingdings" w:hint="default"/>
+        <w:sz w:val="20"/>
+      </w:rPr>
+    </w:lvl>
+    <w:lvl w:ilvl="3" w:tentative="1">
+      <w:start w:val="1"/>
+      <w:numFmt w:val="bullet"/>
+      <w:lvlText w:val=""/>
+      <w:lvlJc w:val="left"/>
+      <w:pPr>
+        <w:tabs>
+          <w:tab w:val="num" w:pos="2880"/>
+        </w:tabs>
+        <w:ind w:left="2880" w:hanging="360"/>
+      </w:pPr>
+      <w:rPr>
+        <w:rFonts w:ascii="Wingdings" w:hAnsi="Wingdings" w:hint="default"/>
+        <w:sz w:val="20"/>
+      </w:rPr>
+    </w:lvl>
+    <w:lvl w:ilvl="4" w:tentative="1">
+      <w:start w:val="1"/>
+      <w:numFmt w:val="bullet"/>
+      <w:lvlText w:val=""/>
+      <w:lvlJc w:val="left"/>
+      <w:pPr>
+        <w:tabs>
+          <w:tab w:val="num" w:pos="3600"/>
+        </w:tabs>
+        <w:ind w:left="3600" w:hanging="360"/>
+      </w:pPr>
+      <w:rPr>
+        <w:rFonts w:ascii="Wingdings" w:hAnsi="Wingdings" w:hint="default"/>
+        <w:sz w:val="20"/>
+      </w:rPr>
+    </w:lvl>
+    <w:lvl w:ilvl="5" w:tentative="1">
+      <w:start w:val="1"/>
+      <w:numFmt w:val="bullet"/>
+      <w:lvlText w:val=""/>
+      <w:lvlJc w:val="left"/>
+      <w:pPr>
+        <w:tabs>
+          <w:tab w:val="num" w:pos="4320"/>
+        </w:tabs>
+        <w:ind w:left="4320" w:hanging="360"/>
+      </w:pPr>
+      <w:rPr>
+        <w:rFonts w:ascii="Wingdings" w:hAnsi="Wingdings" w:hint="default"/>
+        <w:sz w:val="20"/>
+      </w:rPr>
+    </w:lvl>
+    <w:lvl w:ilvl="6" w:tentative="1">
+      <w:start w:val="1"/>
+      <w:numFmt w:val="bullet"/>
+      <w:lvlText w:val=""/>
+      <w:lvlJc w:val="left"/>
+      <w:pPr>
+        <w:tabs>
+          <w:tab w:val="num" w:pos="5040"/>
+        </w:tabs>
+        <w:ind w:left="5040" w:hanging="360"/>
+      </w:pPr>
+      <w:rPr>
+        <w:rFonts w:ascii="Wingdings" w:hAnsi="Wingdings" w:hint="default"/>
+        <w:sz w:val="20"/>
+      </w:rPr>
+    </w:lvl>
+    <w:lvl w:ilvl="7" w:tentative="1">
+      <w:start w:val="1"/>
+      <w:numFmt w:val="bullet"/>
+      <w:lvlText w:val=""/>
+      <w:lvlJc w:val="left"/>
+      <w:pPr>
+        <w:tabs>
+          <w:tab w:val="num" w:pos="5760"/>
+        </w:tabs>
+        <w:ind w:left="5760" w:hanging="360"/>
+      </w:pPr>
+      <w:rPr>
+        <w:rFonts w:ascii="Wingdings" w:hAnsi="Wingdings" w:hint="default"/>
+        <w:sz w:val="20"/>
+      </w:rPr>
+    </w:lvl>
+    <w:lvl w:ilvl="8" w:tentative="1">
+      <w:start w:val="1"/>
+      <w:numFmt w:val="bullet"/>
+      <w:lvlText w:val=""/>
+      <w:lvlJc w:val="left"/>
+      <w:pPr>
+        <w:tabs>
+          <w:tab w:val="num" w:pos="6480"/>
+        </w:tabs>
+        <w:ind w:left="6480" w:hanging="360"/>
+      </w:pPr>
+      <w:rPr>
+        <w:rFonts w:ascii="Wingdings" w:hAnsi="Wingdings" w:hint="default"/>
+        <w:sz w:val="20"/>
+      </w:rPr>
+    </w:lvl>
+  </w:abstractNum>
+  <w:abstractNum w:abstractNumId="4" w15:restartNumberingAfterBreak="0">
     <w:nsid w:val="1A113A18"/>
     <w:multiLevelType w:val="multilevel"/>
     <w:tmpl w:val="EF78751A"/>
@@ -3872,7 +2658,156 @@
       </w:rPr>
     </w:lvl>
   </w:abstractNum>
-  <w:abstractNum w:abstractNumId="4" w15:restartNumberingAfterBreak="0">
+  <w:abstractNum w:abstractNumId="5" w15:restartNumberingAfterBreak="0">
+    <w:nsid w:val="24A21442"/>
+    <w:multiLevelType w:val="multilevel"/>
+    <w:tmpl w:val="D9B47936"/>
+    <w:lvl w:ilvl="0">
+      <w:start w:val="1"/>
+      <w:numFmt w:val="bullet"/>
+      <w:lvlText w:val=""/>
+      <w:lvlJc w:val="left"/>
+      <w:pPr>
+        <w:tabs>
+          <w:tab w:val="num" w:pos="720"/>
+        </w:tabs>
+        <w:ind w:left="720" w:hanging="360"/>
+      </w:pPr>
+      <w:rPr>
+        <w:rFonts w:ascii="Symbol" w:hAnsi="Symbol" w:hint="default"/>
+        <w:sz w:val="20"/>
+      </w:rPr>
+    </w:lvl>
+    <w:lvl w:ilvl="1" w:tentative="1">
+      <w:start w:val="1"/>
+      <w:numFmt w:val="bullet"/>
+      <w:lvlText w:val="o"/>
+      <w:lvlJc w:val="left"/>
+      <w:pPr>
+        <w:tabs>
+          <w:tab w:val="num" w:pos="1440"/>
+        </w:tabs>
+        <w:ind w:left="1440" w:hanging="360"/>
+      </w:pPr>
+      <w:rPr>
+        <w:rFonts w:ascii="Courier New" w:hAnsi="Courier New" w:hint="default"/>
+        <w:sz w:val="20"/>
+      </w:rPr>
+    </w:lvl>
+    <w:lvl w:ilvl="2" w:tentative="1">
+      <w:start w:val="1"/>
+      <w:numFmt w:val="bullet"/>
+      <w:lvlText w:val=""/>
+      <w:lvlJc w:val="left"/>
+      <w:pPr>
+        <w:tabs>
+          <w:tab w:val="num" w:pos="2160"/>
+        </w:tabs>
+        <w:ind w:left="2160" w:hanging="360"/>
+      </w:pPr>
+      <w:rPr>
+        <w:rFonts w:ascii="Wingdings" w:hAnsi="Wingdings" w:hint="default"/>
+        <w:sz w:val="20"/>
+      </w:rPr>
+    </w:lvl>
+    <w:lvl w:ilvl="3" w:tentative="1">
+      <w:start w:val="1"/>
+      <w:numFmt w:val="bullet"/>
+      <w:lvlText w:val=""/>
+      <w:lvlJc w:val="left"/>
+      <w:pPr>
+        <w:tabs>
+          <w:tab w:val="num" w:pos="2880"/>
+        </w:tabs>
+        <w:ind w:left="2880" w:hanging="360"/>
+      </w:pPr>
+      <w:rPr>
+        <w:rFonts w:ascii="Wingdings" w:hAnsi="Wingdings" w:hint="default"/>
+        <w:sz w:val="20"/>
+      </w:rPr>
+    </w:lvl>
+    <w:lvl w:ilvl="4" w:tentative="1">
+      <w:start w:val="1"/>
+      <w:numFmt w:val="bullet"/>
+      <w:lvlText w:val=""/>
+      <w:lvlJc w:val="left"/>
+      <w:pPr>
+        <w:tabs>
+          <w:tab w:val="num" w:pos="3600"/>
+        </w:tabs>
+        <w:ind w:left="3600" w:hanging="360"/>
+      </w:pPr>
+      <w:rPr>
+        <w:rFonts w:ascii="Wingdings" w:hAnsi="Wingdings" w:hint="default"/>
+        <w:sz w:val="20"/>
+      </w:rPr>
+    </w:lvl>
+    <w:lvl w:ilvl="5" w:tentative="1">
+      <w:start w:val="1"/>
+      <w:numFmt w:val="bullet"/>
+      <w:lvlText w:val=""/>
+      <w:lvlJc w:val="left"/>
+      <w:pPr>
+        <w:tabs>
+          <w:tab w:val="num" w:pos="4320"/>
+        </w:tabs>
+        <w:ind w:left="4320" w:hanging="360"/>
+      </w:pPr>
+      <w:rPr>
+        <w:rFonts w:ascii="Wingdings" w:hAnsi="Wingdings" w:hint="default"/>
+        <w:sz w:val="20"/>
+      </w:rPr>
+    </w:lvl>
+    <w:lvl w:ilvl="6" w:tentative="1">
+      <w:start w:val="1"/>
+      <w:numFmt w:val="bullet"/>
+      <w:lvlText w:val=""/>
+      <w:lvlJc w:val="left"/>
+      <w:pPr>
+        <w:tabs>
+          <w:tab w:val="num" w:pos="5040"/>
+        </w:tabs>
+        <w:ind w:left="5040" w:hanging="360"/>
+      </w:pPr>
+      <w:rPr>
+        <w:rFonts w:ascii="Wingdings" w:hAnsi="Wingdings" w:hint="default"/>
+        <w:sz w:val="20"/>
+      </w:rPr>
+    </w:lvl>
+    <w:lvl w:ilvl="7" w:tentative="1">
+      <w:start w:val="1"/>
+      <w:numFmt w:val="bullet"/>
+      <w:lvlText w:val=""/>
+      <w:lvlJc w:val="left"/>
+      <w:pPr>
+        <w:tabs>
+          <w:tab w:val="num" w:pos="5760"/>
+        </w:tabs>
+        <w:ind w:left="5760" w:hanging="360"/>
+      </w:pPr>
+      <w:rPr>
+        <w:rFonts w:ascii="Wingdings" w:hAnsi="Wingdings" w:hint="default"/>
+        <w:sz w:val="20"/>
+      </w:rPr>
+    </w:lvl>
+    <w:lvl w:ilvl="8" w:tentative="1">
+      <w:start w:val="1"/>
+      <w:numFmt w:val="bullet"/>
+      <w:lvlText w:val=""/>
+      <w:lvlJc w:val="left"/>
+      <w:pPr>
+        <w:tabs>
+          <w:tab w:val="num" w:pos="6480"/>
+        </w:tabs>
+        <w:ind w:left="6480" w:hanging="360"/>
+      </w:pPr>
+      <w:rPr>
+        <w:rFonts w:ascii="Wingdings" w:hAnsi="Wingdings" w:hint="default"/>
+        <w:sz w:val="20"/>
+      </w:rPr>
+    </w:lvl>
+  </w:abstractNum>
+  <w:abstractNum w:abstractNumId="6" w15:restartNumberingAfterBreak="0">
     <w:nsid w:val="2633301C"/>
     <w:multiLevelType w:val="multilevel"/>
     <w:tmpl w:val="B1B2785C"/>
@@ -4021,7 +2956,7 @@
       </w:rPr>
     </w:lvl>
   </w:abstractNum>
-  <w:abstractNum w:abstractNumId="5" w15:restartNumberingAfterBreak="0">
+  <w:abstractNum w:abstractNumId="7" w15:restartNumberingAfterBreak="0">
     <w:nsid w:val="275E6F28"/>
     <w:multiLevelType w:val="multilevel"/>
     <w:tmpl w:val="2362D17A"/>
@@ -4170,7 +3105,7 @@
       </w:rPr>
     </w:lvl>
   </w:abstractNum>
-  <w:abstractNum w:abstractNumId="6" w15:restartNumberingAfterBreak="0">
+  <w:abstractNum w:abstractNumId="8" w15:restartNumberingAfterBreak="0">
     <w:nsid w:val="288A0196"/>
     <w:multiLevelType w:val="multilevel"/>
     <w:tmpl w:val="249CBE04"/>
@@ -4319,7 +3254,7 @@
       </w:rPr>
     </w:lvl>
   </w:abstractNum>
-  <w:abstractNum w:abstractNumId="7" w15:restartNumberingAfterBreak="0">
+  <w:abstractNum w:abstractNumId="9" w15:restartNumberingAfterBreak="0">
     <w:nsid w:val="36AC313F"/>
     <w:multiLevelType w:val="multilevel"/>
     <w:tmpl w:val="FB66432C"/>
@@ -4440,7 +3375,7 @@
       </w:pPr>
     </w:lvl>
   </w:abstractNum>
-  <w:abstractNum w:abstractNumId="8" w15:restartNumberingAfterBreak="0">
+  <w:abstractNum w:abstractNumId="10" w15:restartNumberingAfterBreak="0">
     <w:nsid w:val="3AE3164A"/>
     <w:multiLevelType w:val="hybridMultilevel"/>
     <w:tmpl w:val="8934F52E"/>
@@ -4526,7 +3461,7 @@
       </w:pPr>
     </w:lvl>
   </w:abstractNum>
-  <w:abstractNum w:abstractNumId="9" w15:restartNumberingAfterBreak="0">
+  <w:abstractNum w:abstractNumId="11" w15:restartNumberingAfterBreak="0">
     <w:nsid w:val="3B806103"/>
     <w:multiLevelType w:val="hybridMultilevel"/>
     <w:tmpl w:val="D8024F5E"/>
@@ -4639,7 +3574,156 @@
       </w:rPr>
     </w:lvl>
   </w:abstractNum>
-  <w:abstractNum w:abstractNumId="10" w15:restartNumberingAfterBreak="0">
+  <w:abstractNum w:abstractNumId="12" w15:restartNumberingAfterBreak="0">
+    <w:nsid w:val="43206308"/>
+    <w:multiLevelType w:val="multilevel"/>
+    <w:tmpl w:val="E4540154"/>
+    <w:lvl w:ilvl="0">
+      <w:start w:val="1"/>
+      <w:numFmt w:val="bullet"/>
+      <w:lvlText w:val=""/>
+      <w:lvlJc w:val="left"/>
+      <w:pPr>
+        <w:tabs>
+          <w:tab w:val="num" w:pos="720"/>
+        </w:tabs>
+        <w:ind w:left="720" w:hanging="360"/>
+      </w:pPr>
+      <w:rPr>
+        <w:rFonts w:ascii="Symbol" w:hAnsi="Symbol" w:hint="default"/>
+        <w:sz w:val="20"/>
+      </w:rPr>
+    </w:lvl>
+    <w:lvl w:ilvl="1" w:tentative="1">
+      <w:start w:val="1"/>
+      <w:numFmt w:val="bullet"/>
+      <w:lvlText w:val="o"/>
+      <w:lvlJc w:val="left"/>
+      <w:pPr>
+        <w:tabs>
+          <w:tab w:val="num" w:pos="1440"/>
+        </w:tabs>
+        <w:ind w:left="1440" w:hanging="360"/>
+      </w:pPr>
+      <w:rPr>
+        <w:rFonts w:ascii="Courier New" w:hAnsi="Courier New" w:hint="default"/>
+        <w:sz w:val="20"/>
+      </w:rPr>
+    </w:lvl>
+    <w:lvl w:ilvl="2" w:tentative="1">
+      <w:start w:val="1"/>
+      <w:numFmt w:val="bullet"/>
+      <w:lvlText w:val=""/>
+      <w:lvlJc w:val="left"/>
+      <w:pPr>
+        <w:tabs>
+          <w:tab w:val="num" w:pos="2160"/>
+        </w:tabs>
+        <w:ind w:left="2160" w:hanging="360"/>
+      </w:pPr>
+      <w:rPr>
+        <w:rFonts w:ascii="Wingdings" w:hAnsi="Wingdings" w:hint="default"/>
+        <w:sz w:val="20"/>
+      </w:rPr>
+    </w:lvl>
+    <w:lvl w:ilvl="3" w:tentative="1">
+      <w:start w:val="1"/>
+      <w:numFmt w:val="bullet"/>
+      <w:lvlText w:val=""/>
+      <w:lvlJc w:val="left"/>
+      <w:pPr>
+        <w:tabs>
+          <w:tab w:val="num" w:pos="2880"/>
+        </w:tabs>
+        <w:ind w:left="2880" w:hanging="360"/>
+      </w:pPr>
+      <w:rPr>
+        <w:rFonts w:ascii="Wingdings" w:hAnsi="Wingdings" w:hint="default"/>
+        <w:sz w:val="20"/>
+      </w:rPr>
+    </w:lvl>
+    <w:lvl w:ilvl="4" w:tentative="1">
+      <w:start w:val="1"/>
+      <w:numFmt w:val="bullet"/>
+      <w:lvlText w:val=""/>
+      <w:lvlJc w:val="left"/>
+      <w:pPr>
+        <w:tabs>
+          <w:tab w:val="num" w:pos="3600"/>
+        </w:tabs>
+        <w:ind w:left="3600" w:hanging="360"/>
+      </w:pPr>
+      <w:rPr>
+        <w:rFonts w:ascii="Wingdings" w:hAnsi="Wingdings" w:hint="default"/>
+        <w:sz w:val="20"/>
+      </w:rPr>
+    </w:lvl>
+    <w:lvl w:ilvl="5" w:tentative="1">
+      <w:start w:val="1"/>
+      <w:numFmt w:val="bullet"/>
+      <w:lvlText w:val=""/>
+      <w:lvlJc w:val="left"/>
+      <w:pPr>
+        <w:tabs>
+          <w:tab w:val="num" w:pos="4320"/>
+        </w:tabs>
+        <w:ind w:left="4320" w:hanging="360"/>
+      </w:pPr>
+      <w:rPr>
+        <w:rFonts w:ascii="Wingdings" w:hAnsi="Wingdings" w:hint="default"/>
+        <w:sz w:val="20"/>
+      </w:rPr>
+    </w:lvl>
+    <w:lvl w:ilvl="6" w:tentative="1">
+      <w:start w:val="1"/>
+      <w:numFmt w:val="bullet"/>
+      <w:lvlText w:val=""/>
+      <w:lvlJc w:val="left"/>
+      <w:pPr>
+        <w:tabs>
+          <w:tab w:val="num" w:pos="5040"/>
+        </w:tabs>
+        <w:ind w:left="5040" w:hanging="360"/>
+      </w:pPr>
+      <w:rPr>
+        <w:rFonts w:ascii="Wingdings" w:hAnsi="Wingdings" w:hint="default"/>
+        <w:sz w:val="20"/>
+      </w:rPr>
+    </w:lvl>
+    <w:lvl w:ilvl="7" w:tentative="1">
+      <w:start w:val="1"/>
+      <w:numFmt w:val="bullet"/>
+      <w:lvlText w:val=""/>
+      <w:lvlJc w:val="left"/>
+      <w:pPr>
+        <w:tabs>
+          <w:tab w:val="num" w:pos="5760"/>
+        </w:tabs>
+        <w:ind w:left="5760" w:hanging="360"/>
+      </w:pPr>
+      <w:rPr>
+        <w:rFonts w:ascii="Wingdings" w:hAnsi="Wingdings" w:hint="default"/>
+        <w:sz w:val="20"/>
+      </w:rPr>
+    </w:lvl>
+    <w:lvl w:ilvl="8" w:tentative="1">
+      <w:start w:val="1"/>
+      <w:numFmt w:val="bullet"/>
+      <w:lvlText w:val=""/>
+      <w:lvlJc w:val="left"/>
+      <w:pPr>
+        <w:tabs>
+          <w:tab w:val="num" w:pos="6480"/>
+        </w:tabs>
+        <w:ind w:left="6480" w:hanging="360"/>
+      </w:pPr>
+      <w:rPr>
+        <w:rFonts w:ascii="Wingdings" w:hAnsi="Wingdings" w:hint="default"/>
+        <w:sz w:val="20"/>
+      </w:rPr>
+    </w:lvl>
+  </w:abstractNum>
+  <w:abstractNum w:abstractNumId="13" w15:restartNumberingAfterBreak="0">
     <w:nsid w:val="46061FBD"/>
     <w:multiLevelType w:val="hybridMultilevel"/>
     <w:tmpl w:val="9DFEA306"/>
@@ -4779,7 +3863,7 @@
       </w:rPr>
     </w:lvl>
   </w:abstractNum>
-  <w:abstractNum w:abstractNumId="11" w15:restartNumberingAfterBreak="0">
+  <w:abstractNum w:abstractNumId="14" w15:restartNumberingAfterBreak="0">
     <w:nsid w:val="47A550B0"/>
     <w:multiLevelType w:val="multilevel"/>
     <w:tmpl w:val="470E60D6"/>
@@ -4928,7 +4012,7 @@
       </w:rPr>
     </w:lvl>
   </w:abstractNum>
-  <w:abstractNum w:abstractNumId="12" w15:restartNumberingAfterBreak="0">
+  <w:abstractNum w:abstractNumId="15" w15:restartNumberingAfterBreak="0">
     <w:nsid w:val="59DA50DB"/>
     <w:multiLevelType w:val="multilevel"/>
     <w:tmpl w:val="616618F2"/>
@@ -5077,7 +4161,7 @@
       </w:rPr>
     </w:lvl>
   </w:abstractNum>
-  <w:abstractNum w:abstractNumId="13" w15:restartNumberingAfterBreak="0">
+  <w:abstractNum w:abstractNumId="16" w15:restartNumberingAfterBreak="0">
     <w:nsid w:val="6D580DA5"/>
     <w:multiLevelType w:val="hybridMultilevel"/>
     <w:tmpl w:val="63AC13C8"/>
@@ -5190,7 +4274,120 @@
       </w:rPr>
     </w:lvl>
   </w:abstractNum>
-  <w:abstractNum w:abstractNumId="14" w15:restartNumberingAfterBreak="0">
+  <w:abstractNum w:abstractNumId="17" w15:restartNumberingAfterBreak="0">
+    <w:nsid w:val="6D5D59ED"/>
+    <w:multiLevelType w:val="hybridMultilevel"/>
+    <w:tmpl w:val="4262047C"/>
+    <w:lvl w:ilvl="0" w:tplc="1C090001">
+      <w:start w:val="1"/>
+      <w:numFmt w:val="bullet"/>
+      <w:lvlText w:val=""/>
+      <w:lvlJc w:val="left"/>
+      <w:pPr>
+        <w:ind w:left="720" w:hanging="360"/>
+      </w:pPr>
+      <w:rPr>
+        <w:rFonts w:ascii="Symbol" w:hAnsi="Symbol" w:hint="default"/>
+      </w:rPr>
+    </w:lvl>
+    <w:lvl w:ilvl="1" w:tplc="1C090003" w:tentative="1">
+      <w:start w:val="1"/>
+      <w:numFmt w:val="bullet"/>
+      <w:lvlText w:val="o"/>
+      <w:lvlJc w:val="left"/>
+      <w:pPr>
+        <w:ind w:left="1440" w:hanging="360"/>
+      </w:pPr>
+      <w:rPr>
+        <w:rFonts w:ascii="Courier New" w:hAnsi="Courier New" w:cs="Courier New" w:hint="default"/>
+      </w:rPr>
+    </w:lvl>
+    <w:lvl w:ilvl="2" w:tplc="1C090005" w:tentative="1">
+      <w:start w:val="1"/>
+      <w:numFmt w:val="bullet"/>
+      <w:lvlText w:val=""/>
+      <w:lvlJc w:val="left"/>
+      <w:pPr>
+        <w:ind w:left="2160" w:hanging="360"/>
+      </w:pPr>
+      <w:rPr>
+        <w:rFonts w:ascii="Wingdings" w:hAnsi="Wingdings" w:hint="default"/>
+      </w:rPr>
+    </w:lvl>
+    <w:lvl w:ilvl="3" w:tplc="1C090001" w:tentative="1">
+      <w:start w:val="1"/>
+      <w:numFmt w:val="bullet"/>
+      <w:lvlText w:val=""/>
+      <w:lvlJc w:val="left"/>
+      <w:pPr>
+        <w:ind w:left="2880" w:hanging="360"/>
+      </w:pPr>
+      <w:rPr>
+        <w:rFonts w:ascii="Symbol" w:hAnsi="Symbol" w:hint="default"/>
+      </w:rPr>
+    </w:lvl>
+    <w:lvl w:ilvl="4" w:tplc="1C090003" w:tentative="1">
+      <w:start w:val="1"/>
+      <w:numFmt w:val="bullet"/>
+      <w:lvlText w:val="o"/>
+      <w:lvlJc w:val="left"/>
+      <w:pPr>
+        <w:ind w:left="3600" w:hanging="360"/>
+      </w:pPr>
+      <w:rPr>
+        <w:rFonts w:ascii="Courier New" w:hAnsi="Courier New" w:cs="Courier New" w:hint="default"/>
+      </w:rPr>
+    </w:lvl>
+    <w:lvl w:ilvl="5" w:tplc="1C090005" w:tentative="1">
+      <w:start w:val="1"/>
+      <w:numFmt w:val="bullet"/>
+      <w:lvlText w:val=""/>
+      <w:lvlJc w:val="left"/>
+      <w:pPr>
+        <w:ind w:left="4320" w:hanging="360"/>
+      </w:pPr>
+      <w:rPr>
+        <w:rFonts w:ascii="Wingdings" w:hAnsi="Wingdings" w:hint="default"/>
+      </w:rPr>
+    </w:lvl>
+    <w:lvl w:ilvl="6" w:tplc="1C090001" w:tentative="1">
+      <w:start w:val="1"/>
+      <w:numFmt w:val="bullet"/>
+      <w:lvlText w:val=""/>
+      <w:lvlJc w:val="left"/>
+      <w:pPr>
+        <w:ind w:left="5040" w:hanging="360"/>
+      </w:pPr>
+      <w:rPr>
+        <w:rFonts w:ascii="Symbol" w:hAnsi="Symbol" w:hint="default"/>
+      </w:rPr>
+    </w:lvl>
+    <w:lvl w:ilvl="7" w:tplc="1C090003" w:tentative="1">
+      <w:start w:val="1"/>
+      <w:numFmt w:val="bullet"/>
+      <w:lvlText w:val="o"/>
+      <w:lvlJc w:val="left"/>
+      <w:pPr>
+        <w:ind w:left="5760" w:hanging="360"/>
+      </w:pPr>
+      <w:rPr>
+        <w:rFonts w:ascii="Courier New" w:hAnsi="Courier New" w:cs="Courier New" w:hint="default"/>
+      </w:rPr>
+    </w:lvl>
+    <w:lvl w:ilvl="8" w:tplc="1C090005" w:tentative="1">
+      <w:start w:val="1"/>
+      <w:numFmt w:val="bullet"/>
+      <w:lvlText w:val=""/>
+      <w:lvlJc w:val="left"/>
+      <w:pPr>
+        <w:ind w:left="6480" w:hanging="360"/>
+      </w:pPr>
+      <w:rPr>
+        <w:rFonts w:ascii="Wingdings" w:hAnsi="Wingdings" w:hint="default"/>
+      </w:rPr>
+    </w:lvl>
+  </w:abstractNum>
+  <w:abstractNum w:abstractNumId="18" w15:restartNumberingAfterBreak="0">
     <w:nsid w:val="6D952E44"/>
     <w:multiLevelType w:val="hybridMultilevel"/>
     <w:tmpl w:val="3D4AB7E0"/>
@@ -5303,7 +4500,7 @@
       </w:rPr>
     </w:lvl>
   </w:abstractNum>
-  <w:abstractNum w:abstractNumId="15" w15:restartNumberingAfterBreak="0">
+  <w:abstractNum w:abstractNumId="19" w15:restartNumberingAfterBreak="0">
     <w:nsid w:val="6E271602"/>
     <w:multiLevelType w:val="multilevel"/>
     <w:tmpl w:val="DF4A958E"/>
@@ -5452,7 +4649,7 @@
       </w:rPr>
     </w:lvl>
   </w:abstractNum>
-  <w:abstractNum w:abstractNumId="16" w15:restartNumberingAfterBreak="0">
+  <w:abstractNum w:abstractNumId="20" w15:restartNumberingAfterBreak="0">
     <w:nsid w:val="70C55DCA"/>
     <w:multiLevelType w:val="hybridMultilevel"/>
     <w:tmpl w:val="C706E84C"/>
@@ -5565,7 +4762,7 @@
       </w:rPr>
     </w:lvl>
   </w:abstractNum>
-  <w:abstractNum w:abstractNumId="17" w15:restartNumberingAfterBreak="0">
+  <w:abstractNum w:abstractNumId="21" w15:restartNumberingAfterBreak="0">
     <w:nsid w:val="7786CE91"/>
     <w:multiLevelType w:val="hybridMultilevel"/>
     <w:tmpl w:val="93106542"/>
@@ -5678,7 +4875,7 @@
       </w:rPr>
     </w:lvl>
   </w:abstractNum>
-  <w:abstractNum w:abstractNumId="18" w15:restartNumberingAfterBreak="0">
+  <w:abstractNum w:abstractNumId="22" w15:restartNumberingAfterBreak="0">
     <w:nsid w:val="7D22585A"/>
     <w:multiLevelType w:val="multilevel"/>
     <w:tmpl w:val="607AB8A0"/>
@@ -5827,68 +5024,80 @@
       </w:rPr>
     </w:lvl>
   </w:abstractNum>
-  <w:num w:numId="1" w16cid:durableId="834103662">
+  <w:num w:numId="1">
+    <w:abstractNumId w:val="10"/>
+  </w:num>
+  <w:num w:numId="2">
+    <w:abstractNumId w:val="20"/>
+  </w:num>
+  <w:num w:numId="3">
+    <w:abstractNumId w:val="11"/>
+  </w:num>
+  <w:num w:numId="4">
+    <w:abstractNumId w:val="21"/>
+  </w:num>
+  <w:num w:numId="5">
+    <w:abstractNumId w:val="1"/>
+  </w:num>
+  <w:num w:numId="6">
+    <w:abstractNumId w:val="16"/>
+  </w:num>
+  <w:num w:numId="7">
+    <w:abstractNumId w:val="18"/>
+  </w:num>
+  <w:num w:numId="8">
+    <w:abstractNumId w:val="2"/>
+  </w:num>
+  <w:num w:numId="9">
+    <w:abstractNumId w:val="13"/>
+  </w:num>
+  <w:num w:numId="10">
+    <w:abstractNumId w:val="14"/>
+  </w:num>
+  <w:num w:numId="11">
+    <w:abstractNumId w:val="19"/>
+  </w:num>
+  <w:num w:numId="12">
+    <w:abstractNumId w:val="6"/>
+  </w:num>
+  <w:num w:numId="13">
+    <w:abstractNumId w:val="4"/>
+  </w:num>
+  <w:num w:numId="14">
+    <w:abstractNumId w:val="22"/>
+  </w:num>
+  <w:num w:numId="15">
+    <w:abstractNumId w:val="0"/>
+  </w:num>
+  <w:num w:numId="16">
+    <w:abstractNumId w:val="9"/>
+  </w:num>
+  <w:num w:numId="17">
     <w:abstractNumId w:val="8"/>
   </w:num>
-  <w:num w:numId="2" w16cid:durableId="897473297">
-    <w:abstractNumId w:val="16"/>
-  </w:num>
-  <w:num w:numId="3" w16cid:durableId="311833670">
-    <w:abstractNumId w:val="9"/>
-  </w:num>
-  <w:num w:numId="4" w16cid:durableId="1002900108">
-    <w:abstractNumId w:val="17"/>
-  </w:num>
-  <w:num w:numId="5" w16cid:durableId="999306211">
-    <w:abstractNumId w:val="1"/>
-  </w:num>
-  <w:num w:numId="6" w16cid:durableId="1563716475">
-    <w:abstractNumId w:val="13"/>
-  </w:num>
-  <w:num w:numId="7" w16cid:durableId="2122265226">
-    <w:abstractNumId w:val="14"/>
-  </w:num>
-  <w:num w:numId="8" w16cid:durableId="1293171561">
-    <w:abstractNumId w:val="2"/>
-  </w:num>
-  <w:num w:numId="9" w16cid:durableId="2012637986">
-    <w:abstractNumId w:val="10"/>
-  </w:num>
-  <w:num w:numId="10" w16cid:durableId="943028628">
-    <w:abstractNumId w:val="11"/>
-  </w:num>
-  <w:num w:numId="11" w16cid:durableId="1771049114">
+  <w:num w:numId="18">
     <w:abstractNumId w:val="15"/>
   </w:num>
-  <w:num w:numId="12" w16cid:durableId="2069572691">
-    <w:abstractNumId w:val="4"/>
+  <w:num w:numId="19">
+    <w:abstractNumId w:val="7"/>
   </w:num>
-  <w:num w:numId="13" w16cid:durableId="1717389840">
+  <w:num w:numId="20">
     <w:abstractNumId w:val="3"/>
   </w:num>
-  <w:num w:numId="14" w16cid:durableId="554659396">
-    <w:abstractNumId w:val="18"/>
+  <w:num w:numId="21">
+    <w:abstractNumId w:val="5"/>
   </w:num>
-  <w:num w:numId="15" w16cid:durableId="221404642">
-    <w:abstractNumId w:val="0"/>
-  </w:num>
-  <w:num w:numId="16" w16cid:durableId="661007722">
-    <w:abstractNumId w:val="7"/>
-  </w:num>
-  <w:num w:numId="17" w16cid:durableId="359622520">
-    <w:abstractNumId w:val="6"/>
-  </w:num>
-  <w:num w:numId="18" w16cid:durableId="743255651">
+  <w:num w:numId="22">
     <w:abstractNumId w:val="12"/>
   </w:num>
-  <w:num w:numId="19" w16cid:durableId="1606228943">
-    <w:abstractNumId w:val="5"/>
+  <w:num w:numId="23">
+    <w:abstractNumId w:val="17"/>
   </w:num>
 </w:numbering>
 </file>
 
 <file path=word/styles.xml><?xml version="1.0" encoding="utf-8"?>
-<w:styles xmlns:mc="http://schemas.openxmlformats.org/markup-compatibility/2006" xmlns:r="http://schemas.openxmlformats.org/officeDocument/2006/relationships" xmlns:w="http://schemas.openxmlformats.org/wordprocessingml/2006/main" xmlns:w14="http://schemas.microsoft.com/office/word/2010/wordml" xmlns:w15="http://schemas.microsoft.com/office/word/2012/wordml" xmlns:w16cex="http://schemas.microsoft.com/office/word/2018/wordml/cex" xmlns:w16cid="http://schemas.microsoft.com/office/word/2016/wordml/cid" xmlns:w16="http://schemas.microsoft.com/office/word/2018/wordml" xmlns:w16du="http://schemas.microsoft.com/office/word/2023/wordml/word16du" xmlns:w16sdtdh="http://schemas.microsoft.com/office/word/2020/wordml/sdtdatahash" xmlns:w16sdtfl="http://schemas.microsoft.com/office/word/2024/wordml/sdtformatlock" xmlns:w16se="http://schemas.microsoft.com/office/word/2015/wordml/symex" mc:Ignorable="w14 w15 w16se w16cid w16 w16cex w16sdtdh w16sdtfl w16du">
+<w:styles xmlns:mc="http://schemas.openxmlformats.org/markup-compatibility/2006" xmlns:r="http://schemas.openxmlformats.org/officeDocument/2006/relationships" xmlns:w="http://schemas.openxmlformats.org/wordprocessingml/2006/main" xmlns:w14="http://schemas.microsoft.com/office/word/2010/wordml" xmlns:w15="http://schemas.microsoft.com/office/word/2012/wordml" xmlns:w16cid="http://schemas.microsoft.com/office/word/2016/wordml/cid" xmlns:w16se="http://schemas.microsoft.com/office/word/2015/wordml/symex" mc:Ignorable="w14 w15 w16se w16cid">
   <w:docDefaults>
     <w:rPrDefault>
       <w:rPr>
@@ -5900,7 +5109,7 @@
     </w:rPrDefault>
     <w:pPrDefault/>
   </w:docDefaults>
-  <w:latentStyles w:defLockedState="0" w:defUIPriority="99" w:defSemiHidden="0" w:defUnhideWhenUsed="0" w:defQFormat="0" w:count="376">
+  <w:latentStyles w:defLockedState="0" w:defUIPriority="99" w:defSemiHidden="0" w:defUnhideWhenUsed="0" w:defQFormat="0" w:count="375">
     <w:lsdException w:name="Normal" w:uiPriority="0" w:qFormat="1"/>
     <w:lsdException w:name="heading 1" w:uiPriority="9" w:qFormat="1"/>
     <w:lsdException w:name="heading 2" w:semiHidden="1" w:uiPriority="9" w:unhideWhenUsed="1" w:qFormat="1"/>
@@ -6276,7 +5485,6 @@
     <w:lsdException w:name="Smart Hyperlink" w:semiHidden="1" w:unhideWhenUsed="1"/>
     <w:lsdException w:name="Hashtag" w:semiHidden="1" w:unhideWhenUsed="1"/>
     <w:lsdException w:name="Unresolved Mention" w:semiHidden="1" w:unhideWhenUsed="1"/>
-    <w:lsdException w:name="Smart Link" w:semiHidden="1" w:unhideWhenUsed="1"/>
   </w:latentStyles>
   <w:style w:type="paragraph" w:default="1" w:styleId="Normal">
     <w:name w:val="Normal"/>
@@ -6326,6 +5534,7 @@
   <w:style w:type="character" w:default="1" w:styleId="DefaultParagraphFont">
     <w:name w:val="Default Paragraph Font"/>
     <w:uiPriority w:val="1"/>
+    <w:semiHidden/>
     <w:unhideWhenUsed/>
   </w:style>
   <w:style w:type="table" w:default="1" w:styleId="TableNormal">
@@ -6380,6 +5589,32 @@
     <w:rPr>
       <w:color w:val="0563C1"/>
       <w:u w:val="single"/>
+    </w:rPr>
+  </w:style>
+  <w:style w:type="paragraph" w:styleId="NormalWeb">
+    <w:name w:val="Normal (Web)"/>
+    <w:basedOn w:val="Normal"/>
+    <w:uiPriority w:val="99"/>
+    <w:semiHidden/>
+    <w:unhideWhenUsed/>
+    <w:rsid w:val="000265F2"/>
+    <w:pPr>
+      <w:spacing w:before="100" w:beforeAutospacing="1" w:after="100" w:afterAutospacing="1"/>
+    </w:pPr>
+    <w:rPr>
+      <w:rFonts w:ascii="Times New Roman" w:eastAsia="Times New Roman" w:hAnsi="Times New Roman" w:cs="Times New Roman"/>
+      <w:lang w:eastAsia="en-ZA"/>
+    </w:rPr>
+  </w:style>
+  <w:style w:type="character" w:styleId="Strong">
+    <w:name w:val="Strong"/>
+    <w:basedOn w:val="DefaultParagraphFont"/>
+    <w:uiPriority w:val="22"/>
+    <w:qFormat/>
+    <w:rsid w:val="000265F2"/>
+    <w:rPr>
+      <w:b/>
+      <w:bCs/>
     </w:rPr>
   </w:style>
 </w:styles>

</xml_diff>

<commit_message>
Update Project proposal - Updated, check and review.docx
</commit_message>
<xml_diff>
--- a/Documentation/Project proposal - Updated, check and review.docx
+++ b/Documentation/Project proposal - Updated, check and review.docx
@@ -1,6 +1,6 @@
 
 <file path=word/document.xml><?xml version="1.0" encoding="utf-8"?>
-<w:document xmlns:wpc="http://schemas.microsoft.com/office/word/2010/wordprocessingCanvas" xmlns:cx="http://schemas.microsoft.com/office/drawing/2014/chartex" xmlns:cx1="http://schemas.microsoft.com/office/drawing/2015/9/8/chartex" xmlns:cx2="http://schemas.microsoft.com/office/drawing/2015/10/21/chartex" xmlns:cx3="http://schemas.microsoft.com/office/drawing/2016/5/9/chartex" xmlns:cx4="http://schemas.microsoft.com/office/drawing/2016/5/10/chartex" xmlns:cx5="http://schemas.microsoft.com/office/drawing/2016/5/11/chartex" xmlns:cx6="http://schemas.microsoft.com/office/drawing/2016/5/12/chartex" xmlns:cx7="http://schemas.microsoft.com/office/drawing/2016/5/13/chartex" xmlns:cx8="http://schemas.microsoft.com/office/drawing/2016/5/14/chartex" xmlns:mc="http://schemas.openxmlformats.org/markup-compatibility/2006" xmlns:aink="http://schemas.microsoft.com/office/drawing/2016/ink" xmlns:am3d="http://schemas.microsoft.com/office/drawing/2017/model3d" xmlns:o="urn:schemas-microsoft-com:office:office" xmlns:r="http://schemas.openxmlformats.org/officeDocument/2006/relationships" xmlns:m="http://schemas.openxmlformats.org/officeDocument/2006/math" xmlns:v="urn:schemas-microsoft-com:vml" xmlns:wp14="http://schemas.microsoft.com/office/word/2010/wordprocessingDrawing" xmlns:wp="http://schemas.openxmlformats.org/drawingml/2006/wordprocessingDrawing" xmlns:w10="urn:schemas-microsoft-com:office:word" xmlns:w="http://schemas.openxmlformats.org/wordprocessingml/2006/main" xmlns:w14="http://schemas.microsoft.com/office/word/2010/wordml" xmlns:w15="http://schemas.microsoft.com/office/word/2012/wordml" xmlns:w16cid="http://schemas.microsoft.com/office/word/2016/wordml/cid" xmlns:w16se="http://schemas.microsoft.com/office/word/2015/wordml/symex" xmlns:wpg="http://schemas.microsoft.com/office/word/2010/wordprocessingGroup" xmlns:wpi="http://schemas.microsoft.com/office/word/2010/wordprocessingInk" xmlns:wne="http://schemas.microsoft.com/office/word/2006/wordml" xmlns:wps="http://schemas.microsoft.com/office/word/2010/wordprocessingShape" mc:Ignorable="w14 w15 w16se w16cid wp14">
+<w:document xmlns:wpc="http://schemas.microsoft.com/office/word/2010/wordprocessingCanvas" xmlns:cx="http://schemas.microsoft.com/office/drawing/2014/chartex" xmlns:cx1="http://schemas.microsoft.com/office/drawing/2015/9/8/chartex" xmlns:cx2="http://schemas.microsoft.com/office/drawing/2015/10/21/chartex" xmlns:cx3="http://schemas.microsoft.com/office/drawing/2016/5/9/chartex" xmlns:cx4="http://schemas.microsoft.com/office/drawing/2016/5/10/chartex" xmlns:cx5="http://schemas.microsoft.com/office/drawing/2016/5/11/chartex" xmlns:cx6="http://schemas.microsoft.com/office/drawing/2016/5/12/chartex" xmlns:cx7="http://schemas.microsoft.com/office/drawing/2016/5/13/chartex" xmlns:cx8="http://schemas.microsoft.com/office/drawing/2016/5/14/chartex" xmlns:mc="http://schemas.openxmlformats.org/markup-compatibility/2006" xmlns:aink="http://schemas.microsoft.com/office/drawing/2016/ink" xmlns:am3d="http://schemas.microsoft.com/office/drawing/2017/model3d" xmlns:o="urn:schemas-microsoft-com:office:office" xmlns:oel="http://schemas.microsoft.com/office/2019/extlst" xmlns:r="http://schemas.openxmlformats.org/officeDocument/2006/relationships" xmlns:m="http://schemas.openxmlformats.org/officeDocument/2006/math" xmlns:v="urn:schemas-microsoft-com:vml" xmlns:wp14="http://schemas.microsoft.com/office/word/2010/wordprocessingDrawing" xmlns:wp="http://schemas.openxmlformats.org/drawingml/2006/wordprocessingDrawing" xmlns:w10="urn:schemas-microsoft-com:office:word" xmlns:w="http://schemas.openxmlformats.org/wordprocessingml/2006/main" xmlns:w14="http://schemas.microsoft.com/office/word/2010/wordml" xmlns:w15="http://schemas.microsoft.com/office/word/2012/wordml" xmlns:w16cex="http://schemas.microsoft.com/office/word/2018/wordml/cex" xmlns:w16cid="http://schemas.microsoft.com/office/word/2016/wordml/cid" xmlns:w16="http://schemas.microsoft.com/office/word/2018/wordml" xmlns:w16du="http://schemas.microsoft.com/office/word/2023/wordml/word16du" xmlns:w16sdtdh="http://schemas.microsoft.com/office/word/2020/wordml/sdtdatahash" xmlns:w16sdtfl="http://schemas.microsoft.com/office/word/2024/wordml/sdtformatlock" xmlns:w16se="http://schemas.microsoft.com/office/word/2015/wordml/symex" xmlns:wpg="http://schemas.microsoft.com/office/word/2010/wordprocessingGroup" xmlns:wpi="http://schemas.microsoft.com/office/word/2010/wordprocessingInk" xmlns:wne="http://schemas.microsoft.com/office/word/2006/wordml" xmlns:wps="http://schemas.microsoft.com/office/word/2010/wordprocessingShape" mc:Ignorable="w14 w15 w16se w16cid w16 w16cex w16sdtdh w16sdtfl w16du wp14">
   <w:body>
     <w:p>
       <w:pPr>
@@ -10,13 +10,15 @@
           <w:szCs w:val="44"/>
         </w:rPr>
       </w:pPr>
-      <w:r>
+    </w:p>
+    <w:p>
+      <w:pPr>
+        <w:jc w:val="center"/>
         <w:rPr>
           <w:sz w:val="44"/>
           <w:szCs w:val="44"/>
         </w:rPr>
-        <w:t>Ignore this page for now</w:t>
-      </w:r>
+      </w:pPr>
     </w:p>
     <w:p>
       <w:pPr>
@@ -26,13 +28,15 @@
           <w:szCs w:val="44"/>
         </w:rPr>
       </w:pPr>
-      <w:r>
+    </w:p>
+    <w:p>
+      <w:pPr>
+        <w:jc w:val="center"/>
         <w:rPr>
           <w:sz w:val="44"/>
           <w:szCs w:val="44"/>
         </w:rPr>
-        <w:t>I will be removing the blue paragraphs after we’re done.</w:t>
-      </w:r>
+      </w:pPr>
     </w:p>
     <w:p>
       <w:pPr>
@@ -42,45 +46,110 @@
           <w:szCs w:val="44"/>
         </w:rPr>
       </w:pPr>
-      <w:r>
+    </w:p>
+    <w:p>
+      <w:pPr>
+        <w:jc w:val="center"/>
         <w:rPr>
           <w:sz w:val="44"/>
           <w:szCs w:val="44"/>
         </w:rPr>
-        <w:t>Don’t worry about how it looks now, I will change it when we’re set.</w:t>
-      </w:r>
-      <w:r>
+      </w:pPr>
+    </w:p>
+    <w:p>
+      <w:pPr>
+        <w:jc w:val="center"/>
         <w:rPr>
           <w:sz w:val="44"/>
           <w:szCs w:val="44"/>
         </w:rPr>
-        <w:t xml:space="preserve"> </w:t>
-      </w:r>
-    </w:p>
-    <w:p>
-      <w:pPr>
-        <w:jc w:val="center"/>
+      </w:pPr>
+      <w:r>
         <w:rPr>
           <w:sz w:val="44"/>
           <w:szCs w:val="44"/>
         </w:rPr>
-      </w:pPr>
-      <w:r>
+        <w:t>Project proposal</w:t>
+      </w:r>
+    </w:p>
+    <w:p/>
+    <w:p>
+      <w:pPr>
+        <w:jc w:val="center"/>
+        <w:rPr>
+          <w:sz w:val="72"/>
+          <w:szCs w:val="72"/>
+        </w:rPr>
+      </w:pPr>
+      <w:r>
+        <w:rPr>
+          <w:sz w:val="72"/>
+          <w:szCs w:val="72"/>
+        </w:rPr>
+        <w:t>Splash Screen</w:t>
+      </w:r>
+    </w:p>
+    <w:p>
+      <w:pPr>
+        <w:jc w:val="center"/>
+      </w:pPr>
+    </w:p>
+    <w:p>
+      <w:pPr>
+        <w:jc w:val="center"/>
+      </w:pPr>
+    </w:p>
+    <w:p>
+      <w:pPr>
+        <w:jc w:val="center"/>
+      </w:pPr>
+    </w:p>
+    <w:p>
+      <w:pPr>
+        <w:jc w:val="center"/>
+      </w:pPr>
+    </w:p>
+    <w:p>
+      <w:pPr>
+        <w:jc w:val="center"/>
+      </w:pPr>
+    </w:p>
+    <w:p>
+      <w:pPr>
+        <w:jc w:val="center"/>
+      </w:pPr>
+    </w:p>
+    <w:p>
+      <w:pPr>
+        <w:jc w:val="center"/>
+      </w:pPr>
+    </w:p>
+    <w:p>
+      <w:pPr>
+        <w:jc w:val="center"/>
+      </w:pPr>
+    </w:p>
+    <w:p/>
+    <w:p>
+      <w:pPr>
+        <w:jc w:val="center"/>
+      </w:pPr>
+    </w:p>
+    <w:p>
+      <w:pPr>
+        <w:jc w:val="center"/>
         <w:rPr>
           <w:sz w:val="44"/>
           <w:szCs w:val="44"/>
         </w:rPr>
-        <w:t>Updated Version</w:t>
-      </w:r>
-    </w:p>
-    <w:p>
-      <w:pPr>
-        <w:jc w:val="center"/>
+      </w:pPr>
+      <w:r>
         <w:rPr>
           <w:sz w:val="44"/>
           <w:szCs w:val="44"/>
         </w:rPr>
-      </w:pPr>
+        <w:t>The Ripple Effect</w:t>
+      </w:r>
     </w:p>
     <w:p>
       <w:pPr>
@@ -90,33 +159,45 @@
           <w:szCs w:val="44"/>
         </w:rPr>
       </w:pPr>
-    </w:p>
-    <w:p>
-      <w:pPr>
-        <w:jc w:val="center"/>
+      <w:r>
         <w:rPr>
           <w:sz w:val="44"/>
           <w:szCs w:val="44"/>
         </w:rPr>
-      </w:pPr>
-    </w:p>
-    <w:p>
-      <w:pPr>
-        <w:jc w:val="center"/>
+        <w:t xml:space="preserve">Juanette </w:t>
+      </w:r>
+      <w:proofErr w:type="spellStart"/>
+      <w:r>
         <w:rPr>
           <w:sz w:val="44"/>
           <w:szCs w:val="44"/>
         </w:rPr>
-      </w:pPr>
-    </w:p>
-    <w:p>
-      <w:pPr>
-        <w:jc w:val="center"/>
+        <w:t>Rozaan</w:t>
+      </w:r>
+      <w:proofErr w:type="spellEnd"/>
+      <w:r>
         <w:rPr>
           <w:sz w:val="44"/>
           <w:szCs w:val="44"/>
         </w:rPr>
-      </w:pPr>
+        <w:t xml:space="preserve"> Viljoen </w:t>
+      </w:r>
+    </w:p>
+    <w:p>
+      <w:pPr>
+        <w:jc w:val="center"/>
+        <w:rPr>
+          <w:sz w:val="32"/>
+          <w:szCs w:val="32"/>
+        </w:rPr>
+      </w:pPr>
+      <w:r>
+        <w:rPr>
+          <w:sz w:val="32"/>
+          <w:szCs w:val="32"/>
+        </w:rPr>
+        <w:t>224145312</w:t>
+      </w:r>
     </w:p>
     <w:p>
       <w:pPr>
@@ -131,71 +212,24 @@
           <w:sz w:val="44"/>
           <w:szCs w:val="44"/>
         </w:rPr>
-        <w:t>Project proposal</w:t>
-      </w:r>
-    </w:p>
-    <w:p/>
+        <w:t>Tinotenda Mhedziso</w:t>
+      </w:r>
+    </w:p>
     <w:p>
       <w:pPr>
         <w:jc w:val="center"/>
         <w:rPr>
-          <w:sz w:val="72"/>
-          <w:szCs w:val="72"/>
-        </w:rPr>
-      </w:pPr>
-      <w:r>
-        <w:rPr>
-          <w:sz w:val="72"/>
-          <w:szCs w:val="72"/>
-        </w:rPr>
-        <w:t>Splash Screen</w:t>
-      </w:r>
-    </w:p>
-    <w:p>
-      <w:pPr>
-        <w:jc w:val="center"/>
-      </w:pPr>
-    </w:p>
-    <w:p>
-      <w:pPr>
-        <w:jc w:val="center"/>
-      </w:pPr>
-    </w:p>
-    <w:p>
-      <w:pPr>
-        <w:jc w:val="center"/>
-      </w:pPr>
-    </w:p>
-    <w:p>
-      <w:pPr>
-        <w:jc w:val="center"/>
-      </w:pPr>
-    </w:p>
-    <w:p>
-      <w:pPr>
-        <w:jc w:val="center"/>
-      </w:pPr>
-    </w:p>
-    <w:p>
-      <w:pPr>
-        <w:jc w:val="center"/>
-      </w:pPr>
-    </w:p>
-    <w:p>
-      <w:pPr>
-        <w:jc w:val="center"/>
-      </w:pPr>
-    </w:p>
-    <w:p>
-      <w:pPr>
-        <w:jc w:val="center"/>
-      </w:pPr>
-    </w:p>
-    <w:p/>
-    <w:p>
-      <w:pPr>
-        <w:jc w:val="center"/>
-      </w:pPr>
+          <w:sz w:val="32"/>
+          <w:szCs w:val="32"/>
+        </w:rPr>
+      </w:pPr>
+      <w:r>
+        <w:rPr>
+          <w:sz w:val="32"/>
+          <w:szCs w:val="32"/>
+        </w:rPr>
+        <w:t>227284240</w:t>
+      </w:r>
     </w:p>
     <w:p>
       <w:pPr>
@@ -210,132 +244,24 @@
           <w:sz w:val="44"/>
           <w:szCs w:val="44"/>
         </w:rPr>
-        <w:t>The Ripple Effect</w:t>
-      </w:r>
-    </w:p>
-    <w:p>
-      <w:pPr>
-        <w:jc w:val="center"/>
+        <w:t xml:space="preserve">Line Redpath </w:t>
+      </w:r>
+    </w:p>
+    <w:p>
+      <w:pPr>
         <w:rPr>
           <w:sz w:val="44"/>
           <w:szCs w:val="44"/>
         </w:rPr>
       </w:pPr>
-      <w:proofErr w:type="spellStart"/>
       <w:r>
         <w:rPr>
           <w:sz w:val="44"/>
           <w:szCs w:val="44"/>
         </w:rPr>
-        <w:t>Juanette</w:t>
-      </w:r>
-      <w:proofErr w:type="spellEnd"/>
-      <w:r>
-        <w:rPr>
-          <w:sz w:val="44"/>
-          <w:szCs w:val="44"/>
-        </w:rPr>
-        <w:t xml:space="preserve"> </w:t>
-      </w:r>
-      <w:proofErr w:type="spellStart"/>
-      <w:r>
-        <w:rPr>
-          <w:sz w:val="44"/>
-          <w:szCs w:val="44"/>
-        </w:rPr>
-        <w:t>Rozaan</w:t>
-      </w:r>
-      <w:proofErr w:type="spellEnd"/>
-      <w:r>
-        <w:rPr>
-          <w:sz w:val="44"/>
-          <w:szCs w:val="44"/>
-        </w:rPr>
-        <w:t xml:space="preserve"> Viljoen </w:t>
-      </w:r>
-    </w:p>
-    <w:p>
-      <w:pPr>
-        <w:jc w:val="center"/>
-        <w:rPr>
-          <w:sz w:val="32"/>
-          <w:szCs w:val="32"/>
-        </w:rPr>
-      </w:pPr>
-      <w:r>
-        <w:rPr>
-          <w:sz w:val="32"/>
-          <w:szCs w:val="32"/>
-        </w:rPr>
-        <w:t>224145312</w:t>
-      </w:r>
-    </w:p>
-    <w:p>
-      <w:pPr>
-        <w:jc w:val="center"/>
-        <w:rPr>
-          <w:sz w:val="44"/>
-          <w:szCs w:val="44"/>
-        </w:rPr>
-      </w:pPr>
-      <w:r>
-        <w:rPr>
-          <w:sz w:val="44"/>
-          <w:szCs w:val="44"/>
-        </w:rPr>
-        <w:t>Tinotenda Mhedziso</w:t>
-      </w:r>
-    </w:p>
-    <w:p>
-      <w:pPr>
-        <w:jc w:val="center"/>
-        <w:rPr>
-          <w:sz w:val="32"/>
-          <w:szCs w:val="32"/>
-        </w:rPr>
-      </w:pPr>
-      <w:r>
-        <w:rPr>
-          <w:sz w:val="32"/>
-          <w:szCs w:val="32"/>
-        </w:rPr>
-        <w:t>227284240</w:t>
-      </w:r>
-    </w:p>
-    <w:p>
-      <w:pPr>
-        <w:jc w:val="center"/>
-        <w:rPr>
-          <w:sz w:val="44"/>
-          <w:szCs w:val="44"/>
-        </w:rPr>
-      </w:pPr>
-      <w:r>
-        <w:rPr>
-          <w:sz w:val="44"/>
-          <w:szCs w:val="44"/>
-        </w:rPr>
-        <w:t xml:space="preserve">Line Redpath </w:t>
-      </w:r>
-    </w:p>
-    <w:p>
-      <w:pPr>
-        <w:jc w:val="center"/>
-        <w:rPr>
-          <w:sz w:val="32"/>
-          <w:szCs w:val="32"/>
-        </w:rPr>
-      </w:pPr>
-      <w:r>
-        <w:rPr>
-          <w:sz w:val="32"/>
-          <w:szCs w:val="32"/>
-        </w:rPr>
-        <w:t>224350536</w:t>
-      </w:r>
-    </w:p>
-    <w:p/>
-    <w:p/>
+        <w:br w:type="page"/>
+      </w:r>
+    </w:p>
     <w:p>
       <w:pPr>
         <w:pStyle w:val="Heading1"/>
@@ -354,6 +280,7 @@
           <w:sz w:val="32"/>
           <w:szCs w:val="32"/>
         </w:rPr>
+        <w:lastRenderedPageBreak/>
         <w:t>Pro</w:t>
       </w:r>
       <w:r>
@@ -398,17 +325,9 @@
     </w:p>
     <w:p>
       <w:pPr>
-        <w:spacing w:before="100" w:beforeAutospacing="1" w:after="100" w:afterAutospacing="1"/>
-        <w:rPr>
-          <w:rFonts w:asciiTheme="majorHAnsi" w:eastAsia="Times New Roman" w:hAnsiTheme="majorHAnsi" w:cstheme="majorHAnsi"/>
-          <w:lang w:eastAsia="en-ZA"/>
-        </w:rPr>
-      </w:pPr>
-      <w:r>
-        <w:rPr>
-          <w:rFonts w:asciiTheme="majorHAnsi" w:eastAsia="Times New Roman" w:hAnsiTheme="majorHAnsi" w:cstheme="majorHAnsi"/>
-          <w:lang w:eastAsia="en-ZA"/>
-        </w:rPr>
+        <w:pStyle w:val="Style1"/>
+      </w:pPr>
+      <w:r>
         <w:t>Maintenance complexity</w:t>
       </w:r>
     </w:p>
@@ -444,17 +363,9 @@
     </w:p>
     <w:p>
       <w:pPr>
-        <w:spacing w:before="100" w:beforeAutospacing="1" w:after="100" w:afterAutospacing="1"/>
-        <w:rPr>
-          <w:rFonts w:asciiTheme="majorHAnsi" w:eastAsia="Times New Roman" w:hAnsiTheme="majorHAnsi" w:cstheme="majorHAnsi"/>
-          <w:lang w:eastAsia="en-ZA"/>
-        </w:rPr>
-      </w:pPr>
-      <w:r>
-        <w:rPr>
-          <w:rFonts w:asciiTheme="majorHAnsi" w:eastAsia="Times New Roman" w:hAnsiTheme="majorHAnsi" w:cstheme="majorHAnsi"/>
-          <w:lang w:eastAsia="en-ZA"/>
-        </w:rPr>
+        <w:pStyle w:val="Style1"/>
+      </w:pPr>
+      <w:r>
         <w:t>Time Constraints</w:t>
       </w:r>
     </w:p>
@@ -476,17 +387,9 @@
     </w:p>
     <w:p>
       <w:pPr>
-        <w:spacing w:before="100" w:beforeAutospacing="1" w:after="100" w:afterAutospacing="1"/>
-        <w:rPr>
-          <w:rFonts w:asciiTheme="majorHAnsi" w:eastAsia="Times New Roman" w:hAnsiTheme="majorHAnsi" w:cstheme="majorHAnsi"/>
-          <w:lang w:eastAsia="en-ZA"/>
-        </w:rPr>
-      </w:pPr>
-      <w:r>
-        <w:rPr>
-          <w:rFonts w:asciiTheme="majorHAnsi" w:eastAsia="Times New Roman" w:hAnsiTheme="majorHAnsi" w:cstheme="majorHAnsi"/>
-          <w:lang w:eastAsia="en-ZA"/>
-        </w:rPr>
+        <w:pStyle w:val="Style1"/>
+      </w:pPr>
+      <w:r>
         <w:t>Scattered Service Market</w:t>
       </w:r>
     </w:p>
@@ -541,8 +444,6 @@
         </w:rPr>
         <w:t>A solution that combines DIY water quality monitoring, digital maintenance guidance, and a transparent, centralised service marketplace could simultaneously reduce water waste, lower costs, and improve service reliability.</w:t>
       </w:r>
-      <w:bookmarkStart w:id="1" w:name="_GoBack"/>
-      <w:bookmarkEnd w:id="1"/>
     </w:p>
     <w:p>
       <w:pPr>
@@ -554,7 +455,7 @@
           <w:szCs w:val="32"/>
         </w:rPr>
       </w:pPr>
-      <w:bookmarkStart w:id="2" w:name="_Toc1126977357"/>
+      <w:bookmarkStart w:id="1" w:name="_Toc1126977357"/>
       <w:r>
         <w:rPr>
           <w:b/>
@@ -565,7 +466,7 @@
         <w:lastRenderedPageBreak/>
         <w:t>Proposed solution</w:t>
       </w:r>
-      <w:bookmarkEnd w:id="2"/>
+      <w:bookmarkEnd w:id="1"/>
     </w:p>
     <w:p>
       <w:pPr>
@@ -591,21 +492,7 @@
         <w:rPr>
           <w:rFonts w:asciiTheme="minorHAnsi" w:hAnsiTheme="minorHAnsi" w:cstheme="minorHAnsi"/>
         </w:rPr>
-        <w:t xml:space="preserve">, is a mobile application developed in Java using Android Studio, with Firebase </w:t>
-      </w:r>
-      <w:proofErr w:type="spellStart"/>
-      <w:r>
-        <w:rPr>
-          <w:rFonts w:asciiTheme="minorHAnsi" w:hAnsiTheme="minorHAnsi" w:cstheme="minorHAnsi"/>
-        </w:rPr>
-        <w:t>Firestore</w:t>
-      </w:r>
-      <w:proofErr w:type="spellEnd"/>
-      <w:r>
-        <w:rPr>
-          <w:rFonts w:asciiTheme="minorHAnsi" w:hAnsiTheme="minorHAnsi" w:cstheme="minorHAnsi"/>
-        </w:rPr>
-        <w:t xml:space="preserve"> as the backend database. It is designed to tackle the core challenges faced by swimming pool owners</w:t>
+        <w:t>, is a mobile application developed in Java using Android Studio, with Firebase Firestore as the backend database. It is designed to tackle the core challenges faced by swimming pool owners</w:t>
       </w:r>
       <w:r>
         <w:rPr>
@@ -641,28 +528,21 @@
     </w:p>
     <w:p>
       <w:pPr>
-        <w:pStyle w:val="NormalWeb"/>
-        <w:rPr>
-          <w:rFonts w:asciiTheme="minorHAnsi" w:hAnsiTheme="minorHAnsi" w:cstheme="minorHAnsi"/>
-        </w:rPr>
-      </w:pPr>
-      <w:r>
-        <w:rPr>
-          <w:rFonts w:asciiTheme="minorHAnsi" w:hAnsiTheme="minorHAnsi" w:cstheme="minorHAnsi"/>
-        </w:rPr>
+        <w:pStyle w:val="Style1"/>
+      </w:pPr>
+      <w:r>
         <w:t xml:space="preserve">For </w:t>
       </w:r>
       <w:r>
         <w:rPr>
           <w:rStyle w:val="Strong"/>
           <w:rFonts w:asciiTheme="minorHAnsi" w:hAnsiTheme="minorHAnsi" w:cstheme="minorHAnsi"/>
+          <w:b w:val="0"/>
+          <w:bCs w:val="0"/>
         </w:rPr>
         <w:t>pool owners</w:t>
       </w:r>
       <w:r>
-        <w:rPr>
-          <w:rFonts w:asciiTheme="minorHAnsi" w:hAnsiTheme="minorHAnsi" w:cstheme="minorHAnsi"/>
-        </w:rPr>
         <w:t>, the app will offer:</w:t>
       </w:r>
     </w:p>
@@ -758,28 +638,21 @@
     </w:p>
     <w:p>
       <w:pPr>
-        <w:pStyle w:val="NormalWeb"/>
-        <w:rPr>
-          <w:rFonts w:asciiTheme="minorHAnsi" w:hAnsiTheme="minorHAnsi" w:cstheme="minorHAnsi"/>
-        </w:rPr>
-      </w:pPr>
-      <w:r>
-        <w:rPr>
-          <w:rFonts w:asciiTheme="minorHAnsi" w:hAnsiTheme="minorHAnsi" w:cstheme="minorHAnsi"/>
-        </w:rPr>
+        <w:pStyle w:val="Style1"/>
+      </w:pPr>
+      <w:r>
         <w:t xml:space="preserve">For </w:t>
       </w:r>
       <w:r>
         <w:rPr>
           <w:rStyle w:val="Strong"/>
           <w:rFonts w:asciiTheme="minorHAnsi" w:hAnsiTheme="minorHAnsi" w:cstheme="minorHAnsi"/>
+          <w:b w:val="0"/>
+          <w:bCs w:val="0"/>
         </w:rPr>
         <w:t>service providers</w:t>
       </w:r>
       <w:r>
-        <w:rPr>
-          <w:rFonts w:asciiTheme="minorHAnsi" w:hAnsiTheme="minorHAnsi" w:cstheme="minorHAnsi"/>
-        </w:rPr>
         <w:t>, it will include:</w:t>
       </w:r>
     </w:p>
@@ -873,78 +746,68 @@
           <w:rStyle w:val="Strong"/>
           <w:rFonts w:asciiTheme="minorHAnsi" w:hAnsiTheme="minorHAnsi" w:cstheme="minorHAnsi"/>
         </w:rPr>
-        <w:t xml:space="preserve">14-table </w:t>
-      </w:r>
-      <w:proofErr w:type="spellStart"/>
+        <w:t>14-table Firestore database</w:t>
+      </w:r>
+      <w:r>
+        <w:rPr>
+          <w:rFonts w:asciiTheme="minorHAnsi" w:hAnsiTheme="minorHAnsi" w:cstheme="minorHAnsi"/>
+        </w:rPr>
+        <w:t xml:space="preserve">, including collections for users, roles, pools, maintenance logs, water readings, providers, bookings, products, weather data, restrictions, and notifications. A secure </w:t>
+      </w:r>
       <w:r>
         <w:rPr>
           <w:rStyle w:val="Strong"/>
           <w:rFonts w:asciiTheme="minorHAnsi" w:hAnsiTheme="minorHAnsi" w:cstheme="minorHAnsi"/>
-        </w:rPr>
-        <w:t>Firestore</w:t>
-      </w:r>
-      <w:proofErr w:type="spellEnd"/>
+          <w:b w:val="0"/>
+        </w:rPr>
+        <w:t>role-based login</w:t>
+      </w:r>
+      <w:r>
+        <w:rPr>
+          <w:rFonts w:asciiTheme="minorHAnsi" w:hAnsiTheme="minorHAnsi" w:cstheme="minorHAnsi"/>
+        </w:rPr>
+        <w:t xml:space="preserve"> will ensure users only see functions relevant to them. The app will integrate </w:t>
+      </w:r>
       <w:r>
         <w:rPr>
           <w:rStyle w:val="Strong"/>
           <w:rFonts w:asciiTheme="minorHAnsi" w:hAnsiTheme="minorHAnsi" w:cstheme="minorHAnsi"/>
-        </w:rPr>
-        <w:t xml:space="preserve"> database</w:t>
-      </w:r>
-      <w:r>
-        <w:rPr>
-          <w:rFonts w:asciiTheme="minorHAnsi" w:hAnsiTheme="minorHAnsi" w:cstheme="minorHAnsi"/>
-        </w:rPr>
-        <w:t xml:space="preserve">, including collections for users, roles, pools, maintenance logs, water readings, providers, bookings, products, weather data, restrictions, and notifications. A secure </w:t>
-      </w:r>
-      <w:r>
+          <w:b w:val="0"/>
+        </w:rPr>
+        <w:t>external APIs</w:t>
+      </w:r>
+      <w:r>
+        <w:rPr>
+          <w:rFonts w:asciiTheme="minorHAnsi" w:hAnsiTheme="minorHAnsi" w:cstheme="minorHAnsi"/>
+        </w:rPr>
+        <w:t xml:space="preserve"> for live weather and load shedding data, generating automated, context-aware recommendations.</w:t>
+      </w:r>
+    </w:p>
+    <w:p>
+      <w:pPr>
+        <w:pStyle w:val="Style1"/>
         <w:rPr>
           <w:rStyle w:val="Strong"/>
           <w:rFonts w:asciiTheme="minorHAnsi" w:hAnsiTheme="minorHAnsi" w:cstheme="minorHAnsi"/>
           <w:b w:val="0"/>
-        </w:rPr>
-        <w:t>role-based login</w:t>
-      </w:r>
-      <w:r>
-        <w:rPr>
-          <w:rFonts w:asciiTheme="minorHAnsi" w:hAnsiTheme="minorHAnsi" w:cstheme="minorHAnsi"/>
-        </w:rPr>
-        <w:t xml:space="preserve"> will ensure users only see functions relevant to them. The app will integrate </w:t>
-      </w:r>
+          <w:bCs w:val="0"/>
+        </w:rPr>
+      </w:pPr>
       <w:r>
         <w:rPr>
           <w:rStyle w:val="Strong"/>
           <w:rFonts w:asciiTheme="minorHAnsi" w:hAnsiTheme="minorHAnsi" w:cstheme="minorHAnsi"/>
           <w:b w:val="0"/>
-        </w:rPr>
-        <w:t>external APIs</w:t>
-      </w:r>
-      <w:r>
-        <w:rPr>
-          <w:rFonts w:asciiTheme="minorHAnsi" w:hAnsiTheme="minorHAnsi" w:cstheme="minorHAnsi"/>
-        </w:rPr>
-        <w:t xml:space="preserve"> for live weather and load shedding data, generating automated, context-aware recommendations.</w:t>
-      </w:r>
-    </w:p>
-    <w:p>
-      <w:pPr>
-        <w:pStyle w:val="NormalWeb"/>
+          <w:bCs w:val="0"/>
+        </w:rPr>
+        <w:t xml:space="preserve">Key Screens </w:t>
+      </w:r>
+      <w:r>
         <w:rPr>
           <w:rStyle w:val="Strong"/>
           <w:rFonts w:asciiTheme="minorHAnsi" w:hAnsiTheme="minorHAnsi" w:cstheme="minorHAnsi"/>
-        </w:rPr>
-      </w:pPr>
-      <w:r>
-        <w:rPr>
-          <w:rStyle w:val="Strong"/>
-          <w:rFonts w:asciiTheme="minorHAnsi" w:hAnsiTheme="minorHAnsi" w:cstheme="minorHAnsi"/>
-        </w:rPr>
-        <w:t xml:space="preserve">Key Screens </w:t>
-      </w:r>
-      <w:r>
-        <w:rPr>
-          <w:rStyle w:val="Strong"/>
-          <w:rFonts w:asciiTheme="minorHAnsi" w:hAnsiTheme="minorHAnsi" w:cstheme="minorHAnsi"/>
+          <w:b w:val="0"/>
+          <w:bCs w:val="0"/>
         </w:rPr>
         <w:t>(Functionality to be extended)</w:t>
       </w:r>
@@ -963,7 +826,8 @@
       <w:r>
         <w:rPr>
           <w:rFonts w:asciiTheme="minorHAnsi" w:hAnsiTheme="minorHAnsi" w:cstheme="minorHAnsi"/>
-          <w:b/>
+          <w:bCs/>
+          <w:u w:val="single"/>
         </w:rPr>
         <w:t>Login</w:t>
       </w:r>
@@ -971,8 +835,19 @@
         <w:rPr>
           <w:rStyle w:val="Strong"/>
           <w:rFonts w:asciiTheme="minorHAnsi" w:hAnsiTheme="minorHAnsi" w:cstheme="minorHAnsi"/>
-        </w:rPr>
-        <w:t xml:space="preserve"> &amp; Registration Screen</w:t>
+          <w:bCs w:val="0"/>
+          <w:u w:val="single"/>
+        </w:rPr>
+        <w:t xml:space="preserve"> </w:t>
+      </w:r>
+      <w:r>
+        <w:rPr>
+          <w:rStyle w:val="Strong"/>
+          <w:rFonts w:asciiTheme="minorHAnsi" w:hAnsiTheme="minorHAnsi" w:cstheme="minorHAnsi"/>
+          <w:b w:val="0"/>
+          <w:u w:val="single"/>
+        </w:rPr>
+        <w:t>&amp; Registration Screen</w:t>
       </w:r>
       <w:r>
         <w:rPr>
@@ -995,7 +870,8 @@
       <w:r>
         <w:rPr>
           <w:rFonts w:asciiTheme="minorHAnsi" w:hAnsiTheme="minorHAnsi" w:cstheme="minorHAnsi"/>
-          <w:b/>
+          <w:bCs/>
+          <w:u w:val="single"/>
         </w:rPr>
         <w:t>Dashboard</w:t>
       </w:r>
@@ -1020,7 +896,8 @@
       <w:r>
         <w:rPr>
           <w:rFonts w:asciiTheme="minorHAnsi" w:hAnsiTheme="minorHAnsi" w:cstheme="minorHAnsi"/>
-          <w:b/>
+          <w:bCs/>
+          <w:u w:val="single"/>
         </w:rPr>
         <w:t>Service</w:t>
       </w:r>
@@ -1028,8 +905,19 @@
         <w:rPr>
           <w:rStyle w:val="Strong"/>
           <w:rFonts w:asciiTheme="minorHAnsi" w:hAnsiTheme="minorHAnsi" w:cstheme="minorHAnsi"/>
-        </w:rPr>
-        <w:t xml:space="preserve"> Booking Screen</w:t>
+          <w:bCs w:val="0"/>
+          <w:u w:val="single"/>
+        </w:rPr>
+        <w:t xml:space="preserve"> </w:t>
+      </w:r>
+      <w:r>
+        <w:rPr>
+          <w:rStyle w:val="Strong"/>
+          <w:rFonts w:asciiTheme="minorHAnsi" w:hAnsiTheme="minorHAnsi" w:cstheme="minorHAnsi"/>
+          <w:b w:val="0"/>
+          <w:u w:val="single"/>
+        </w:rPr>
+        <w:t>Booking Screen</w:t>
       </w:r>
       <w:r>
         <w:rPr>
@@ -1052,7 +940,8 @@
       <w:r>
         <w:rPr>
           <w:rFonts w:asciiTheme="minorHAnsi" w:hAnsiTheme="minorHAnsi" w:cstheme="minorHAnsi"/>
-          <w:b/>
+          <w:bCs/>
+          <w:u w:val="single"/>
         </w:rPr>
         <w:t>Maintenance</w:t>
       </w:r>
@@ -1060,8 +949,19 @@
         <w:rPr>
           <w:rStyle w:val="Strong"/>
           <w:rFonts w:asciiTheme="minorHAnsi" w:hAnsiTheme="minorHAnsi" w:cstheme="minorHAnsi"/>
-        </w:rPr>
-        <w:t xml:space="preserve"> Log Screen</w:t>
+          <w:bCs w:val="0"/>
+          <w:u w:val="single"/>
+        </w:rPr>
+        <w:t xml:space="preserve"> </w:t>
+      </w:r>
+      <w:r>
+        <w:rPr>
+          <w:rStyle w:val="Strong"/>
+          <w:rFonts w:asciiTheme="minorHAnsi" w:hAnsiTheme="minorHAnsi" w:cstheme="minorHAnsi"/>
+          <w:b w:val="0"/>
+          <w:u w:val="single"/>
+        </w:rPr>
+        <w:t>Log Screen</w:t>
       </w:r>
       <w:r>
         <w:rPr>
@@ -1084,7 +984,8 @@
       <w:r>
         <w:rPr>
           <w:rFonts w:asciiTheme="minorHAnsi" w:hAnsiTheme="minorHAnsi" w:cstheme="minorHAnsi"/>
-          <w:b/>
+          <w:bCs/>
+          <w:u w:val="single"/>
         </w:rPr>
         <w:t>Inventory</w:t>
       </w:r>
@@ -1092,8 +993,19 @@
         <w:rPr>
           <w:rStyle w:val="Strong"/>
           <w:rFonts w:asciiTheme="minorHAnsi" w:hAnsiTheme="minorHAnsi" w:cstheme="minorHAnsi"/>
-        </w:rPr>
-        <w:t xml:space="preserve"> Management Screen</w:t>
+          <w:bCs w:val="0"/>
+          <w:u w:val="single"/>
+        </w:rPr>
+        <w:t xml:space="preserve"> </w:t>
+      </w:r>
+      <w:r>
+        <w:rPr>
+          <w:rStyle w:val="Strong"/>
+          <w:rFonts w:asciiTheme="minorHAnsi" w:hAnsiTheme="minorHAnsi" w:cstheme="minorHAnsi"/>
+          <w:b w:val="0"/>
+          <w:u w:val="single"/>
+        </w:rPr>
+        <w:t>Management Screen</w:t>
       </w:r>
       <w:r>
         <w:rPr>
@@ -1116,7 +1028,8 @@
       <w:r>
         <w:rPr>
           <w:rFonts w:asciiTheme="minorHAnsi" w:hAnsiTheme="minorHAnsi" w:cstheme="minorHAnsi"/>
-          <w:b/>
+          <w:bCs/>
+          <w:u w:val="single"/>
         </w:rPr>
         <w:t>Reports</w:t>
       </w:r>
@@ -1124,8 +1037,19 @@
         <w:rPr>
           <w:rStyle w:val="Strong"/>
           <w:rFonts w:asciiTheme="minorHAnsi" w:hAnsiTheme="minorHAnsi" w:cstheme="minorHAnsi"/>
-        </w:rPr>
-        <w:t xml:space="preserve"> Screen</w:t>
+          <w:bCs w:val="0"/>
+          <w:u w:val="single"/>
+        </w:rPr>
+        <w:t xml:space="preserve"> </w:t>
+      </w:r>
+      <w:r>
+        <w:rPr>
+          <w:rStyle w:val="Strong"/>
+          <w:rFonts w:asciiTheme="minorHAnsi" w:hAnsiTheme="minorHAnsi" w:cstheme="minorHAnsi"/>
+          <w:b w:val="0"/>
+          <w:u w:val="single"/>
+        </w:rPr>
+        <w:t>Screen</w:t>
       </w:r>
       <w:r>
         <w:rPr>
@@ -1148,7 +1072,8 @@
       <w:r>
         <w:rPr>
           <w:rFonts w:asciiTheme="minorHAnsi" w:hAnsiTheme="minorHAnsi" w:cstheme="minorHAnsi"/>
-          <w:b/>
+          <w:bCs/>
+          <w:u w:val="single"/>
         </w:rPr>
         <w:t>Help</w:t>
       </w:r>
@@ -1156,13 +1081,26 @@
         <w:rPr>
           <w:rStyle w:val="Strong"/>
           <w:rFonts w:asciiTheme="minorHAnsi" w:hAnsiTheme="minorHAnsi" w:cstheme="minorHAnsi"/>
-        </w:rPr>
-        <w:t xml:space="preserve"> &amp; Support </w:t>
+          <w:bCs w:val="0"/>
+          <w:u w:val="single"/>
+        </w:rPr>
+        <w:t xml:space="preserve"> </w:t>
       </w:r>
       <w:r>
         <w:rPr>
           <w:rStyle w:val="Strong"/>
           <w:rFonts w:asciiTheme="minorHAnsi" w:hAnsiTheme="minorHAnsi" w:cstheme="minorHAnsi"/>
+          <w:b w:val="0"/>
+          <w:u w:val="single"/>
+        </w:rPr>
+        <w:t xml:space="preserve">&amp; Support </w:t>
+      </w:r>
+      <w:r>
+        <w:rPr>
+          <w:rStyle w:val="Strong"/>
+          <w:rFonts w:asciiTheme="minorHAnsi" w:hAnsiTheme="minorHAnsi" w:cstheme="minorHAnsi"/>
+          <w:b w:val="0"/>
+          <w:u w:val="single"/>
         </w:rPr>
         <w:t>Tips</w:t>
       </w:r>
@@ -1188,21 +1126,7 @@
         <w:rPr>
           <w:rStyle w:val="Strong"/>
         </w:rPr>
-        <w:t xml:space="preserve"> </w:t>
-      </w:r>
-      <w:proofErr w:type="gramStart"/>
-      <w:r>
-        <w:rPr>
-          <w:rStyle w:val="Strong"/>
-        </w:rPr>
-        <w:t>The</w:t>
-      </w:r>
-      <w:proofErr w:type="gramEnd"/>
-      <w:r>
-        <w:rPr>
-          <w:rStyle w:val="Strong"/>
-        </w:rPr>
-        <w:t xml:space="preserve"> Ripple Effect</w:t>
+        <w:t xml:space="preserve"> The Ripple Effect</w:t>
       </w:r>
       <w:r>
         <w:t xml:space="preserve">, </w:t>
@@ -1214,734 +1138,115 @@
         <w:t>SplashScreen</w:t>
       </w:r>
       <w:r>
-        <w:t xml:space="preserve"> brings together easy-to-use self-maintenance tools and a trusted services marketplace, designed specifically for the needs of South African pool owners. By tackling challenges like water scarcity, busy schedules, and unreliable service access, it offers a secure</w:t>
-      </w:r>
-      <w:r>
-        <w:t xml:space="preserve"> </w:t>
-      </w:r>
-      <w:r>
-        <w:t>platform backed by GitHub version control and organised through ClickUp project management.</w:t>
-      </w:r>
-    </w:p>
-    <w:p>
-      <w:pPr>
-        <w:jc w:val="both"/>
-      </w:pPr>
-      <w:r>
-        <w:lastRenderedPageBreak/>
-        <w:t>Problem Domain Requirements</w:t>
-      </w:r>
-    </w:p>
-    <w:p>
-      <w:pPr>
-        <w:jc w:val="both"/>
-        <w:rPr>
-          <w:color w:val="4472C4" w:themeColor="accent1"/>
-          <w:sz w:val="22"/>
-          <w:szCs w:val="22"/>
-        </w:rPr>
-      </w:pPr>
-      <w:r>
-        <w:rPr>
-          <w:color w:val="4472C4" w:themeColor="accent1"/>
-          <w:sz w:val="22"/>
-          <w:szCs w:val="22"/>
-        </w:rPr>
-        <w:t>In this section, describe the real-world domain in which your proposed system will be implemented. This could be a description of a specific type of company, business, or real-world activity. Your description should be so detailed that a reader who has never heard of the domain completely understands it, what problem(s) plague it, or what opportunities there are to support/improve it. This should clearly highlight to the user why a system is necessary</w:t>
-      </w:r>
-      <w:r>
-        <w:rPr>
-          <w:color w:val="4472C4" w:themeColor="accent1"/>
-          <w:sz w:val="22"/>
-          <w:szCs w:val="22"/>
-          <w:highlight w:val="yellow"/>
-        </w:rPr>
-        <w:t>. If this section is shorter than half a page, it’s probably too short.</w:t>
-      </w:r>
-    </w:p>
-    <w:p>
-      <w:pPr>
-        <w:jc w:val="both"/>
-      </w:pPr>
-    </w:p>
-    <w:p>
-      <w:pPr>
-        <w:jc w:val="both"/>
-      </w:pPr>
-      <w:r>
-        <w:t>Proposed Solution Requirements</w:t>
-      </w:r>
-    </w:p>
-    <w:p>
-      <w:pPr>
-        <w:rPr>
-          <w:sz w:val="22"/>
-          <w:szCs w:val="22"/>
-        </w:rPr>
-      </w:pPr>
-    </w:p>
-    <w:p>
-      <w:pPr>
-        <w:jc w:val="both"/>
-        <w:rPr>
-          <w:color w:val="4472C4" w:themeColor="accent1"/>
-          <w:sz w:val="22"/>
-          <w:szCs w:val="22"/>
-        </w:rPr>
-      </w:pPr>
-      <w:r>
-        <w:rPr>
-          <w:color w:val="4472C4" w:themeColor="accent1"/>
-          <w:sz w:val="22"/>
-          <w:szCs w:val="22"/>
-        </w:rPr>
-        <w:t xml:space="preserve">In this section, describe the system you plan to develop. Think about </w:t>
-      </w:r>
-    </w:p>
-    <w:p>
-      <w:pPr>
-        <w:jc w:val="both"/>
-        <w:rPr>
-          <w:color w:val="4472C4" w:themeColor="accent1"/>
-          <w:sz w:val="22"/>
-          <w:szCs w:val="22"/>
-        </w:rPr>
-      </w:pPr>
-    </w:p>
-    <w:p>
-      <w:pPr>
-        <w:pStyle w:val="ListParagraph"/>
-        <w:numPr>
-          <w:ilvl w:val="0"/>
-          <w:numId w:val="6"/>
-        </w:numPr>
-        <w:jc w:val="both"/>
-        <w:rPr>
-          <w:color w:val="4472C4" w:themeColor="accent1"/>
-          <w:sz w:val="22"/>
-          <w:szCs w:val="22"/>
-        </w:rPr>
-      </w:pPr>
-      <w:r>
-        <w:rPr>
-          <w:color w:val="4472C4" w:themeColor="accent1"/>
-          <w:sz w:val="22"/>
-          <w:szCs w:val="22"/>
-        </w:rPr>
-        <w:t xml:space="preserve">What should the system do, and how should it do it?  </w:t>
-      </w:r>
-    </w:p>
-    <w:p>
-      <w:pPr>
-        <w:pStyle w:val="ListParagraph"/>
-        <w:numPr>
-          <w:ilvl w:val="0"/>
-          <w:numId w:val="6"/>
-        </w:numPr>
-        <w:jc w:val="both"/>
-        <w:rPr>
-          <w:color w:val="4472C4" w:themeColor="accent1"/>
-          <w:sz w:val="22"/>
-          <w:szCs w:val="22"/>
-        </w:rPr>
-      </w:pPr>
-      <w:r>
-        <w:rPr>
-          <w:color w:val="4472C4" w:themeColor="accent1"/>
-          <w:sz w:val="22"/>
-          <w:szCs w:val="22"/>
-        </w:rPr>
-        <w:t>How would the system improve/support the current domain?</w:t>
-      </w:r>
-    </w:p>
-    <w:p>
-      <w:pPr>
-        <w:pStyle w:val="ListParagraph"/>
-        <w:numPr>
-          <w:ilvl w:val="0"/>
-          <w:numId w:val="6"/>
-        </w:numPr>
-        <w:jc w:val="both"/>
-        <w:rPr>
-          <w:color w:val="4472C4" w:themeColor="accent1"/>
-          <w:sz w:val="22"/>
-          <w:szCs w:val="22"/>
-        </w:rPr>
-      </w:pPr>
-      <w:r>
-        <w:rPr>
-          <w:color w:val="4472C4" w:themeColor="accent1"/>
-          <w:sz w:val="22"/>
-          <w:szCs w:val="22"/>
-        </w:rPr>
-        <w:t xml:space="preserve">Whether it should be desktop-, web- or mobile-based (or even a combination of some of them).  </w:t>
-      </w:r>
-    </w:p>
-    <w:p>
-      <w:pPr>
-        <w:pStyle w:val="ListParagraph"/>
-        <w:numPr>
-          <w:ilvl w:val="0"/>
-          <w:numId w:val="6"/>
-        </w:numPr>
-        <w:jc w:val="both"/>
-        <w:rPr>
-          <w:color w:val="4472C4" w:themeColor="accent1"/>
-          <w:sz w:val="22"/>
-          <w:szCs w:val="22"/>
-        </w:rPr>
-      </w:pPr>
-      <w:r>
-        <w:rPr>
-          <w:color w:val="4472C4" w:themeColor="accent1"/>
-          <w:sz w:val="22"/>
-          <w:szCs w:val="22"/>
-        </w:rPr>
-        <w:t>What technologies do you think you’ll use to develop the system?</w:t>
-      </w:r>
-    </w:p>
-    <w:p>
-      <w:pPr>
-        <w:pStyle w:val="ListParagraph"/>
-        <w:numPr>
-          <w:ilvl w:val="0"/>
-          <w:numId w:val="6"/>
-        </w:numPr>
-        <w:jc w:val="both"/>
-        <w:rPr>
-          <w:color w:val="4472C4" w:themeColor="accent1"/>
-          <w:sz w:val="22"/>
-          <w:szCs w:val="22"/>
-        </w:rPr>
-      </w:pPr>
-      <w:r>
-        <w:rPr>
-          <w:color w:val="4472C4" w:themeColor="accent1"/>
-          <w:sz w:val="22"/>
-          <w:szCs w:val="22"/>
-        </w:rPr>
-        <w:t>A list of all (or at least some of) the screens or system functions you believe the system will need.</w:t>
-      </w:r>
-    </w:p>
-    <w:p>
-      <w:pPr>
-        <w:jc w:val="both"/>
-        <w:rPr>
-          <w:color w:val="4472C4" w:themeColor="accent1"/>
-          <w:sz w:val="22"/>
-          <w:szCs w:val="22"/>
-        </w:rPr>
-      </w:pPr>
-    </w:p>
-    <w:p>
-      <w:pPr>
-        <w:jc w:val="both"/>
-        <w:rPr>
-          <w:color w:val="4472C4" w:themeColor="accent1"/>
-          <w:sz w:val="22"/>
-          <w:szCs w:val="22"/>
-        </w:rPr>
-      </w:pPr>
-      <w:r>
-        <w:rPr>
-          <w:color w:val="4472C4" w:themeColor="accent1"/>
-          <w:sz w:val="22"/>
-          <w:szCs w:val="22"/>
-        </w:rPr>
-        <w:t>When devising your system, keep the following requirements in mind:</w:t>
-      </w:r>
-    </w:p>
-    <w:p>
-      <w:pPr>
-        <w:jc w:val="both"/>
-        <w:rPr>
-          <w:color w:val="4472C4" w:themeColor="accent1"/>
-          <w:sz w:val="22"/>
-          <w:szCs w:val="22"/>
-        </w:rPr>
-      </w:pPr>
-    </w:p>
-    <w:p>
-      <w:pPr>
-        <w:pStyle w:val="ListParagraph"/>
-        <w:numPr>
-          <w:ilvl w:val="0"/>
-          <w:numId w:val="7"/>
-        </w:numPr>
-        <w:jc w:val="both"/>
-        <w:rPr>
-          <w:color w:val="4472C4" w:themeColor="accent1"/>
-          <w:sz w:val="22"/>
-          <w:szCs w:val="22"/>
-        </w:rPr>
-      </w:pPr>
-      <w:r>
-        <w:rPr>
-          <w:color w:val="4472C4" w:themeColor="accent1"/>
-          <w:sz w:val="22"/>
-          <w:szCs w:val="22"/>
-        </w:rPr>
-        <w:t xml:space="preserve">Your system </w:t>
-      </w:r>
-      <w:r>
-        <w:rPr>
-          <w:b/>
-          <w:bCs/>
-          <w:color w:val="4472C4" w:themeColor="accent1"/>
-          <w:sz w:val="22"/>
-          <w:szCs w:val="22"/>
-          <w:u w:val="single"/>
-        </w:rPr>
-        <w:t>must</w:t>
-      </w:r>
-      <w:r>
-        <w:rPr>
-          <w:color w:val="4472C4" w:themeColor="accent1"/>
-          <w:sz w:val="22"/>
-          <w:szCs w:val="22"/>
-        </w:rPr>
-        <w:t xml:space="preserve"> include/be based on a database</w:t>
-      </w:r>
-      <w:r>
-        <w:rPr>
-          <w:color w:val="4472C4" w:themeColor="accent1"/>
-          <w:sz w:val="22"/>
-          <w:szCs w:val="22"/>
-        </w:rPr>
-        <w:t>, regardless</w:t>
-      </w:r>
-      <w:r>
-        <w:rPr>
-          <w:color w:val="4472C4" w:themeColor="accent1"/>
-          <w:sz w:val="22"/>
-          <w:szCs w:val="22"/>
-        </w:rPr>
-        <w:t xml:space="preserve"> of which type of database you choose</w:t>
-      </w:r>
-      <w:r>
-        <w:rPr>
-          <w:color w:val="4472C4" w:themeColor="accent1"/>
-          <w:sz w:val="22"/>
-          <w:szCs w:val="22"/>
-        </w:rPr>
-        <w:t>.</w:t>
-      </w:r>
-      <w:r>
-        <w:rPr>
-          <w:color w:val="4472C4" w:themeColor="accent1"/>
-          <w:sz w:val="22"/>
-          <w:szCs w:val="22"/>
-        </w:rPr>
-        <w:t xml:space="preserve"> </w:t>
-      </w:r>
-      <w:r>
-        <w:rPr>
-          <w:color w:val="4472C4" w:themeColor="accent1"/>
-          <w:sz w:val="22"/>
-          <w:szCs w:val="22"/>
-        </w:rPr>
-        <w:t xml:space="preserve">Groups of two students </w:t>
-      </w:r>
-      <w:r>
-        <w:rPr>
-          <w:color w:val="4472C4" w:themeColor="accent1"/>
-          <w:sz w:val="22"/>
-          <w:szCs w:val="22"/>
-        </w:rPr>
-        <w:t>must</w:t>
-      </w:r>
-      <w:r>
-        <w:rPr>
-          <w:color w:val="4472C4" w:themeColor="accent1"/>
-          <w:sz w:val="22"/>
-          <w:szCs w:val="22"/>
-        </w:rPr>
-        <w:t xml:space="preserve"> have the absolute minimum of the equivalent of </w:t>
-      </w:r>
-      <w:r>
-        <w:rPr>
-          <w:color w:val="4472C4" w:themeColor="accent1"/>
-          <w:sz w:val="22"/>
-          <w:szCs w:val="22"/>
-        </w:rPr>
-        <w:t xml:space="preserve">at least </w:t>
-      </w:r>
-      <w:r>
-        <w:rPr>
-          <w:color w:val="4472C4" w:themeColor="accent1"/>
-          <w:sz w:val="22"/>
-          <w:szCs w:val="22"/>
-        </w:rPr>
-        <w:t>10</w:t>
-      </w:r>
-      <w:r>
-        <w:rPr>
-          <w:color w:val="4472C4" w:themeColor="accent1"/>
-          <w:sz w:val="22"/>
-          <w:szCs w:val="22"/>
-        </w:rPr>
-        <w:t xml:space="preserve"> tables and groups of 3 at least 1</w:t>
-      </w:r>
-      <w:r>
-        <w:rPr>
-          <w:color w:val="4472C4" w:themeColor="accent1"/>
-          <w:sz w:val="22"/>
-          <w:szCs w:val="22"/>
-        </w:rPr>
-        <w:t>4</w:t>
-      </w:r>
-      <w:r>
-        <w:rPr>
-          <w:color w:val="4472C4" w:themeColor="accent1"/>
-          <w:sz w:val="22"/>
-          <w:szCs w:val="22"/>
-        </w:rPr>
-        <w:t>.</w:t>
-      </w:r>
-    </w:p>
-    <w:p>
-      <w:pPr>
-        <w:pStyle w:val="ListParagraph"/>
-        <w:numPr>
-          <w:ilvl w:val="0"/>
-          <w:numId w:val="7"/>
-        </w:numPr>
-        <w:jc w:val="both"/>
-        <w:rPr>
-          <w:color w:val="4472C4" w:themeColor="accent1"/>
-          <w:sz w:val="22"/>
-          <w:szCs w:val="22"/>
-        </w:rPr>
-      </w:pPr>
-      <w:r>
-        <w:rPr>
-          <w:color w:val="4472C4" w:themeColor="accent1"/>
-          <w:sz w:val="22"/>
-          <w:szCs w:val="22"/>
-        </w:rPr>
-        <w:t>A</w:t>
-      </w:r>
-      <w:r>
-        <w:rPr>
-          <w:color w:val="4472C4" w:themeColor="accent1"/>
-          <w:sz w:val="22"/>
-          <w:szCs w:val="22"/>
-        </w:rPr>
-        <w:t xml:space="preserve"> login system</w:t>
-      </w:r>
-      <w:r>
-        <w:rPr>
-          <w:color w:val="4472C4" w:themeColor="accent1"/>
-          <w:sz w:val="22"/>
-          <w:szCs w:val="22"/>
-        </w:rPr>
-        <w:t xml:space="preserve"> will be needed</w:t>
-      </w:r>
-      <w:r>
-        <w:rPr>
-          <w:color w:val="4472C4" w:themeColor="accent1"/>
-          <w:sz w:val="22"/>
-          <w:szCs w:val="22"/>
-        </w:rPr>
-        <w:t>.</w:t>
-      </w:r>
-    </w:p>
-    <w:p>
-      <w:pPr>
-        <w:pStyle w:val="ListParagraph"/>
-        <w:numPr>
-          <w:ilvl w:val="0"/>
-          <w:numId w:val="7"/>
-        </w:numPr>
-        <w:jc w:val="both"/>
-        <w:rPr>
-          <w:color w:val="4472C4" w:themeColor="accent1"/>
-          <w:sz w:val="22"/>
-          <w:szCs w:val="22"/>
-        </w:rPr>
-      </w:pPr>
-      <w:r>
-        <w:rPr>
-          <w:color w:val="4472C4" w:themeColor="accent1"/>
-          <w:sz w:val="22"/>
-          <w:szCs w:val="22"/>
-        </w:rPr>
-        <w:t>It should have multiple input (i.e. data capture) screens.</w:t>
-      </w:r>
-      <w:r>
-        <w:rPr>
-          <w:color w:val="4472C4" w:themeColor="accent1"/>
-          <w:sz w:val="22"/>
-          <w:szCs w:val="22"/>
-        </w:rPr>
-        <w:t xml:space="preserve"> </w:t>
-      </w:r>
-      <w:r>
-        <w:rPr>
-          <w:color w:val="4472C4" w:themeColor="accent1"/>
-          <w:sz w:val="22"/>
-          <w:szCs w:val="22"/>
-        </w:rPr>
-        <w:t>A good rule of thumb for the number of screens/system size is around 1 per database table.</w:t>
-      </w:r>
-    </w:p>
-    <w:p>
-      <w:pPr>
-        <w:pStyle w:val="ListParagraph"/>
-        <w:numPr>
-          <w:ilvl w:val="0"/>
-          <w:numId w:val="7"/>
-        </w:numPr>
-        <w:jc w:val="both"/>
-        <w:rPr>
-          <w:color w:val="4472C4" w:themeColor="accent1"/>
-          <w:sz w:val="22"/>
-          <w:szCs w:val="22"/>
-        </w:rPr>
-      </w:pPr>
-      <w:r>
-        <w:rPr>
-          <w:color w:val="4472C4" w:themeColor="accent1"/>
-          <w:sz w:val="22"/>
-          <w:szCs w:val="22"/>
-        </w:rPr>
-        <w:t xml:space="preserve">It should include at least one interesting feature that isn’t just a simple data capture screen, such as </w:t>
-      </w:r>
-      <w:r>
-        <w:rPr>
-          <w:color w:val="4472C4" w:themeColor="accent1"/>
-          <w:sz w:val="22"/>
-          <w:szCs w:val="22"/>
-        </w:rPr>
-        <w:t>consuming</w:t>
-      </w:r>
-      <w:r>
-        <w:rPr>
-          <w:color w:val="4472C4" w:themeColor="accent1"/>
-          <w:sz w:val="22"/>
-          <w:szCs w:val="22"/>
-        </w:rPr>
-        <w:t xml:space="preserve"> external data</w:t>
-      </w:r>
-      <w:r>
-        <w:rPr>
-          <w:color w:val="4472C4" w:themeColor="accent1"/>
-          <w:sz w:val="22"/>
-          <w:szCs w:val="22"/>
-        </w:rPr>
-        <w:t>/services</w:t>
-      </w:r>
-      <w:r>
-        <w:rPr>
-          <w:color w:val="4472C4" w:themeColor="accent1"/>
-          <w:sz w:val="22"/>
-          <w:szCs w:val="22"/>
-        </w:rPr>
-        <w:t xml:space="preserve"> </w:t>
-      </w:r>
-      <w:r>
-        <w:rPr>
-          <w:color w:val="4472C4" w:themeColor="accent1"/>
-          <w:sz w:val="22"/>
-          <w:szCs w:val="22"/>
-        </w:rPr>
-        <w:t>or</w:t>
-      </w:r>
-      <w:r>
-        <w:rPr>
-          <w:color w:val="4472C4" w:themeColor="accent1"/>
-          <w:sz w:val="22"/>
-          <w:szCs w:val="22"/>
-        </w:rPr>
-        <w:t xml:space="preserve"> </w:t>
-      </w:r>
-      <w:r>
-        <w:rPr>
-          <w:color w:val="4472C4" w:themeColor="accent1"/>
-          <w:sz w:val="22"/>
-          <w:szCs w:val="22"/>
-        </w:rPr>
-        <w:t xml:space="preserve">using </w:t>
-      </w:r>
-      <w:r>
-        <w:rPr>
-          <w:color w:val="4472C4" w:themeColor="accent1"/>
-          <w:sz w:val="22"/>
-          <w:szCs w:val="22"/>
-        </w:rPr>
-        <w:t>built-in device features (such as a camera or GPS).</w:t>
-      </w:r>
-    </w:p>
-    <w:p>
-      <w:pPr>
-        <w:pStyle w:val="ListParagraph"/>
-        <w:numPr>
-          <w:ilvl w:val="0"/>
-          <w:numId w:val="7"/>
-        </w:numPr>
-        <w:jc w:val="both"/>
-        <w:rPr>
-          <w:color w:val="4472C4" w:themeColor="accent1"/>
-          <w:sz w:val="22"/>
-          <w:szCs w:val="22"/>
-        </w:rPr>
-      </w:pPr>
-      <w:r>
-        <w:rPr>
-          <w:color w:val="4472C4" w:themeColor="accent1"/>
-          <w:sz w:val="22"/>
-          <w:szCs w:val="22"/>
-        </w:rPr>
-        <w:t>Be able to generate reports in some or other form.</w:t>
-      </w:r>
-    </w:p>
-    <w:p>
-      <w:pPr>
-        <w:pStyle w:val="ListParagraph"/>
-        <w:numPr>
-          <w:ilvl w:val="0"/>
-          <w:numId w:val="7"/>
-        </w:numPr>
-        <w:jc w:val="both"/>
-        <w:rPr>
-          <w:color w:val="4472C4" w:themeColor="accent1"/>
-          <w:sz w:val="22"/>
-          <w:szCs w:val="22"/>
-        </w:rPr>
-      </w:pPr>
-      <w:r>
-        <w:rPr>
-          <w:color w:val="4472C4" w:themeColor="accent1"/>
-          <w:sz w:val="22"/>
-          <w:szCs w:val="22"/>
-        </w:rPr>
-        <w:t>Have some form of help or guidance available.</w:t>
-      </w:r>
-    </w:p>
-    <w:p>
-      <w:pPr>
-        <w:pStyle w:val="ListParagraph"/>
-        <w:numPr>
-          <w:ilvl w:val="0"/>
-          <w:numId w:val="7"/>
-        </w:numPr>
-        <w:jc w:val="both"/>
-        <w:rPr>
-          <w:color w:val="4472C4" w:themeColor="accent1"/>
-          <w:sz w:val="22"/>
-          <w:szCs w:val="22"/>
-        </w:rPr>
-      </w:pPr>
-      <w:r>
-        <w:rPr>
-          <w:color w:val="4472C4" w:themeColor="accent1"/>
-          <w:sz w:val="22"/>
-          <w:szCs w:val="22"/>
-        </w:rPr>
-        <w:t xml:space="preserve">Incorporate security </w:t>
-      </w:r>
-    </w:p>
-    <w:p>
-      <w:pPr>
-        <w:pStyle w:val="ListParagraph"/>
-        <w:numPr>
-          <w:ilvl w:val="0"/>
-          <w:numId w:val="7"/>
-        </w:numPr>
-        <w:rPr>
-          <w:color w:val="4472C4" w:themeColor="accent1"/>
-          <w:sz w:val="22"/>
-          <w:szCs w:val="22"/>
-        </w:rPr>
-      </w:pPr>
-      <w:r>
-        <w:rPr>
-          <w:color w:val="4472C4" w:themeColor="accent1"/>
-          <w:sz w:val="22"/>
-          <w:szCs w:val="22"/>
-        </w:rPr>
-        <w:t>Be maintained via version control (to which I need access)</w:t>
-      </w:r>
-    </w:p>
-    <w:p>
-      <w:pPr>
-        <w:jc w:val="both"/>
-        <w:rPr>
-          <w:color w:val="4472C4" w:themeColor="accent1"/>
-          <w:sz w:val="22"/>
-          <w:szCs w:val="22"/>
-        </w:rPr>
-      </w:pPr>
-    </w:p>
-    <w:p>
-      <w:pPr>
-        <w:jc w:val="both"/>
-        <w:rPr>
-          <w:sz w:val="22"/>
-          <w:szCs w:val="22"/>
-        </w:rPr>
-      </w:pPr>
-      <w:r>
-        <w:rPr>
-          <w:color w:val="4472C4" w:themeColor="accent1"/>
-          <w:sz w:val="22"/>
-          <w:szCs w:val="22"/>
-        </w:rPr>
-        <w:t>This section doesn’t require in-depth explanations, as all of this will be presented in later documents.</w:t>
-      </w:r>
-      <w:r>
-        <w:rPr>
-          <w:color w:val="4472C4" w:themeColor="accent1"/>
-          <w:sz w:val="22"/>
-          <w:szCs w:val="22"/>
-        </w:rPr>
-        <w:t xml:space="preserve"> </w:t>
-      </w:r>
-      <w:r>
-        <w:rPr>
-          <w:color w:val="4472C4" w:themeColor="accent1"/>
-          <w:sz w:val="22"/>
-          <w:szCs w:val="22"/>
-        </w:rPr>
-        <w:t>The goal of this section (and document as a whole) is for you (and the reader) to think about what tasks/steps your system development will entail and whether or not the system will have utility.</w:t>
-      </w:r>
-      <w:r>
-        <w:rPr>
-          <w:color w:val="4472C4" w:themeColor="accent1"/>
-          <w:sz w:val="22"/>
-          <w:szCs w:val="22"/>
-        </w:rPr>
-        <w:t xml:space="preserve"> </w:t>
-      </w:r>
-      <w:r>
-        <w:rPr>
-          <w:color w:val="4472C4" w:themeColor="accent1"/>
-          <w:sz w:val="22"/>
-          <w:szCs w:val="22"/>
-          <w:highlight w:val="yellow"/>
-        </w:rPr>
-        <w:t>This section should be between half a page and a full page in length.</w:t>
-      </w:r>
-    </w:p>
-    <w:p>
-      <w:pPr>
-        <w:jc w:val="both"/>
-        <w:rPr>
-          <w:sz w:val="22"/>
-          <w:szCs w:val="22"/>
-        </w:rPr>
-      </w:pPr>
-    </w:p>
-    <w:p/>
-    <w:p/>
+        <w:t xml:space="preserve"> brings together easy-to-use self-maintenance tools and a trusted services marketplace, designed specifically for the needs of South African pool owners. By tackling challenges like water scarcity, busy schedules, and unreliable service access, it offers a secure platform backed by GitHub version control and organised through ClickUp project management.</w:t>
+      </w:r>
+    </w:p>
     <w:sectPr>
+      <w:footerReference w:type="default" r:id="rId8"/>
       <w:pgSz w:w="11900" w:h="16840"/>
       <w:pgMar w:top="1440" w:right="1440" w:bottom="1440" w:left="1440" w:header="708" w:footer="708" w:gutter="0"/>
       <w:cols w:space="708"/>
+      <w:titlePg/>
       <w:docGrid w:linePitch="360"/>
     </w:sectPr>
   </w:body>
 </w:document>
+</file>
+
+<file path=word/endnotes.xml><?xml version="1.0" encoding="utf-8"?>
+<w:endnotes xmlns:wpc="http://schemas.microsoft.com/office/word/2010/wordprocessingCanvas" xmlns:cx="http://schemas.microsoft.com/office/drawing/2014/chartex" xmlns:cx1="http://schemas.microsoft.com/office/drawing/2015/9/8/chartex" xmlns:cx2="http://schemas.microsoft.com/office/drawing/2015/10/21/chartex" xmlns:cx3="http://schemas.microsoft.com/office/drawing/2016/5/9/chartex" xmlns:cx4="http://schemas.microsoft.com/office/drawing/2016/5/10/chartex" xmlns:cx5="http://schemas.microsoft.com/office/drawing/2016/5/11/chartex" xmlns:cx6="http://schemas.microsoft.com/office/drawing/2016/5/12/chartex" xmlns:cx7="http://schemas.microsoft.com/office/drawing/2016/5/13/chartex" xmlns:cx8="http://schemas.microsoft.com/office/drawing/2016/5/14/chartex" xmlns:mc="http://schemas.openxmlformats.org/markup-compatibility/2006" xmlns:aink="http://schemas.microsoft.com/office/drawing/2016/ink" xmlns:am3d="http://schemas.microsoft.com/office/drawing/2017/model3d" xmlns:o="urn:schemas-microsoft-com:office:office" xmlns:oel="http://schemas.microsoft.com/office/2019/extlst" xmlns:r="http://schemas.openxmlformats.org/officeDocument/2006/relationships" xmlns:m="http://schemas.openxmlformats.org/officeDocument/2006/math" xmlns:v="urn:schemas-microsoft-com:vml" xmlns:wp14="http://schemas.microsoft.com/office/word/2010/wordprocessingDrawing" xmlns:wp="http://schemas.openxmlformats.org/drawingml/2006/wordprocessingDrawing" xmlns:w10="urn:schemas-microsoft-com:office:word" xmlns:w="http://schemas.openxmlformats.org/wordprocessingml/2006/main" xmlns:w14="http://schemas.microsoft.com/office/word/2010/wordml" xmlns:w15="http://schemas.microsoft.com/office/word/2012/wordml" xmlns:w16cex="http://schemas.microsoft.com/office/word/2018/wordml/cex" xmlns:w16cid="http://schemas.microsoft.com/office/word/2016/wordml/cid" xmlns:w16="http://schemas.microsoft.com/office/word/2018/wordml" xmlns:w16du="http://schemas.microsoft.com/office/word/2023/wordml/word16du" xmlns:w16sdtdh="http://schemas.microsoft.com/office/word/2020/wordml/sdtdatahash" xmlns:w16sdtfl="http://schemas.microsoft.com/office/word/2024/wordml/sdtformatlock" xmlns:w16se="http://schemas.microsoft.com/office/word/2015/wordml/symex" xmlns:wpg="http://schemas.microsoft.com/office/word/2010/wordprocessingGroup" xmlns:wpi="http://schemas.microsoft.com/office/word/2010/wordprocessingInk" xmlns:wne="http://schemas.microsoft.com/office/word/2006/wordml" xmlns:wps="http://schemas.microsoft.com/office/word/2010/wordprocessingShape" mc:Ignorable="w14 w15 w16se w16cid w16 w16cex w16sdtdh w16sdtfl w16du wp14">
+  <w:endnote w:type="separator" w:id="-1">
+    <w:p>
+      <w:r>
+        <w:separator/>
+      </w:r>
+    </w:p>
+  </w:endnote>
+  <w:endnote w:type="continuationSeparator" w:id="0">
+    <w:p>
+      <w:r>
+        <w:continuationSeparator/>
+      </w:r>
+    </w:p>
+  </w:endnote>
+</w:endnotes>
+</file>
+
+<file path=word/footer1.xml><?xml version="1.0" encoding="utf-8"?>
+<w:ftr xmlns:wpc="http://schemas.microsoft.com/office/word/2010/wordprocessingCanvas" xmlns:cx="http://schemas.microsoft.com/office/drawing/2014/chartex" xmlns:cx1="http://schemas.microsoft.com/office/drawing/2015/9/8/chartex" xmlns:cx2="http://schemas.microsoft.com/office/drawing/2015/10/21/chartex" xmlns:cx3="http://schemas.microsoft.com/office/drawing/2016/5/9/chartex" xmlns:cx4="http://schemas.microsoft.com/office/drawing/2016/5/10/chartex" xmlns:cx5="http://schemas.microsoft.com/office/drawing/2016/5/11/chartex" xmlns:cx6="http://schemas.microsoft.com/office/drawing/2016/5/12/chartex" xmlns:cx7="http://schemas.microsoft.com/office/drawing/2016/5/13/chartex" xmlns:cx8="http://schemas.microsoft.com/office/drawing/2016/5/14/chartex" xmlns:mc="http://schemas.openxmlformats.org/markup-compatibility/2006" xmlns:aink="http://schemas.microsoft.com/office/drawing/2016/ink" xmlns:am3d="http://schemas.microsoft.com/office/drawing/2017/model3d" xmlns:o="urn:schemas-microsoft-com:office:office" xmlns:oel="http://schemas.microsoft.com/office/2019/extlst" xmlns:r="http://schemas.openxmlformats.org/officeDocument/2006/relationships" xmlns:m="http://schemas.openxmlformats.org/officeDocument/2006/math" xmlns:v="urn:schemas-microsoft-com:vml" xmlns:wp14="http://schemas.microsoft.com/office/word/2010/wordprocessingDrawing" xmlns:wp="http://schemas.openxmlformats.org/drawingml/2006/wordprocessingDrawing" xmlns:w10="urn:schemas-microsoft-com:office:word" xmlns:w="http://schemas.openxmlformats.org/wordprocessingml/2006/main" xmlns:w14="http://schemas.microsoft.com/office/word/2010/wordml" xmlns:w15="http://schemas.microsoft.com/office/word/2012/wordml" xmlns:w16cex="http://schemas.microsoft.com/office/word/2018/wordml/cex" xmlns:w16cid="http://schemas.microsoft.com/office/word/2016/wordml/cid" xmlns:w16="http://schemas.microsoft.com/office/word/2018/wordml" xmlns:w16du="http://schemas.microsoft.com/office/word/2023/wordml/word16du" xmlns:w16sdtdh="http://schemas.microsoft.com/office/word/2020/wordml/sdtdatahash" xmlns:w16sdtfl="http://schemas.microsoft.com/office/word/2024/wordml/sdtformatlock" xmlns:w16se="http://schemas.microsoft.com/office/word/2015/wordml/symex" xmlns:wpg="http://schemas.microsoft.com/office/word/2010/wordprocessingGroup" xmlns:wpi="http://schemas.microsoft.com/office/word/2010/wordprocessingInk" xmlns:wne="http://schemas.microsoft.com/office/word/2006/wordml" xmlns:wps="http://schemas.microsoft.com/office/word/2010/wordprocessingShape" mc:Ignorable="w14 w15 w16se w16cid w16 w16cex w16sdtdh w16sdtfl w16du wp14">
+  <w:p>
+    <w:pPr>
+      <w:pStyle w:val="Footer"/>
+      <w:jc w:val="center"/>
+      <w:rPr>
+        <w:caps/>
+        <w:noProof/>
+        <w:color w:val="000000" w:themeColor="text1"/>
+      </w:rPr>
+    </w:pPr>
+    <w:r>
+      <w:rPr>
+        <w:caps/>
+        <w:color w:val="000000" w:themeColor="text1"/>
+      </w:rPr>
+      <w:fldChar w:fldCharType="begin"/>
+    </w:r>
+    <w:r>
+      <w:rPr>
+        <w:caps/>
+        <w:color w:val="000000" w:themeColor="text1"/>
+      </w:rPr>
+      <w:instrText xml:space="preserve"> PAGE   \* MERGEFORMAT </w:instrText>
+    </w:r>
+    <w:r>
+      <w:rPr>
+        <w:caps/>
+        <w:color w:val="000000" w:themeColor="text1"/>
+      </w:rPr>
+      <w:fldChar w:fldCharType="separate"/>
+    </w:r>
+    <w:r>
+      <w:rPr>
+        <w:caps/>
+        <w:noProof/>
+        <w:color w:val="000000" w:themeColor="text1"/>
+      </w:rPr>
+      <w:t>2</w:t>
+    </w:r>
+    <w:r>
+      <w:rPr>
+        <w:caps/>
+        <w:noProof/>
+        <w:color w:val="000000" w:themeColor="text1"/>
+      </w:rPr>
+      <w:fldChar w:fldCharType="end"/>
+    </w:r>
+  </w:p>
+  <w:p>
+    <w:pPr>
+      <w:pStyle w:val="Footer"/>
+    </w:pPr>
+  </w:p>
+</w:ftr>
+</file>
+
+<file path=word/footnotes.xml><?xml version="1.0" encoding="utf-8"?>
+<w:footnotes xmlns:wpc="http://schemas.microsoft.com/office/word/2010/wordprocessingCanvas" xmlns:cx="http://schemas.microsoft.com/office/drawing/2014/chartex" xmlns:cx1="http://schemas.microsoft.com/office/drawing/2015/9/8/chartex" xmlns:cx2="http://schemas.microsoft.com/office/drawing/2015/10/21/chartex" xmlns:cx3="http://schemas.microsoft.com/office/drawing/2016/5/9/chartex" xmlns:cx4="http://schemas.microsoft.com/office/drawing/2016/5/10/chartex" xmlns:cx5="http://schemas.microsoft.com/office/drawing/2016/5/11/chartex" xmlns:cx6="http://schemas.microsoft.com/office/drawing/2016/5/12/chartex" xmlns:cx7="http://schemas.microsoft.com/office/drawing/2016/5/13/chartex" xmlns:cx8="http://schemas.microsoft.com/office/drawing/2016/5/14/chartex" xmlns:mc="http://schemas.openxmlformats.org/markup-compatibility/2006" xmlns:aink="http://schemas.microsoft.com/office/drawing/2016/ink" xmlns:am3d="http://schemas.microsoft.com/office/drawing/2017/model3d" xmlns:o="urn:schemas-microsoft-com:office:office" xmlns:oel="http://schemas.microsoft.com/office/2019/extlst" xmlns:r="http://schemas.openxmlformats.org/officeDocument/2006/relationships" xmlns:m="http://schemas.openxmlformats.org/officeDocument/2006/math" xmlns:v="urn:schemas-microsoft-com:vml" xmlns:wp14="http://schemas.microsoft.com/office/word/2010/wordprocessingDrawing" xmlns:wp="http://schemas.openxmlformats.org/drawingml/2006/wordprocessingDrawing" xmlns:w10="urn:schemas-microsoft-com:office:word" xmlns:w="http://schemas.openxmlformats.org/wordprocessingml/2006/main" xmlns:w14="http://schemas.microsoft.com/office/word/2010/wordml" xmlns:w15="http://schemas.microsoft.com/office/word/2012/wordml" xmlns:w16cex="http://schemas.microsoft.com/office/word/2018/wordml/cex" xmlns:w16cid="http://schemas.microsoft.com/office/word/2016/wordml/cid" xmlns:w16="http://schemas.microsoft.com/office/word/2018/wordml" xmlns:w16du="http://schemas.microsoft.com/office/word/2023/wordml/word16du" xmlns:w16sdtdh="http://schemas.microsoft.com/office/word/2020/wordml/sdtdatahash" xmlns:w16sdtfl="http://schemas.microsoft.com/office/word/2024/wordml/sdtformatlock" xmlns:w16se="http://schemas.microsoft.com/office/word/2015/wordml/symex" xmlns:wpg="http://schemas.microsoft.com/office/word/2010/wordprocessingGroup" xmlns:wpi="http://schemas.microsoft.com/office/word/2010/wordprocessingInk" xmlns:wne="http://schemas.microsoft.com/office/word/2006/wordml" xmlns:wps="http://schemas.microsoft.com/office/word/2010/wordprocessingShape" mc:Ignorable="w14 w15 w16se w16cid w16 w16cex w16sdtdh w16sdtfl w16du wp14">
+  <w:footnote w:type="separator" w:id="-1">
+    <w:p>
+      <w:r>
+        <w:separator/>
+      </w:r>
+    </w:p>
+  </w:footnote>
+  <w:footnote w:type="continuationSeparator" w:id="0">
+    <w:p>
+      <w:r>
+        <w:continuationSeparator/>
+      </w:r>
+    </w:p>
+  </w:footnote>
+</w:footnotes>
 </file>
 
 <file path=word/intelligence2.xml><?xml version="1.0" encoding="utf-8"?>
@@ -1957,7 +1262,7 @@
 </file>
 
 <file path=word/numbering.xml><?xml version="1.0" encoding="utf-8"?>
-<w:numbering xmlns:wpc="http://schemas.microsoft.com/office/word/2010/wordprocessingCanvas" xmlns:cx="http://schemas.microsoft.com/office/drawing/2014/chartex" xmlns:cx1="http://schemas.microsoft.com/office/drawing/2015/9/8/chartex" xmlns:cx2="http://schemas.microsoft.com/office/drawing/2015/10/21/chartex" xmlns:cx3="http://schemas.microsoft.com/office/drawing/2016/5/9/chartex" xmlns:cx4="http://schemas.microsoft.com/office/drawing/2016/5/10/chartex" xmlns:cx5="http://schemas.microsoft.com/office/drawing/2016/5/11/chartex" xmlns:cx6="http://schemas.microsoft.com/office/drawing/2016/5/12/chartex" xmlns:cx7="http://schemas.microsoft.com/office/drawing/2016/5/13/chartex" xmlns:cx8="http://schemas.microsoft.com/office/drawing/2016/5/14/chartex" xmlns:mc="http://schemas.openxmlformats.org/markup-compatibility/2006" xmlns:aink="http://schemas.microsoft.com/office/drawing/2016/ink" xmlns:am3d="http://schemas.microsoft.com/office/drawing/2017/model3d" xmlns:o="urn:schemas-microsoft-com:office:office" xmlns:r="http://schemas.openxmlformats.org/officeDocument/2006/relationships" xmlns:m="http://schemas.openxmlformats.org/officeDocument/2006/math" xmlns:v="urn:schemas-microsoft-com:vml" xmlns:wp14="http://schemas.microsoft.com/office/word/2010/wordprocessingDrawing" xmlns:wp="http://schemas.openxmlformats.org/drawingml/2006/wordprocessingDrawing" xmlns:w10="urn:schemas-microsoft-com:office:word" xmlns:w="http://schemas.openxmlformats.org/wordprocessingml/2006/main" xmlns:w14="http://schemas.microsoft.com/office/word/2010/wordml" xmlns:w15="http://schemas.microsoft.com/office/word/2012/wordml" xmlns:w16cid="http://schemas.microsoft.com/office/word/2016/wordml/cid" xmlns:w16se="http://schemas.microsoft.com/office/word/2015/wordml/symex" xmlns:wpg="http://schemas.microsoft.com/office/word/2010/wordprocessingGroup" xmlns:wpi="http://schemas.microsoft.com/office/word/2010/wordprocessingInk" xmlns:wne="http://schemas.microsoft.com/office/word/2006/wordml" xmlns:wps="http://schemas.microsoft.com/office/word/2010/wordprocessingShape" mc:Ignorable="w14 w15 w16se w16cid wp14">
+<w:numbering xmlns:wpc="http://schemas.microsoft.com/office/word/2010/wordprocessingCanvas" xmlns:cx="http://schemas.microsoft.com/office/drawing/2014/chartex" xmlns:cx1="http://schemas.microsoft.com/office/drawing/2015/9/8/chartex" xmlns:cx2="http://schemas.microsoft.com/office/drawing/2015/10/21/chartex" xmlns:cx3="http://schemas.microsoft.com/office/drawing/2016/5/9/chartex" xmlns:cx4="http://schemas.microsoft.com/office/drawing/2016/5/10/chartex" xmlns:cx5="http://schemas.microsoft.com/office/drawing/2016/5/11/chartex" xmlns:cx6="http://schemas.microsoft.com/office/drawing/2016/5/12/chartex" xmlns:cx7="http://schemas.microsoft.com/office/drawing/2016/5/13/chartex" xmlns:cx8="http://schemas.microsoft.com/office/drawing/2016/5/14/chartex" xmlns:mc="http://schemas.openxmlformats.org/markup-compatibility/2006" xmlns:aink="http://schemas.microsoft.com/office/drawing/2016/ink" xmlns:am3d="http://schemas.microsoft.com/office/drawing/2017/model3d" xmlns:o="urn:schemas-microsoft-com:office:office" xmlns:oel="http://schemas.microsoft.com/office/2019/extlst" xmlns:r="http://schemas.openxmlformats.org/officeDocument/2006/relationships" xmlns:m="http://schemas.openxmlformats.org/officeDocument/2006/math" xmlns:v="urn:schemas-microsoft-com:vml" xmlns:wp14="http://schemas.microsoft.com/office/word/2010/wordprocessingDrawing" xmlns:wp="http://schemas.openxmlformats.org/drawingml/2006/wordprocessingDrawing" xmlns:w10="urn:schemas-microsoft-com:office:word" xmlns:w="http://schemas.openxmlformats.org/wordprocessingml/2006/main" xmlns:w14="http://schemas.microsoft.com/office/word/2010/wordml" xmlns:w15="http://schemas.microsoft.com/office/word/2012/wordml" xmlns:w16cex="http://schemas.microsoft.com/office/word/2018/wordml/cex" xmlns:w16cid="http://schemas.microsoft.com/office/word/2016/wordml/cid" xmlns:w16="http://schemas.microsoft.com/office/word/2018/wordml" xmlns:w16du="http://schemas.microsoft.com/office/word/2023/wordml/word16du" xmlns:w16sdtdh="http://schemas.microsoft.com/office/word/2020/wordml/sdtdatahash" xmlns:w16sdtfl="http://schemas.microsoft.com/office/word/2024/wordml/sdtformatlock" xmlns:w16se="http://schemas.microsoft.com/office/word/2015/wordml/symex" xmlns:wpg="http://schemas.microsoft.com/office/word/2010/wordprocessingGroup" xmlns:wpi="http://schemas.microsoft.com/office/word/2010/wordprocessingInk" xmlns:wne="http://schemas.microsoft.com/office/word/2006/wordml" xmlns:wps="http://schemas.microsoft.com/office/word/2010/wordprocessingShape" mc:Ignorable="w14 w15 w16se w16cid w16 w16cex w16sdtdh w16sdtfl w16du wp14">
   <w:abstractNum w:abstractNumId="0" w15:restartNumberingAfterBreak="0">
     <w:nsid w:val="03785156"/>
     <w:multiLevelType w:val="multilevel"/>
@@ -5024,80 +4329,80 @@
       </w:rPr>
     </w:lvl>
   </w:abstractNum>
-  <w:num w:numId="1">
+  <w:num w:numId="1" w16cid:durableId="2036692616">
     <w:abstractNumId w:val="10"/>
   </w:num>
-  <w:num w:numId="2">
+  <w:num w:numId="2" w16cid:durableId="400716382">
     <w:abstractNumId w:val="20"/>
   </w:num>
-  <w:num w:numId="3">
+  <w:num w:numId="3" w16cid:durableId="1558929184">
     <w:abstractNumId w:val="11"/>
   </w:num>
-  <w:num w:numId="4">
+  <w:num w:numId="4" w16cid:durableId="729311184">
     <w:abstractNumId w:val="21"/>
   </w:num>
-  <w:num w:numId="5">
+  <w:num w:numId="5" w16cid:durableId="2056730659">
     <w:abstractNumId w:val="1"/>
   </w:num>
-  <w:num w:numId="6">
+  <w:num w:numId="6" w16cid:durableId="647323269">
     <w:abstractNumId w:val="16"/>
   </w:num>
-  <w:num w:numId="7">
+  <w:num w:numId="7" w16cid:durableId="350450618">
     <w:abstractNumId w:val="18"/>
   </w:num>
-  <w:num w:numId="8">
+  <w:num w:numId="8" w16cid:durableId="1997998199">
     <w:abstractNumId w:val="2"/>
   </w:num>
-  <w:num w:numId="9">
+  <w:num w:numId="9" w16cid:durableId="773407801">
     <w:abstractNumId w:val="13"/>
   </w:num>
-  <w:num w:numId="10">
+  <w:num w:numId="10" w16cid:durableId="1791127879">
     <w:abstractNumId w:val="14"/>
   </w:num>
-  <w:num w:numId="11">
+  <w:num w:numId="11" w16cid:durableId="11031100">
     <w:abstractNumId w:val="19"/>
   </w:num>
-  <w:num w:numId="12">
+  <w:num w:numId="12" w16cid:durableId="1505629163">
     <w:abstractNumId w:val="6"/>
   </w:num>
-  <w:num w:numId="13">
+  <w:num w:numId="13" w16cid:durableId="1148519049">
     <w:abstractNumId w:val="4"/>
   </w:num>
-  <w:num w:numId="14">
+  <w:num w:numId="14" w16cid:durableId="1804152457">
     <w:abstractNumId w:val="22"/>
   </w:num>
-  <w:num w:numId="15">
+  <w:num w:numId="15" w16cid:durableId="212471161">
     <w:abstractNumId w:val="0"/>
   </w:num>
-  <w:num w:numId="16">
+  <w:num w:numId="16" w16cid:durableId="741370595">
     <w:abstractNumId w:val="9"/>
   </w:num>
-  <w:num w:numId="17">
+  <w:num w:numId="17" w16cid:durableId="797409057">
     <w:abstractNumId w:val="8"/>
   </w:num>
-  <w:num w:numId="18">
+  <w:num w:numId="18" w16cid:durableId="183829646">
     <w:abstractNumId w:val="15"/>
   </w:num>
-  <w:num w:numId="19">
+  <w:num w:numId="19" w16cid:durableId="1331133459">
     <w:abstractNumId w:val="7"/>
   </w:num>
-  <w:num w:numId="20">
+  <w:num w:numId="20" w16cid:durableId="1313951860">
     <w:abstractNumId w:val="3"/>
   </w:num>
-  <w:num w:numId="21">
+  <w:num w:numId="21" w16cid:durableId="451096589">
     <w:abstractNumId w:val="5"/>
   </w:num>
-  <w:num w:numId="22">
+  <w:num w:numId="22" w16cid:durableId="1452623984">
     <w:abstractNumId w:val="12"/>
   </w:num>
-  <w:num w:numId="23">
+  <w:num w:numId="23" w16cid:durableId="1807357716">
     <w:abstractNumId w:val="17"/>
   </w:num>
 </w:numbering>
 </file>
 
 <file path=word/styles.xml><?xml version="1.0" encoding="utf-8"?>
-<w:styles xmlns:mc="http://schemas.openxmlformats.org/markup-compatibility/2006" xmlns:r="http://schemas.openxmlformats.org/officeDocument/2006/relationships" xmlns:w="http://schemas.openxmlformats.org/wordprocessingml/2006/main" xmlns:w14="http://schemas.microsoft.com/office/word/2010/wordml" xmlns:w15="http://schemas.microsoft.com/office/word/2012/wordml" xmlns:w16cid="http://schemas.microsoft.com/office/word/2016/wordml/cid" xmlns:w16se="http://schemas.microsoft.com/office/word/2015/wordml/symex" mc:Ignorable="w14 w15 w16se w16cid">
+<w:styles xmlns:mc="http://schemas.openxmlformats.org/markup-compatibility/2006" xmlns:r="http://schemas.openxmlformats.org/officeDocument/2006/relationships" xmlns:w="http://schemas.openxmlformats.org/wordprocessingml/2006/main" xmlns:w14="http://schemas.microsoft.com/office/word/2010/wordml" xmlns:w15="http://schemas.microsoft.com/office/word/2012/wordml" xmlns:w16cex="http://schemas.microsoft.com/office/word/2018/wordml/cex" xmlns:w16cid="http://schemas.microsoft.com/office/word/2016/wordml/cid" xmlns:w16="http://schemas.microsoft.com/office/word/2018/wordml" xmlns:w16du="http://schemas.microsoft.com/office/word/2023/wordml/word16du" xmlns:w16sdtdh="http://schemas.microsoft.com/office/word/2020/wordml/sdtdatahash" xmlns:w16sdtfl="http://schemas.microsoft.com/office/word/2024/wordml/sdtformatlock" xmlns:w16se="http://schemas.microsoft.com/office/word/2015/wordml/symex" mc:Ignorable="w14 w15 w16se w16cid w16 w16cex w16sdtdh w16sdtfl w16du">
   <w:docDefaults>
     <w:rPrDefault>
       <w:rPr>
@@ -5109,7 +4414,7 @@
     </w:rPrDefault>
     <w:pPrDefault/>
   </w:docDefaults>
-  <w:latentStyles w:defLockedState="0" w:defUIPriority="99" w:defSemiHidden="0" w:defUnhideWhenUsed="0" w:defQFormat="0" w:count="375">
+  <w:latentStyles w:defLockedState="0" w:defUIPriority="99" w:defSemiHidden="0" w:defUnhideWhenUsed="0" w:defQFormat="0" w:count="376">
     <w:lsdException w:name="Normal" w:uiPriority="0" w:qFormat="1"/>
     <w:lsdException w:name="heading 1" w:uiPriority="9" w:qFormat="1"/>
     <w:lsdException w:name="heading 2" w:semiHidden="1" w:uiPriority="9" w:unhideWhenUsed="1" w:qFormat="1"/>
@@ -5485,6 +4790,7 @@
     <w:lsdException w:name="Smart Hyperlink" w:semiHidden="1" w:unhideWhenUsed="1"/>
     <w:lsdException w:name="Hashtag" w:semiHidden="1" w:unhideWhenUsed="1"/>
     <w:lsdException w:name="Unresolved Mention" w:semiHidden="1" w:unhideWhenUsed="1"/>
+    <w:lsdException w:name="Smart Link" w:semiHidden="1" w:unhideWhenUsed="1"/>
   </w:latentStyles>
   <w:style w:type="paragraph" w:default="1" w:styleId="Normal">
     <w:name w:val="Normal"/>
@@ -5514,6 +4820,7 @@
     <w:name w:val="heading 2"/>
     <w:basedOn w:val="Normal"/>
     <w:next w:val="Normal"/>
+    <w:link w:val="Heading2Char"/>
     <w:uiPriority w:val="9"/>
     <w:unhideWhenUsed/>
     <w:qFormat/>
@@ -5616,6 +4923,144 @@
       <w:b/>
       <w:bCs/>
     </w:rPr>
+  </w:style>
+  <w:style w:type="paragraph" w:customStyle="1" w:styleId="Style1">
+    <w:name w:val="Style1"/>
+    <w:basedOn w:val="Heading2"/>
+    <w:link w:val="Style1Char"/>
+    <w:qFormat/>
+    <w:rsid w:val="00A432DA"/>
+    <w:rPr>
+      <w:rFonts w:eastAsia="Times New Roman"/>
+      <w:color w:val="000000" w:themeColor="text1"/>
+      <w:sz w:val="24"/>
+      <w:szCs w:val="24"/>
+      <w:lang w:eastAsia="en-ZA"/>
+    </w:rPr>
+  </w:style>
+  <w:style w:type="character" w:customStyle="1" w:styleId="Heading2Char">
+    <w:name w:val="Heading 2 Char"/>
+    <w:basedOn w:val="DefaultParagraphFont"/>
+    <w:link w:val="Heading2"/>
+    <w:uiPriority w:val="9"/>
+    <w:rsid w:val="00A432DA"/>
+    <w:rPr>
+      <w:rFonts w:asciiTheme="majorHAnsi" w:eastAsiaTheme="majorEastAsia" w:hAnsiTheme="majorHAnsi" w:cstheme="majorBidi"/>
+      <w:color w:val="2F5496" w:themeColor="accent1" w:themeShade="BF"/>
+      <w:sz w:val="32"/>
+      <w:szCs w:val="32"/>
+    </w:rPr>
+  </w:style>
+  <w:style w:type="character" w:customStyle="1" w:styleId="Style1Char">
+    <w:name w:val="Style1 Char"/>
+    <w:basedOn w:val="Heading2Char"/>
+    <w:link w:val="Style1"/>
+    <w:rsid w:val="00A432DA"/>
+    <w:rPr>
+      <w:rFonts w:asciiTheme="majorHAnsi" w:eastAsia="Times New Roman" w:hAnsiTheme="majorHAnsi" w:cstheme="majorBidi"/>
+      <w:color w:val="000000" w:themeColor="text1"/>
+      <w:sz w:val="32"/>
+      <w:szCs w:val="32"/>
+      <w:lang w:eastAsia="en-ZA"/>
+    </w:rPr>
+  </w:style>
+  <w:style w:type="paragraph" w:styleId="TOCHeading">
+    <w:name w:val="TOC Heading"/>
+    <w:basedOn w:val="Heading1"/>
+    <w:next w:val="Normal"/>
+    <w:uiPriority w:val="39"/>
+    <w:unhideWhenUsed/>
+    <w:qFormat/>
+    <w:rsid w:val="00A432DA"/>
+    <w:pPr>
+      <w:spacing w:before="240" w:after="0" w:line="259" w:lineRule="auto"/>
+      <w:outlineLvl w:val="9"/>
+    </w:pPr>
+    <w:rPr>
+      <w:sz w:val="32"/>
+      <w:szCs w:val="32"/>
+      <w:lang w:val="en-US"/>
+    </w:rPr>
+  </w:style>
+  <w:style w:type="paragraph" w:styleId="TOC2">
+    <w:name w:val="toc 2"/>
+    <w:basedOn w:val="Normal"/>
+    <w:next w:val="Normal"/>
+    <w:autoRedefine/>
+    <w:uiPriority w:val="39"/>
+    <w:unhideWhenUsed/>
+    <w:rsid w:val="00A432DA"/>
+    <w:pPr>
+      <w:spacing w:after="100" w:line="259" w:lineRule="auto"/>
+      <w:ind w:left="220"/>
+    </w:pPr>
+    <w:rPr>
+      <w:rFonts w:eastAsiaTheme="minorEastAsia" w:cs="Times New Roman"/>
+      <w:sz w:val="22"/>
+      <w:szCs w:val="22"/>
+      <w:lang w:val="en-US"/>
+    </w:rPr>
+  </w:style>
+  <w:style w:type="paragraph" w:styleId="TOC3">
+    <w:name w:val="toc 3"/>
+    <w:basedOn w:val="Normal"/>
+    <w:next w:val="Normal"/>
+    <w:autoRedefine/>
+    <w:uiPriority w:val="39"/>
+    <w:unhideWhenUsed/>
+    <w:rsid w:val="00A432DA"/>
+    <w:pPr>
+      <w:spacing w:after="100" w:line="259" w:lineRule="auto"/>
+      <w:ind w:left="440"/>
+    </w:pPr>
+    <w:rPr>
+      <w:rFonts w:eastAsiaTheme="minorEastAsia" w:cs="Times New Roman"/>
+      <w:sz w:val="22"/>
+      <w:szCs w:val="22"/>
+      <w:lang w:val="en-US"/>
+    </w:rPr>
+  </w:style>
+  <w:style w:type="paragraph" w:styleId="Header">
+    <w:name w:val="header"/>
+    <w:basedOn w:val="Normal"/>
+    <w:link w:val="HeaderChar"/>
+    <w:uiPriority w:val="99"/>
+    <w:unhideWhenUsed/>
+    <w:rsid w:val="006958B3"/>
+    <w:pPr>
+      <w:tabs>
+        <w:tab w:val="center" w:pos="4513"/>
+        <w:tab w:val="right" w:pos="9026"/>
+      </w:tabs>
+    </w:pPr>
+  </w:style>
+  <w:style w:type="character" w:customStyle="1" w:styleId="HeaderChar">
+    <w:name w:val="Header Char"/>
+    <w:basedOn w:val="DefaultParagraphFont"/>
+    <w:link w:val="Header"/>
+    <w:uiPriority w:val="99"/>
+    <w:rsid w:val="006958B3"/>
+  </w:style>
+  <w:style w:type="paragraph" w:styleId="Footer">
+    <w:name w:val="footer"/>
+    <w:basedOn w:val="Normal"/>
+    <w:link w:val="FooterChar"/>
+    <w:uiPriority w:val="99"/>
+    <w:unhideWhenUsed/>
+    <w:rsid w:val="006958B3"/>
+    <w:pPr>
+      <w:tabs>
+        <w:tab w:val="center" w:pos="4513"/>
+        <w:tab w:val="right" w:pos="9026"/>
+      </w:tabs>
+    </w:pPr>
+  </w:style>
+  <w:style w:type="character" w:customStyle="1" w:styleId="FooterChar">
+    <w:name w:val="Footer Char"/>
+    <w:basedOn w:val="DefaultParagraphFont"/>
+    <w:link w:val="Footer"/>
+    <w:uiPriority w:val="99"/>
+    <w:rsid w:val="006958B3"/>
   </w:style>
 </w:styles>
 </file>
@@ -5933,4 +5378,16 @@
   <we:bindings/>
   <we:snapshot xmlns:r="http://schemas.openxmlformats.org/officeDocument/2006/relationships"/>
 </we:webextension>
+</file>
+
+<file path=customXml/item1.xml><?xml version="1.0" encoding="utf-8"?>
+<b:Sources xmlns:b="http://schemas.openxmlformats.org/officeDocument/2006/bibliography" xmlns="http://schemas.openxmlformats.org/officeDocument/2006/bibliography" SelectedStyle="\APASixthEditionOfficeOnline.xsl" StyleName="APA" Version="6"/>
+</file>
+
+<file path=customXml/itemProps1.xml><?xml version="1.0" encoding="utf-8"?>
+<ds:datastoreItem xmlns:ds="http://schemas.openxmlformats.org/officeDocument/2006/customXml" ds:itemID="{F7D63551-3CBD-4DEE-9151-94C455BBC396}">
+  <ds:schemaRefs>
+    <ds:schemaRef ds:uri="http://schemas.openxmlformats.org/officeDocument/2006/bibliography"/>
+  </ds:schemaRefs>
+</ds:datastoreItem>
 </file>
</xml_diff>